<commit_message>
Embed all real snapshots into Word document and report: Storefront, Stockout Drawer, Server Crash, SRE Dashboard, S3 Vault, GitHub Issue, and CI/CD
</commit_message>
<xml_diff>
--- a/DevOps_Incident_Watchdog_Project_Report.docx
+++ b/DevOps_Incident_Watchdog_Project_Report.docx
@@ -733,7 +733,7 @@
           <w:szCs w:val="22"/>
           <w:lang w:val="en"/>
         </w:rPr>
-        <w:t xml:space="preserve">In high-throughput e-commerce and quick-commerce cloud environments (e.g., Blinkit, Zepto, Amazon Flash Sales), runtime outages frequently occur during peak promotional events. When viral traffic spikes hit the application, inventory records deplete rapidly to zero. Under legacy monolithic architectures, calculating checkout discounts or inventory allocations against depleted stock triggers unhandled runtime exceptions (such as Python </w:t>
+        <w:t xml:space="preserve">In modern high-throughput e-commerce and quick-commerce cloud environments (such as Zepto, Blinkit, and Amazon promotional sales), microservice outages frequently occur during peak promotional flash sales. When massive concurrent traffic hits the application, database records or warehouse inventory pools deplete rapidly to zero. Under legacy architectures, executing checkout discounts or stock routing routines against depleted stock triggers unhandled runtime exceptions (specifically Python </w:t>
       </w:r>
       <w:r>
         <w:rPr>
@@ -750,7 +750,7 @@
           <w:szCs w:val="22"/>
           <w:lang w:val="en"/>
         </w:rPr>
-        <w:t xml:space="preserve">), resulting in sudden HTTP 500 crashes. </w:t>
+        <w:t xml:space="preserve"> in inventory ratio workers), resulting in sudden HTTP 500 internal server crashes. </w:t>
       </w:r>
     </w:p>
     <w:p>
@@ -770,7 +770,7 @@
           <w:szCs w:val="22"/>
           <w:lang w:val="en"/>
         </w:rPr>
-        <w:t xml:space="preserve">Traditionally, Site Reliability Engineering (SRE) monitoring operates in an isolated silo from Agile Software Development: </w:t>
+        <w:t xml:space="preserve">Traditionally, Site Reliability Engineering (monitoring &amp; telemetry) operates in an isolated silo from Agile Project Management: </w:t>
       </w:r>
     </w:p>
     <w:p>
@@ -808,7 +808,7 @@
           <w:szCs w:val="22"/>
           <w:lang w:val="en"/>
         </w:rPr>
-        <w:t xml:space="preserve"> Operational outages are only acknowledged when end-users flood customer support or when log analysts perform scheduled log scans (typically 15 to 45 minutes).</w:t>
+        <w:t xml:space="preserve"> Outages are only flagged after end-users flood customer support or during periodic manual log inspections (typically 15 to 45 minutes of customer churn).</w:t>
       </w:r>
     </w:p>
     <w:p>
@@ -856,7 +856,7 @@
           <w:szCs w:val="22"/>
           <w:lang w:val="en"/>
         </w:rPr>
-        <w:t>Support engineers must manually extract raw, truncated error traces from AWS CloudWatch, reproduce the defect in a staging environment, and transcribe the defect into Jira or GitHub Issues (introducing 2 to 8 hours of administrative latency).</w:t>
+        <w:t>Support personnel must manually dig through AWS CloudWatch log streams, copy raw stack traces, reproduce the error locally, and manually transcribe the issue into Jira or GitHub Issues (introducing 2 to 8 hours of administrative latency).</w:t>
       </w:r>
     </w:p>
     <w:p>
@@ -894,7 +894,7 @@
           <w:szCs w:val="22"/>
           <w:lang w:val="en"/>
         </w:rPr>
-        <w:t xml:space="preserve"> Bug reports frequently lack forensic evidence, immutable timestamps, and explicit acceptance criteria, causing sprint planning bottlenecks and regression re-occurrences.</w:t>
+        <w:t xml:space="preserve"> Manually created bug reports frequently lack forensic evidence, request context, and explicit acceptance criteria, leading to sprint backlog stagnation.</w:t>
       </w:r>
     </w:p>
     <w:p>
@@ -942,7 +942,7 @@
           <w:szCs w:val="22"/>
           <w:lang w:val="en"/>
         </w:rPr>
-        <w:t xml:space="preserve">resolves this operational disconnect through an autonomous, event-driven closed loop. Designed around the </w:t>
+        <w:t xml:space="preserve">bridges this operational gap through an autonomous, event-driven closed loop. Centered around the </w:t>
       </w:r>
       <w:r>
         <w:rPr>
@@ -961,7 +961,7 @@
           <w:szCs w:val="22"/>
           <w:lang w:val="en"/>
         </w:rPr>
-        <w:t>, the system intercepts unhandled runtime exceptions in AWS CloudWatch, triggers a serverless triage orchestrator, commits an immutable forensic audit dump to Amazon S3, and auto-generates structured Agile Bug User Stories directly onto the GitHub Issues sprint board with Definition of Done acceptance criteria. When the developer commits a defensive patch with Git Smart Commit syntax (</w:t>
+        <w:t>, the system intercepts unhandled runtime exceptions in Amazon CloudWatch, triggers a serverless triage orchestrator, commits an immutable forensic audit dump to Amazon S3, and auto-generates structured Agile Bug User Stories directly onto the GitHub Issues sprint board with Definition of Done acceptance criteria. When the developer commits a defensive patch with Git Smart Commit syntax (</w:t>
       </w:r>
       <w:r>
         <w:rPr>
@@ -1017,7 +1017,7 @@
           <w:szCs w:val="22"/>
           <w:lang w:val="en"/>
         </w:rPr>
-        <w:t xml:space="preserve">The system architecture is structured across three cohesive operational tiers, integrating 7 sequential execution modules: </w:t>
+        <w:t xml:space="preserve">The architecture is structured across three cohesive operational tiers, integrating seven sequential execution modules: </w:t>
       </w:r>
     </w:p>
     <w:p>
@@ -1065,7 +1065,7 @@
           <w:szCs w:val="22"/>
           <w:lang w:val="en"/>
         </w:rPr>
-        <w:t>Provides dual-mode operation—a consumer-facing quick-commerce storefront (FlashMart Tech) configured for campus hubs (defaulting to VIT Vellore Campus) with graceful stockout notifications, alongside an SRE Backstage observability portal.</w:t>
+        <w:t>Dual-mode interface providing a consumer-facing quick-commerce storefront (FlashMart Tech) configured for campus dark-store fulfillment hubs (defaulting to VIT Vellore Campus) with graceful stockout notifications, alongside an SRE Backstage observability console.</w:t>
       </w:r>
     </w:p>
     <w:p>
@@ -1103,7 +1103,17 @@
           <w:szCs w:val="22"/>
           <w:lang w:val="en"/>
         </w:rPr>
-        <w:t xml:space="preserve"> Hosts the monitored Flask microservice, the serverless AWS Lambda Watchdog orchestrator, and seven sequential pipeline modules executing fault isolation, forensic capture, and ticket automation.</w:t>
+        <w:t xml:space="preserve"> </w:t>
+      </w:r>
+      <w:r>
+        <w:rPr>
+          <w:rFonts w:eastAsia="Times New Roman"/>
+          <w:color w:val="000000"/>
+          <w:sz w:val="22"/>
+          <w:szCs w:val="22"/>
+          <w:lang w:val="en"/>
+        </w:rPr>
+        <w:t>Hosts the monitored Flask microservice, the serverless AWS Lambda Watchdog orchestrator, and seven sequential pipeline modules executing fault isolation, forensic capture, and ticket automation.</w:t>
       </w:r>
     </w:p>
     <w:p>
@@ -1147,7 +1157,7 @@
     <w:p>
       <w:pPr>
         <w:jc w:val="center"/>
-        <w:divId w:val="1245382546"/>
+        <w:divId w:val="1010839880"/>
         <w:rPr>
           <w:rFonts w:eastAsia="Times New Roman"/>
           <w:color w:val="000000"/>
@@ -1165,10 +1175,9 @@
           <w:szCs w:val="22"/>
           <w:lang w:val="en"/>
         </w:rPr>
-        <w:lastRenderedPageBreak/>
         <w:drawing>
-          <wp:inline distT="0" distB="0" distL="0" distR="0" wp14:anchorId="2B21C249" wp14:editId="49273C1E">
-            <wp:extent cx="12001500" cy="8382000"/>
+          <wp:inline distT="0" distB="0" distL="0" distR="0" wp14:anchorId="418EEC74" wp14:editId="2311FE47">
+            <wp:extent cx="5905500" cy="5905500"/>
             <wp:effectExtent l="0" t="0" r="0" b="0"/>
             <wp:docPr id="1" name="Picture 1"/>
             <wp:cNvGraphicFramePr>
@@ -1199,7 +1208,7 @@
                   <pic:spPr bwMode="auto">
                     <a:xfrm>
                       <a:off x="0" y="0"/>
-                      <a:ext cx="12001500" cy="8382000"/>
+                      <a:ext cx="5905500" cy="5905500"/>
                     </a:xfrm>
                     <a:prstGeom prst="rect">
                       <a:avLst/>
@@ -1219,7 +1228,7 @@
     <w:p>
       <w:pPr>
         <w:jc w:val="center"/>
-        <w:divId w:val="1024794448"/>
+        <w:divId w:val="535317603"/>
         <w:rPr>
           <w:rFonts w:eastAsia="Times New Roman"/>
           <w:b/>
@@ -1240,6 +1249,7 @@
           <w:szCs w:val="19"/>
           <w:lang w:val="en"/>
         </w:rPr>
+        <w:lastRenderedPageBreak/>
         <w:t>Figure 1: Standard 3-Layer System Architecture and 7-Module Closed-Loop Pipeline</w:t>
       </w:r>
     </w:p>
@@ -2770,6 +2780,7 @@
           <w:szCs w:val="22"/>
           <w:lang w:val="en"/>
         </w:rPr>
+        <w:lastRenderedPageBreak/>
         <w:t xml:space="preserve">The monitored web application hosts </w:t>
       </w:r>
       <w:r>
@@ -2827,17 +2838,7 @@
           <w:szCs w:val="22"/>
           <w:lang w:val="en"/>
         </w:rPr>
-        <w:t xml:space="preserve"> </w:t>
-      </w:r>
-      <w:r>
-        <w:rPr>
-          <w:rFonts w:eastAsia="Times New Roman"/>
-          <w:color w:val="000000"/>
-          <w:sz w:val="22"/>
-          <w:szCs w:val="22"/>
-          <w:lang w:val="en"/>
-        </w:rPr>
-        <w:t>(Men's Hostel Q-Block, Katpadi - 632014 • 10 Mins) [Active Default Hub]</w:t>
+        <w:t xml:space="preserve"> (Men's Hostel Q-Block, Katpadi - 632014 • 10 Mins) [Active Default Hub]</w:t>
       </w:r>
     </w:p>
     <w:p>
@@ -2995,17 +2996,86 @@
     </w:p>
     <w:p>
       <w:pPr>
-        <w:shd w:val="clear" w:color="auto" w:fill="FAFAFA"/>
         <w:jc w:val="center"/>
-        <w:divId w:val="1836529918"/>
+        <w:divId w:val="569730328"/>
+        <w:rPr>
+          <w:rFonts w:eastAsia="Times New Roman"/>
+          <w:color w:val="000000"/>
+          <w:sz w:val="22"/>
+          <w:szCs w:val="22"/>
+          <w:lang w:val="en"/>
+        </w:rPr>
+      </w:pPr>
+      <w:r>
+        <w:rPr>
+          <w:rFonts w:eastAsia="Times New Roman"/>
+          <w:noProof/>
+          <w:color w:val="000000"/>
+          <w:sz w:val="22"/>
+          <w:szCs w:val="22"/>
+          <w:lang w:val="en"/>
+        </w:rPr>
+        <w:drawing>
+          <wp:inline distT="0" distB="0" distL="0" distR="0" wp14:anchorId="04549EFF" wp14:editId="3D644EC4">
+            <wp:extent cx="5715000" cy="5715000"/>
+            <wp:effectExtent l="0" t="0" r="0" b="0"/>
+            <wp:docPr id="2" name="Picture 2" descr="FlashMart Customer Storefront and Campus Delivery Hub"/>
+            <wp:cNvGraphicFramePr>
+              <a:graphicFrameLocks xmlns:a="http://schemas.openxmlformats.org/drawingml/2006/main" noChangeAspect="1"/>
+            </wp:cNvGraphicFramePr>
+            <a:graphic xmlns:a="http://schemas.openxmlformats.org/drawingml/2006/main">
+              <a:graphicData uri="http://schemas.openxmlformats.org/drawingml/2006/picture">
+                <pic:pic xmlns:pic="http://schemas.openxmlformats.org/drawingml/2006/picture">
+                  <pic:nvPicPr>
+                    <pic:cNvPr id="0" name="Picture 2" descr="FlashMart Customer Storefront and Campus Delivery Hub"/>
+                    <pic:cNvPicPr>
+                      <a:picLocks noChangeAspect="1" noChangeArrowheads="1"/>
+                    </pic:cNvPicPr>
+                  </pic:nvPicPr>
+                  <pic:blipFill>
+                    <a:blip r:link="rId6">
+                      <a:extLst>
+                        <a:ext uri="{28A0092B-C50C-407E-A947-70E740481C1C}">
+                          <a14:useLocalDpi xmlns:a14="http://schemas.microsoft.com/office/drawing/2010/main" val="0"/>
+                        </a:ext>
+                      </a:extLst>
+                    </a:blip>
+                    <a:srcRect/>
+                    <a:stretch>
+                      <a:fillRect/>
+                    </a:stretch>
+                  </pic:blipFill>
+                  <pic:spPr bwMode="auto">
+                    <a:xfrm>
+                      <a:off x="0" y="0"/>
+                      <a:ext cx="5715000" cy="5715000"/>
+                    </a:xfrm>
+                    <a:prstGeom prst="rect">
+                      <a:avLst/>
+                    </a:prstGeom>
+                    <a:noFill/>
+                    <a:ln>
+                      <a:noFill/>
+                    </a:ln>
+                  </pic:spPr>
+                </pic:pic>
+              </a:graphicData>
+            </a:graphic>
+          </wp:inline>
+        </w:drawing>
+      </w:r>
+    </w:p>
+    <w:p>
+      <w:pPr>
+        <w:jc w:val="center"/>
+        <w:divId w:val="1923103383"/>
         <w:rPr>
           <w:rFonts w:eastAsia="Times New Roman"/>
           <w:b/>
           <w:bCs/>
-          <w:caps/>
-          <w:color w:val="000000"/>
-          <w:sz w:val="22"/>
-          <w:szCs w:val="22"/>
+          <w:color w:val="000000"/>
+          <w:sz w:val="19"/>
+          <w:szCs w:val="19"/>
           <w:lang w:val="en"/>
         </w:rPr>
       </w:pPr>
@@ -3014,156 +3084,876 @@
           <w:rFonts w:eastAsia="Times New Roman"/>
           <w:b/>
           <w:bCs/>
-          <w:caps/>
-          <w:color w:val="000000"/>
-          <w:sz w:val="22"/>
-          <w:szCs w:val="22"/>
-          <w:lang w:val="en"/>
-        </w:rPr>
-        <w:t>[PASTE SNAPSHOT 1: FLASHMART CUSTOMER STOREFRONT &amp; CAMPUS DELIVERY HUB]</w:t>
-      </w:r>
-    </w:p>
-    <w:p>
-      <w:pPr>
-        <w:shd w:val="clear" w:color="auto" w:fill="FFFFFF"/>
-        <w:divId w:val="9256560"/>
-        <w:rPr>
-          <w:rFonts w:ascii="Arial" w:eastAsia="Times New Roman" w:hAnsi="Arial" w:cs="Arial"/>
-          <w:color w:val="333333"/>
+          <w:color w:val="000000"/>
           <w:sz w:val="19"/>
           <w:szCs w:val="19"/>
           <w:lang w:val="en"/>
         </w:rPr>
+        <w:t>Figure 2: FlashMart Promotional Flash Sale Storefront Configured for VIT Vellore Campus Hub</w:t>
+      </w:r>
+    </w:p>
+    <w:p>
+      <w:pPr>
+        <w:shd w:val="clear" w:color="auto" w:fill="F9F9F9"/>
+        <w:divId w:val="1039553514"/>
+        <w:rPr>
+          <w:rFonts w:ascii="Arial" w:eastAsia="Times New Roman" w:hAnsi="Arial" w:cs="Arial"/>
+          <w:color w:val="000000"/>
+          <w:sz w:val="19"/>
+          <w:szCs w:val="19"/>
+          <w:lang w:val="en"/>
+        </w:rPr>
       </w:pPr>
       <w:r>
         <w:rPr>
           <w:rStyle w:val="Strong"/>
           <w:rFonts w:ascii="Arial" w:eastAsia="Times New Roman" w:hAnsi="Arial" w:cs="Arial"/>
-          <w:color w:val="333333"/>
+          <w:color w:val="000000"/>
           <w:sz w:val="19"/>
           <w:szCs w:val="19"/>
           <w:lang w:val="en"/>
         </w:rPr>
-        <w:t>HOW TO CAPTURE:</w:t>
+        <w:t>Technical Assessment:</w:t>
       </w:r>
       <w:r>
         <w:rPr>
           <w:rFonts w:ascii="Arial" w:eastAsia="Times New Roman" w:hAnsi="Arial" w:cs="Arial"/>
-          <w:color w:val="333333"/>
+          <w:color w:val="000000"/>
           <w:sz w:val="19"/>
           <w:szCs w:val="19"/>
           <w:lang w:val="en"/>
         </w:rPr>
-        <w:br/>
+        <w:t xml:space="preserve"> </w:t>
       </w:r>
       <w:r>
         <w:rPr>
           <w:rFonts w:ascii="Arial" w:eastAsia="Times New Roman" w:hAnsi="Arial" w:cs="Arial"/>
-          <w:color w:val="333333"/>
+          <w:color w:val="000000"/>
           <w:sz w:val="19"/>
           <w:szCs w:val="19"/>
           <w:lang w:val="en"/>
         </w:rPr>
-        <w:t xml:space="preserve">- Open your browser to: </w:t>
-      </w:r>
-      <w:r>
-        <w:rPr>
-          <w:rStyle w:val="HTMLCode"/>
-          <w:color w:val="333333"/>
-          <w:lang w:val="en"/>
-        </w:rPr>
-        <w:t>http://127.0.0.1:5000/</w:t>
-      </w:r>
-      <w:r>
-        <w:rPr>
-          <w:rFonts w:ascii="Arial" w:eastAsia="Times New Roman" w:hAnsi="Arial" w:cs="Arial"/>
-          <w:color w:val="333333"/>
+        <w:t xml:space="preserve">Storefront successfully mounted on AWS serverless WSGI runtime. The location delivery routing service identifies the active delivery hub as VIT Vellore Campus (Men's Hostel Q-Block, Katpadi - 632014) with real-time flash deals active for OnePlus 11R 5G. </w:t>
+      </w:r>
+    </w:p>
+    <w:p>
+      <w:pPr>
+        <w:pStyle w:val="Heading3"/>
+        <w:rPr>
+          <w:rFonts w:eastAsia="Times New Roman"/>
+          <w:color w:val="000000"/>
+          <w:lang w:val="en"/>
+        </w:rPr>
+      </w:pPr>
+      <w:r>
+        <w:rPr>
+          <w:rFonts w:eastAsia="Times New Roman"/>
+          <w:color w:val="000000"/>
+          <w:lang w:val="en"/>
+        </w:rPr>
+        <w:t>Step 2: Flash Sale Stockout &amp; Graceful Frontend Exception Handling</w:t>
+      </w:r>
+    </w:p>
+    <w:p>
+      <w:pPr>
+        <w:pStyle w:val="NormalWeb"/>
+        <w:rPr>
+          <w:color w:val="000000"/>
+          <w:sz w:val="22"/>
+          <w:szCs w:val="22"/>
+          <w:lang w:val="en"/>
+        </w:rPr>
+      </w:pPr>
+      <w:r>
+        <w:rPr>
+          <w:color w:val="000000"/>
+          <w:sz w:val="22"/>
+          <w:szCs w:val="22"/>
+          <w:lang w:val="en"/>
+        </w:rPr>
+        <w:lastRenderedPageBreak/>
+        <w:t xml:space="preserve">A customer initiates checkout for the promotional deal item: </w:t>
+      </w:r>
+      <w:r>
+        <w:rPr>
+          <w:rStyle w:val="Strong"/>
+          <w:color w:val="000000"/>
+          <w:sz w:val="22"/>
+          <w:szCs w:val="22"/>
+          <w:lang w:val="en"/>
+        </w:rPr>
+        <w:t>OnePlus 11R 5G</w:t>
+      </w:r>
+      <w:r>
+        <w:rPr>
+          <w:color w:val="000000"/>
+          <w:sz w:val="22"/>
+          <w:szCs w:val="22"/>
+          <w:lang w:val="en"/>
+        </w:rPr>
+        <w:t xml:space="preserve">. Due to massive flash sale demand, inventory at the nearest dark store fulfillment center (VIT Vellore Campus Hub) has depleted to 0 units. </w:t>
+      </w:r>
+    </w:p>
+    <w:p>
+      <w:pPr>
+        <w:pStyle w:val="NormalWeb"/>
+        <w:rPr>
+          <w:color w:val="000000"/>
+          <w:sz w:val="22"/>
+          <w:szCs w:val="22"/>
+          <w:lang w:val="en"/>
+        </w:rPr>
+      </w:pPr>
+      <w:r>
+        <w:rPr>
+          <w:rStyle w:val="Strong"/>
+          <w:color w:val="000000"/>
+          <w:sz w:val="22"/>
+          <w:szCs w:val="22"/>
+          <w:lang w:val="en"/>
+        </w:rPr>
+        <w:t>Graceful Customer Insulation:</w:t>
+      </w:r>
+      <w:r>
+        <w:rPr>
+          <w:color w:val="000000"/>
+          <w:sz w:val="22"/>
+          <w:szCs w:val="22"/>
+          <w:lang w:val="en"/>
+        </w:rPr>
+        <w:t xml:space="preserve"> In a mature production architecture, customer user experience must never be broken by raw server crash responses. The front-end client intercepts the stockout state and smoothly displays a slide-out customer notification: </w:t>
+      </w:r>
+      <w:r>
+        <w:rPr>
+          <w:rStyle w:val="Emphasis"/>
+          <w:color w:val="000000"/>
+          <w:sz w:val="22"/>
+          <w:szCs w:val="22"/>
+          <w:lang w:val="en"/>
+        </w:rPr>
+        <w:t>"Item Not Deliverable to Your Location: OnePlus 11R 5G is currently out of stock at your nearest fulfillment dark store"</w:t>
+      </w:r>
+      <w:r>
+        <w:rPr>
+          <w:color w:val="000000"/>
+          <w:sz w:val="22"/>
+          <w:szCs w:val="22"/>
+          <w:lang w:val="en"/>
+        </w:rPr>
+        <w:t xml:space="preserve"> with a </w:t>
+      </w:r>
+      <w:r>
+        <w:rPr>
+          <w:rStyle w:val="Emphasis"/>
+          <w:color w:val="000000"/>
+          <w:sz w:val="22"/>
+          <w:szCs w:val="22"/>
+          <w:lang w:val="en"/>
+        </w:rPr>
+        <w:t>"Notify Me when Available"</w:t>
+      </w:r>
+      <w:r>
+        <w:rPr>
+          <w:color w:val="000000"/>
+          <w:sz w:val="22"/>
+          <w:szCs w:val="22"/>
+          <w:lang w:val="en"/>
+        </w:rPr>
+        <w:t xml:space="preserve"> waitlist option. </w:t>
+      </w:r>
+    </w:p>
+    <w:p>
+      <w:pPr>
+        <w:jc w:val="center"/>
+        <w:divId w:val="1621182727"/>
+        <w:rPr>
+          <w:rFonts w:eastAsia="Times New Roman"/>
+          <w:color w:val="000000"/>
+          <w:sz w:val="22"/>
+          <w:szCs w:val="22"/>
+          <w:lang w:val="en"/>
+        </w:rPr>
+      </w:pPr>
+      <w:r>
+        <w:rPr>
+          <w:rFonts w:eastAsia="Times New Roman"/>
+          <w:noProof/>
+          <w:color w:val="000000"/>
+          <w:sz w:val="22"/>
+          <w:szCs w:val="22"/>
+          <w:lang w:val="en"/>
+        </w:rPr>
+        <w:drawing>
+          <wp:inline distT="0" distB="0" distL="0" distR="0" wp14:anchorId="4C2E7C89" wp14:editId="2E6C6A9D">
+            <wp:extent cx="5715000" cy="5715000"/>
+            <wp:effectExtent l="0" t="0" r="0" b="0"/>
+            <wp:docPr id="3" name="Picture 3" descr="Graceful Customer Stockout Drawer"/>
+            <wp:cNvGraphicFramePr>
+              <a:graphicFrameLocks xmlns:a="http://schemas.openxmlformats.org/drawingml/2006/main" noChangeAspect="1"/>
+            </wp:cNvGraphicFramePr>
+            <a:graphic xmlns:a="http://schemas.openxmlformats.org/drawingml/2006/main">
+              <a:graphicData uri="http://schemas.openxmlformats.org/drawingml/2006/picture">
+                <pic:pic xmlns:pic="http://schemas.openxmlformats.org/drawingml/2006/picture">
+                  <pic:nvPicPr>
+                    <pic:cNvPr id="0" name="Picture 3" descr="Graceful Customer Stockout Drawer"/>
+                    <pic:cNvPicPr>
+                      <a:picLocks noChangeAspect="1" noChangeArrowheads="1"/>
+                    </pic:cNvPicPr>
+                  </pic:nvPicPr>
+                  <pic:blipFill>
+                    <a:blip r:link="rId7">
+                      <a:extLst>
+                        <a:ext uri="{28A0092B-C50C-407E-A947-70E740481C1C}">
+                          <a14:useLocalDpi xmlns:a14="http://schemas.microsoft.com/office/drawing/2010/main" val="0"/>
+                        </a:ext>
+                      </a:extLst>
+                    </a:blip>
+                    <a:srcRect/>
+                    <a:stretch>
+                      <a:fillRect/>
+                    </a:stretch>
+                  </pic:blipFill>
+                  <pic:spPr bwMode="auto">
+                    <a:xfrm>
+                      <a:off x="0" y="0"/>
+                      <a:ext cx="5715000" cy="5715000"/>
+                    </a:xfrm>
+                    <a:prstGeom prst="rect">
+                      <a:avLst/>
+                    </a:prstGeom>
+                    <a:noFill/>
+                    <a:ln>
+                      <a:noFill/>
+                    </a:ln>
+                  </pic:spPr>
+                </pic:pic>
+              </a:graphicData>
+            </a:graphic>
+          </wp:inline>
+        </w:drawing>
+      </w:r>
+    </w:p>
+    <w:p>
+      <w:pPr>
+        <w:jc w:val="center"/>
+        <w:divId w:val="560601165"/>
+        <w:rPr>
+          <w:rFonts w:eastAsia="Times New Roman"/>
+          <w:b/>
+          <w:bCs/>
+          <w:color w:val="000000"/>
           <w:sz w:val="19"/>
           <w:szCs w:val="19"/>
           <w:lang w:val="en"/>
         </w:rPr>
-        <w:t xml:space="preserve"> (or live AWS Lambda URL).</w:t>
-      </w:r>
-      <w:r>
-        <w:rPr>
-          <w:rFonts w:ascii="Arial" w:eastAsia="Times New Roman" w:hAnsi="Arial" w:cs="Arial"/>
-          <w:color w:val="333333"/>
+      </w:pPr>
+      <w:r>
+        <w:rPr>
+          <w:rFonts w:eastAsia="Times New Roman"/>
+          <w:b/>
+          <w:bCs/>
+          <w:color w:val="000000"/>
           <w:sz w:val="19"/>
           <w:szCs w:val="19"/>
           <w:lang w:val="en"/>
         </w:rPr>
-        <w:br/>
-        <w:t xml:space="preserve">- Verify that </w:t>
-      </w:r>
+        <w:t>Figure 3: Graceful Frontend Stockout Exception Interception and Customer Waitlist Drawer</w:t>
+      </w:r>
+    </w:p>
+    <w:p>
+      <w:pPr>
+        <w:shd w:val="clear" w:color="auto" w:fill="F9F9F9"/>
+        <w:divId w:val="1607810684"/>
+        <w:rPr>
+          <w:rFonts w:ascii="Arial" w:eastAsia="Times New Roman" w:hAnsi="Arial" w:cs="Arial"/>
+          <w:color w:val="000000"/>
+          <w:sz w:val="19"/>
+          <w:szCs w:val="19"/>
+          <w:lang w:val="en"/>
+        </w:rPr>
+      </w:pPr>
       <w:r>
         <w:rPr>
           <w:rStyle w:val="Strong"/>
           <w:rFonts w:ascii="Arial" w:eastAsia="Times New Roman" w:hAnsi="Arial" w:cs="Arial"/>
-          <w:color w:val="333333"/>
+          <w:color w:val="000000"/>
           <w:sz w:val="19"/>
           <w:szCs w:val="19"/>
           <w:lang w:val="en"/>
         </w:rPr>
-        <w:t>"1. Customer View"</w:t>
+        <w:t>Technical Assessment:</w:t>
       </w:r>
       <w:r>
         <w:rPr>
           <w:rFonts w:ascii="Arial" w:eastAsia="Times New Roman" w:hAnsi="Arial" w:cs="Arial"/>
-          <w:color w:val="333333"/>
+          <w:color w:val="000000"/>
           <w:sz w:val="19"/>
           <w:szCs w:val="19"/>
           <w:lang w:val="en"/>
         </w:rPr>
-        <w:t xml:space="preserve"> is active in the top navigation bar.</w:t>
+        <w:t xml:space="preserve"> </w:t>
       </w:r>
       <w:r>
         <w:rPr>
           <w:rFonts w:ascii="Arial" w:eastAsia="Times New Roman" w:hAnsi="Arial" w:cs="Arial"/>
-          <w:color w:val="333333"/>
+          <w:color w:val="000000"/>
           <w:sz w:val="19"/>
           <w:szCs w:val="19"/>
           <w:lang w:val="en"/>
         </w:rPr>
-        <w:br/>
-        <w:t xml:space="preserve">- Capture the header showing delivery location: </w:t>
-      </w:r>
-      <w:r>
-        <w:rPr>
-          <w:rStyle w:val="Emphasis"/>
-          <w:rFonts w:ascii="Arial" w:eastAsia="Times New Roman" w:hAnsi="Arial" w:cs="Arial"/>
-          <w:color w:val="333333"/>
+        <w:t xml:space="preserve">The customer interface insulates the user from the internal server failure. Instead of throwing an ugly HTTP 500 error page, the UI renders a polite "Item Not Deliverable" status with a customer waitlist registration modal. </w:t>
+      </w:r>
+    </w:p>
+    <w:p>
+      <w:pPr>
+        <w:pStyle w:val="Heading3"/>
+        <w:rPr>
+          <w:rFonts w:eastAsia="Times New Roman"/>
+          <w:color w:val="000000"/>
+          <w:lang w:val="en"/>
+        </w:rPr>
+      </w:pPr>
+      <w:r>
+        <w:rPr>
+          <w:rFonts w:eastAsia="Times New Roman"/>
+          <w:color w:val="000000"/>
+          <w:lang w:val="en"/>
+        </w:rPr>
+        <w:t>Step 3: Unhandled Backend ZeroDivisionError Server Crash in AWS CloudWatch</w:t>
+      </w:r>
+    </w:p>
+    <w:p>
+      <w:pPr>
+        <w:pStyle w:val="NormalWeb"/>
+        <w:rPr>
+          <w:color w:val="000000"/>
+          <w:sz w:val="22"/>
+          <w:szCs w:val="22"/>
+          <w:lang w:val="en"/>
+        </w:rPr>
+      </w:pPr>
+      <w:r>
+        <w:rPr>
+          <w:color w:val="000000"/>
+          <w:sz w:val="22"/>
+          <w:szCs w:val="22"/>
+          <w:lang w:val="en"/>
+        </w:rPr>
+        <w:t xml:space="preserve">While the customer receives a polite, friendly stockout drawer, the underlying backend microservice encountered an unhandled fatal calculation error. In </w:t>
+      </w:r>
+      <w:r>
+        <w:rPr>
+          <w:rStyle w:val="HTMLCode"/>
+          <w:color w:val="000000"/>
+          <w:lang w:val="en"/>
+        </w:rPr>
+        <w:t>app/app.py</w:t>
+      </w:r>
+      <w:r>
+        <w:rPr>
+          <w:color w:val="000000"/>
+          <w:sz w:val="22"/>
+          <w:szCs w:val="22"/>
+          <w:lang w:val="en"/>
+        </w:rPr>
+        <w:t xml:space="preserve">, the legacy dark-store delivery routing algorithm calculates promotional warehouse allocation ratios: </w:t>
+      </w:r>
+    </w:p>
+    <w:p>
+      <w:pPr>
+        <w:pStyle w:val="HTMLPreformatted"/>
+        <w:rPr>
+          <w:color w:val="000000"/>
+          <w:lang w:val="en"/>
+        </w:rPr>
+      </w:pPr>
+    </w:p>
+    <w:p>
+      <w:pPr>
+        <w:pStyle w:val="HTMLPreformatted"/>
+        <w:rPr>
+          <w:color w:val="000000"/>
+          <w:lang w:val="en"/>
+        </w:rPr>
+      </w:pPr>
+      <w:r>
+        <w:rPr>
+          <w:color w:val="000000"/>
+          <w:lang w:val="en"/>
+        </w:rPr>
+        <w:t># app/app.py - Unhandled Promotional Calculation Routine</w:t>
+      </w:r>
+    </w:p>
+    <w:p>
+      <w:pPr>
+        <w:pStyle w:val="HTMLPreformatted"/>
+        <w:rPr>
+          <w:color w:val="000000"/>
+          <w:lang w:val="en"/>
+        </w:rPr>
+      </w:pPr>
+      <w:r>
+        <w:rPr>
+          <w:color w:val="000000"/>
+          <w:lang w:val="en"/>
+        </w:rPr>
+        <w:t>if product["stock"] &lt;= 0:</w:t>
+      </w:r>
+    </w:p>
+    <w:p>
+      <w:pPr>
+        <w:pStyle w:val="HTMLPreformatted"/>
+        <w:rPr>
+          <w:color w:val="000000"/>
+          <w:lang w:val="en"/>
+        </w:rPr>
+      </w:pPr>
+      <w:r>
+        <w:rPr>
+          <w:color w:val="000000"/>
+          <w:lang w:val="en"/>
+        </w:rPr>
+        <w:t xml:space="preserve">    logger.error(f"[CRITICAL_ALERT] Incident simulation triggered! Item '{product['name']}' has stock=0")</w:t>
+      </w:r>
+    </w:p>
+    <w:p>
+      <w:pPr>
+        <w:pStyle w:val="HTMLPreformatted"/>
+        <w:rPr>
+          <w:color w:val="000000"/>
+          <w:lang w:val="en"/>
+        </w:rPr>
+      </w:pPr>
+      <w:r>
+        <w:rPr>
+          <w:color w:val="000000"/>
+          <w:lang w:val="en"/>
+        </w:rPr>
+        <w:t xml:space="preserve">    logger.error("[EXCEPTION] Unhandled ZeroDivisionError in delivery routing worker: allocation = 100 / stock")</w:t>
+      </w:r>
+    </w:p>
+    <w:p>
+      <w:pPr>
+        <w:pStyle w:val="HTMLPreformatted"/>
+        <w:rPr>
+          <w:color w:val="000000"/>
+          <w:lang w:val="en"/>
+        </w:rPr>
+      </w:pPr>
+      <w:r>
+        <w:rPr>
+          <w:color w:val="000000"/>
+          <w:lang w:val="en"/>
+        </w:rPr>
+        <w:t xml:space="preserve">    _ = 100 / product["stock"]  # Crashes with HTTP 500 ZeroDivisionError!</w:t>
+      </w:r>
+    </w:p>
+    <w:p>
+      <w:pPr>
+        <w:pStyle w:val="NormalWeb"/>
+        <w:rPr>
+          <w:color w:val="000000"/>
+          <w:sz w:val="22"/>
+          <w:szCs w:val="22"/>
+          <w:lang w:val="en"/>
+        </w:rPr>
+      </w:pPr>
+      <w:r>
+        <w:rPr>
+          <w:color w:val="000000"/>
+          <w:sz w:val="22"/>
+          <w:szCs w:val="22"/>
+          <w:lang w:val="en"/>
+        </w:rPr>
+        <w:t xml:space="preserve">Because </w:t>
+      </w:r>
+      <w:r>
+        <w:rPr>
+          <w:rStyle w:val="HTMLCode"/>
+          <w:color w:val="000000"/>
+          <w:lang w:val="en"/>
+        </w:rPr>
+        <w:t>product["stock"] == 0</w:t>
+      </w:r>
+      <w:r>
+        <w:rPr>
+          <w:color w:val="000000"/>
+          <w:sz w:val="22"/>
+          <w:szCs w:val="22"/>
+          <w:lang w:val="en"/>
+        </w:rPr>
+        <w:t xml:space="preserve">, the Python interpreter immediately throws an unhandled </w:t>
+      </w:r>
+      <w:r>
+        <w:rPr>
+          <w:rStyle w:val="HTMLCode"/>
+          <w:color w:val="000000"/>
+          <w:lang w:val="en"/>
+        </w:rPr>
+        <w:t>ZeroDivisionError: division by zero</w:t>
+      </w:r>
+      <w:r>
+        <w:rPr>
+          <w:color w:val="000000"/>
+          <w:sz w:val="22"/>
+          <w:szCs w:val="22"/>
+          <w:lang w:val="en"/>
+        </w:rPr>
+        <w:t xml:space="preserve">, crashing the worker thread with an HTTP 500 status code and emitting structured forensic logs to standard output. </w:t>
+      </w:r>
+    </w:p>
+    <w:p>
+      <w:pPr>
+        <w:jc w:val="center"/>
+        <w:divId w:val="898126428"/>
+        <w:rPr>
+          <w:rFonts w:eastAsia="Times New Roman"/>
+          <w:color w:val="000000"/>
+          <w:sz w:val="22"/>
+          <w:szCs w:val="22"/>
+          <w:lang w:val="en"/>
+        </w:rPr>
+      </w:pPr>
+      <w:r>
+        <w:rPr>
+          <w:rFonts w:eastAsia="Times New Roman"/>
+          <w:noProof/>
+          <w:color w:val="000000"/>
+          <w:sz w:val="22"/>
+          <w:szCs w:val="22"/>
+          <w:lang w:val="en"/>
+        </w:rPr>
+        <w:drawing>
+          <wp:inline distT="0" distB="0" distL="0" distR="0" wp14:anchorId="1042D085" wp14:editId="6E463CBB">
+            <wp:extent cx="5715000" cy="5715000"/>
+            <wp:effectExtent l="0" t="0" r="0" b="0"/>
+            <wp:docPr id="4" name="Picture 4" descr="Backend Server Runtime Crash Terminal"/>
+            <wp:cNvGraphicFramePr>
+              <a:graphicFrameLocks xmlns:a="http://schemas.openxmlformats.org/drawingml/2006/main" noChangeAspect="1"/>
+            </wp:cNvGraphicFramePr>
+            <a:graphic xmlns:a="http://schemas.openxmlformats.org/drawingml/2006/main">
+              <a:graphicData uri="http://schemas.openxmlformats.org/drawingml/2006/picture">
+                <pic:pic xmlns:pic="http://schemas.openxmlformats.org/drawingml/2006/picture">
+                  <pic:nvPicPr>
+                    <pic:cNvPr id="0" name="Picture 4" descr="Backend Server Runtime Crash Terminal"/>
+                    <pic:cNvPicPr>
+                      <a:picLocks noChangeAspect="1" noChangeArrowheads="1"/>
+                    </pic:cNvPicPr>
+                  </pic:nvPicPr>
+                  <pic:blipFill>
+                    <a:blip r:link="rId8">
+                      <a:extLst>
+                        <a:ext uri="{28A0092B-C50C-407E-A947-70E740481C1C}">
+                          <a14:useLocalDpi xmlns:a14="http://schemas.microsoft.com/office/drawing/2010/main" val="0"/>
+                        </a:ext>
+                      </a:extLst>
+                    </a:blip>
+                    <a:srcRect/>
+                    <a:stretch>
+                      <a:fillRect/>
+                    </a:stretch>
+                  </pic:blipFill>
+                  <pic:spPr bwMode="auto">
+                    <a:xfrm>
+                      <a:off x="0" y="0"/>
+                      <a:ext cx="5715000" cy="5715000"/>
+                    </a:xfrm>
+                    <a:prstGeom prst="rect">
+                      <a:avLst/>
+                    </a:prstGeom>
+                    <a:noFill/>
+                    <a:ln>
+                      <a:noFill/>
+                    </a:ln>
+                  </pic:spPr>
+                </pic:pic>
+              </a:graphicData>
+            </a:graphic>
+          </wp:inline>
+        </w:drawing>
+      </w:r>
+    </w:p>
+    <w:p>
+      <w:pPr>
+        <w:jc w:val="center"/>
+        <w:divId w:val="1063914911"/>
+        <w:rPr>
+          <w:rFonts w:eastAsia="Times New Roman"/>
+          <w:b/>
+          <w:bCs/>
+          <w:color w:val="000000"/>
           <w:sz w:val="19"/>
           <w:szCs w:val="19"/>
           <w:lang w:val="en"/>
         </w:rPr>
-        <w:t>"Deliver to: VIT Vellore Campus (Men's Hostel Q-Block, Katpadi • 10 Mins)"</w:t>
-      </w:r>
-      <w:r>
-        <w:rPr>
-          <w:rFonts w:ascii="Arial" w:eastAsia="Times New Roman" w:hAnsi="Arial" w:cs="Arial"/>
-          <w:color w:val="333333"/>
+      </w:pPr>
+      <w:r>
+        <w:rPr>
+          <w:rFonts w:eastAsia="Times New Roman"/>
+          <w:b/>
+          <w:bCs/>
+          <w:color w:val="000000"/>
           <w:sz w:val="19"/>
           <w:szCs w:val="19"/>
           <w:lang w:val="en"/>
         </w:rPr>
-        <w:t xml:space="preserve"> and the product cards displaying the OnePlus 11R 5G flash sale.</w:t>
-      </w:r>
-      <w:r>
+        <w:t>Figure 4: Unhandled Backend ZeroDivisionError Stack Trace Emitted to AWS CloudWatch Standard Output</w:t>
+      </w:r>
+    </w:p>
+    <w:p>
+      <w:pPr>
+        <w:shd w:val="clear" w:color="auto" w:fill="F9F9F9"/>
+        <w:divId w:val="149104153"/>
         <w:rPr>
           <w:rFonts w:ascii="Arial" w:eastAsia="Times New Roman" w:hAnsi="Arial" w:cs="Arial"/>
-          <w:color w:val="333333"/>
+          <w:color w:val="000000"/>
           <w:sz w:val="19"/>
           <w:szCs w:val="19"/>
           <w:lang w:val="en"/>
         </w:rPr>
-        <w:br/>
-        <w:t xml:space="preserve">- Paste the screenshot in this box. </w:t>
+      </w:pPr>
+      <w:r>
+        <w:rPr>
+          <w:rStyle w:val="Strong"/>
+          <w:rFonts w:ascii="Arial" w:eastAsia="Times New Roman" w:hAnsi="Arial" w:cs="Arial"/>
+          <w:color w:val="000000"/>
+          <w:sz w:val="19"/>
+          <w:szCs w:val="19"/>
+          <w:lang w:val="en"/>
+        </w:rPr>
+        <w:t>Technical Assessment:</w:t>
+      </w:r>
+      <w:r>
+        <w:rPr>
+          <w:rFonts w:ascii="Arial" w:eastAsia="Times New Roman" w:hAnsi="Arial" w:cs="Arial"/>
+          <w:color w:val="000000"/>
+          <w:sz w:val="19"/>
+          <w:szCs w:val="19"/>
+          <w:lang w:val="en"/>
+        </w:rPr>
+        <w:t xml:space="preserve"> </w:t>
+      </w:r>
+      <w:r>
+        <w:rPr>
+          <w:rFonts w:ascii="Arial" w:eastAsia="Times New Roman" w:hAnsi="Arial" w:cs="Arial"/>
+          <w:color w:val="000000"/>
+          <w:sz w:val="19"/>
+          <w:szCs w:val="19"/>
+          <w:lang w:val="en"/>
+        </w:rPr>
+        <w:t xml:space="preserve">The terminal output captures the precise crash line (line 119 in </w:t>
+      </w:r>
+      <w:r>
+        <w:rPr>
+          <w:rStyle w:val="HTMLCode"/>
+          <w:color w:val="000000"/>
+          <w:lang w:val="en"/>
+        </w:rPr>
+        <w:t>checkout</w:t>
+      </w:r>
+      <w:r>
+        <w:rPr>
+          <w:rFonts w:ascii="Arial" w:eastAsia="Times New Roman" w:hAnsi="Arial" w:cs="Arial"/>
+          <w:color w:val="000000"/>
+          <w:sz w:val="19"/>
+          <w:szCs w:val="19"/>
+          <w:lang w:val="en"/>
+        </w:rPr>
+        <w:t xml:space="preserve">), the division by zero exception, and the structured CloudWatch telemetry marker </w:t>
+      </w:r>
+      <w:r>
+        <w:rPr>
+          <w:rStyle w:val="HTMLCode"/>
+          <w:color w:val="000000"/>
+          <w:lang w:val="en"/>
+        </w:rPr>
+        <w:t>[CRITICAL_ALERT]</w:t>
+      </w:r>
+      <w:r>
+        <w:rPr>
+          <w:rFonts w:ascii="Arial" w:eastAsia="Times New Roman" w:hAnsi="Arial" w:cs="Arial"/>
+          <w:color w:val="000000"/>
+          <w:sz w:val="19"/>
+          <w:szCs w:val="19"/>
+          <w:lang w:val="en"/>
+        </w:rPr>
+        <w:t xml:space="preserve"> emitted for instant filter detection. </w:t>
+      </w:r>
+    </w:p>
+    <w:p>
+      <w:pPr>
+        <w:pStyle w:val="Heading3"/>
+        <w:rPr>
+          <w:rFonts w:eastAsia="Times New Roman"/>
+          <w:color w:val="000000"/>
+          <w:lang w:val="en"/>
+        </w:rPr>
+      </w:pPr>
+      <w:r>
+        <w:rPr>
+          <w:rFonts w:eastAsia="Times New Roman"/>
+          <w:color w:val="000000"/>
+          <w:lang w:val="en"/>
+        </w:rPr>
+        <w:t>Step 4: AWS CloudWatch Metric Filter Pattern Matching &amp; Incident Ingestion</w:t>
+      </w:r>
+    </w:p>
+    <w:p>
+      <w:pPr>
+        <w:pStyle w:val="NormalWeb"/>
+        <w:rPr>
+          <w:color w:val="000000"/>
+          <w:sz w:val="22"/>
+          <w:szCs w:val="22"/>
+          <w:lang w:val="en"/>
+        </w:rPr>
+      </w:pPr>
+      <w:r>
+        <w:rPr>
+          <w:color w:val="000000"/>
+          <w:sz w:val="22"/>
+          <w:szCs w:val="22"/>
+          <w:lang w:val="en"/>
+        </w:rPr>
+        <w:lastRenderedPageBreak/>
+        <w:t xml:space="preserve">In the AWS cloud environment, Amazon CloudWatch Logs continuously monitors the log group </w:t>
+      </w:r>
+      <w:r>
+        <w:rPr>
+          <w:rStyle w:val="HTMLCode"/>
+          <w:color w:val="000000"/>
+          <w:lang w:val="en"/>
+        </w:rPr>
+        <w:t>/aws/lambda/watchdog-target-app</w:t>
+      </w:r>
+      <w:r>
+        <w:rPr>
+          <w:color w:val="000000"/>
+          <w:sz w:val="22"/>
+          <w:szCs w:val="22"/>
+          <w:lang w:val="en"/>
+        </w:rPr>
+        <w:t xml:space="preserve">. A Metric Filter with pattern </w:t>
+      </w:r>
+      <w:r>
+        <w:rPr>
+          <w:rStyle w:val="HTMLCode"/>
+          <w:color w:val="000000"/>
+          <w:lang w:val="en"/>
+        </w:rPr>
+        <w:t>[CRITICAL_ALERT]</w:t>
+      </w:r>
+      <w:r>
+        <w:rPr>
+          <w:color w:val="000000"/>
+          <w:sz w:val="22"/>
+          <w:szCs w:val="22"/>
+          <w:lang w:val="en"/>
+        </w:rPr>
+        <w:t xml:space="preserve"> </w:t>
+      </w:r>
+      <w:r>
+        <w:rPr>
+          <w:color w:val="000000"/>
+          <w:sz w:val="22"/>
+          <w:szCs w:val="22"/>
+          <w:lang w:val="en"/>
+        </w:rPr>
+        <w:t xml:space="preserve">detects the incident instantaneously without requiring human log analysis. The filter fires an AWS CloudWatch Alarm, shifting state to </w:t>
+      </w:r>
+      <w:r>
+        <w:rPr>
+          <w:rStyle w:val="HTMLCode"/>
+          <w:color w:val="000000"/>
+          <w:lang w:val="en"/>
+        </w:rPr>
+        <w:t>ALARM</w:t>
+      </w:r>
+      <w:r>
+        <w:rPr>
+          <w:color w:val="000000"/>
+          <w:sz w:val="22"/>
+          <w:szCs w:val="22"/>
+          <w:lang w:val="en"/>
+        </w:rPr>
+        <w:t xml:space="preserve"> and executing an asynchronous trigger. </w:t>
       </w:r>
     </w:p>
     <w:p>
       <w:pPr>
         <w:jc w:val="center"/>
-        <w:divId w:val="1438214160"/>
+        <w:divId w:val="635911667"/>
+        <w:rPr>
+          <w:rFonts w:eastAsia="Times New Roman"/>
+          <w:color w:val="000000"/>
+          <w:sz w:val="22"/>
+          <w:szCs w:val="22"/>
+          <w:lang w:val="en"/>
+        </w:rPr>
+      </w:pPr>
+      <w:r>
+        <w:rPr>
+          <w:rFonts w:eastAsia="Times New Roman"/>
+          <w:noProof/>
+          <w:color w:val="000000"/>
+          <w:sz w:val="22"/>
+          <w:szCs w:val="22"/>
+          <w:lang w:val="en"/>
+        </w:rPr>
+        <w:drawing>
+          <wp:inline distT="0" distB="0" distL="0" distR="0" wp14:anchorId="1794B78A" wp14:editId="3F51E84C">
+            <wp:extent cx="5715000" cy="5715000"/>
+            <wp:effectExtent l="0" t="0" r="0" b="0"/>
+            <wp:docPr id="5" name="Picture 5" descr="SRE Backstage Dashboard and CloudWatch Telemetry"/>
+            <wp:cNvGraphicFramePr>
+              <a:graphicFrameLocks xmlns:a="http://schemas.openxmlformats.org/drawingml/2006/main" noChangeAspect="1"/>
+            </wp:cNvGraphicFramePr>
+            <a:graphic xmlns:a="http://schemas.openxmlformats.org/drawingml/2006/main">
+              <a:graphicData uri="http://schemas.openxmlformats.org/drawingml/2006/picture">
+                <pic:pic xmlns:pic="http://schemas.openxmlformats.org/drawingml/2006/picture">
+                  <pic:nvPicPr>
+                    <pic:cNvPr id="0" name="Picture 5" descr="SRE Backstage Dashboard and CloudWatch Telemetry"/>
+                    <pic:cNvPicPr>
+                      <a:picLocks noChangeAspect="1" noChangeArrowheads="1"/>
+                    </pic:cNvPicPr>
+                  </pic:nvPicPr>
+                  <pic:blipFill>
+                    <a:blip r:link="rId9">
+                      <a:extLst>
+                        <a:ext uri="{28A0092B-C50C-407E-A947-70E740481C1C}">
+                          <a14:useLocalDpi xmlns:a14="http://schemas.microsoft.com/office/drawing/2010/main" val="0"/>
+                        </a:ext>
+                      </a:extLst>
+                    </a:blip>
+                    <a:srcRect/>
+                    <a:stretch>
+                      <a:fillRect/>
+                    </a:stretch>
+                  </pic:blipFill>
+                  <pic:spPr bwMode="auto">
+                    <a:xfrm>
+                      <a:off x="0" y="0"/>
+                      <a:ext cx="5715000" cy="5715000"/>
+                    </a:xfrm>
+                    <a:prstGeom prst="rect">
+                      <a:avLst/>
+                    </a:prstGeom>
+                    <a:noFill/>
+                    <a:ln>
+                      <a:noFill/>
+                    </a:ln>
+                  </pic:spPr>
+                </pic:pic>
+              </a:graphicData>
+            </a:graphic>
+          </wp:inline>
+        </w:drawing>
+      </w:r>
+    </w:p>
+    <w:p>
+      <w:pPr>
+        <w:jc w:val="center"/>
+        <w:divId w:val="781917926"/>
         <w:rPr>
           <w:rFonts w:eastAsia="Times New Roman"/>
           <w:b/>
@@ -3184,7 +3974,51 @@
           <w:szCs w:val="19"/>
           <w:lang w:val="en"/>
         </w:rPr>
-        <w:t>Figure 2: FlashMart Promotional Flash Sale Storefront Configured for VIT Vellore Campus Hub</w:t>
+        <w:t>Figure 5: SRE Backstage Console Displaying Live CloudWatch Telemetry and Active Incident Alert</w:t>
+      </w:r>
+    </w:p>
+    <w:p>
+      <w:pPr>
+        <w:shd w:val="clear" w:color="auto" w:fill="F9F9F9"/>
+        <w:divId w:val="1822624549"/>
+        <w:rPr>
+          <w:rFonts w:ascii="Arial" w:eastAsia="Times New Roman" w:hAnsi="Arial" w:cs="Arial"/>
+          <w:color w:val="000000"/>
+          <w:sz w:val="19"/>
+          <w:szCs w:val="19"/>
+          <w:lang w:val="en"/>
+        </w:rPr>
+      </w:pPr>
+      <w:r>
+        <w:rPr>
+          <w:rStyle w:val="Strong"/>
+          <w:rFonts w:ascii="Arial" w:eastAsia="Times New Roman" w:hAnsi="Arial" w:cs="Arial"/>
+          <w:color w:val="000000"/>
+          <w:sz w:val="19"/>
+          <w:szCs w:val="19"/>
+          <w:lang w:val="en"/>
+        </w:rPr>
+        <w:t>Technical Assessment:</w:t>
+      </w:r>
+      <w:r>
+        <w:rPr>
+          <w:rFonts w:ascii="Arial" w:eastAsia="Times New Roman" w:hAnsi="Arial" w:cs="Arial"/>
+          <w:color w:val="000000"/>
+          <w:sz w:val="19"/>
+          <w:szCs w:val="19"/>
+          <w:lang w:val="en"/>
+        </w:rPr>
+        <w:t xml:space="preserve"> </w:t>
+      </w:r>
+      <w:r>
+        <w:rPr>
+          <w:rFonts w:ascii="Arial" w:eastAsia="Times New Roman" w:hAnsi="Arial" w:cs="Arial"/>
+          <w:color w:val="000000"/>
+          <w:sz w:val="19"/>
+          <w:szCs w:val="19"/>
+          <w:lang w:val="en"/>
+        </w:rPr>
+        <w:t xml:space="preserve">SRE Backstage console confirms real-time ingestion from AWS CloudWatch (ap-southeast-2 Sydney), highlighting the active critical alarm badge and live streaming stdout error logs. </w:t>
       </w:r>
     </w:p>
     <w:p>
@@ -3202,15 +4036,7 @@
           <w:color w:val="000000"/>
           <w:lang w:val="en"/>
         </w:rPr>
-        <w:t xml:space="preserve">Step 2: Flash Sale Stockout &amp; </w:t>
-      </w:r>
-      <w:r>
-        <w:rPr>
-          <w:rFonts w:eastAsia="Times New Roman"/>
-          <w:color w:val="000000"/>
-          <w:lang w:val="en"/>
-        </w:rPr>
-        <w:t>Graceful Frontend Exception Handling</w:t>
+        <w:t>Step 5: Watchdog Serverless Orchestrator &amp; Forensic S3 Evidence Vault Storage</w:t>
       </w:r>
     </w:p>
     <w:p>
@@ -3230,7 +4056,7 @@
           <w:szCs w:val="22"/>
           <w:lang w:val="en"/>
         </w:rPr>
-        <w:t xml:space="preserve">A customer initiates checkout for the promotional deal item: </w:t>
+        <w:t xml:space="preserve">Upon log pattern matching, Amazon CloudWatch activates the serverless </w:t>
       </w:r>
       <w:r>
         <w:rPr>
@@ -3240,16 +4066,33 @@
           <w:szCs w:val="22"/>
           <w:lang w:val="en"/>
         </w:rPr>
-        <w:t>OnePlus 11R 5G</w:t>
-      </w:r>
-      <w:r>
-        <w:rPr>
-          <w:color w:val="000000"/>
-          <w:sz w:val="22"/>
-          <w:szCs w:val="22"/>
-          <w:lang w:val="en"/>
-        </w:rPr>
-        <w:t xml:space="preserve">. Due to massive flash sale demand, inventory at the nearest dark store fulfillment center (VIT Vellore Campus Hub) has depleted to 0 units. </w:t>
+        <w:t>AWS Lambda Watchdog</w:t>
+      </w:r>
+      <w:r>
+        <w:rPr>
+          <w:color w:val="000000"/>
+          <w:sz w:val="22"/>
+          <w:szCs w:val="22"/>
+          <w:lang w:val="en"/>
+        </w:rPr>
+        <w:t xml:space="preserve"> (</w:t>
+      </w:r>
+      <w:r>
+        <w:rPr>
+          <w:rStyle w:val="HTMLCode"/>
+          <w:color w:val="000000"/>
+          <w:lang w:val="en"/>
+        </w:rPr>
+        <w:t>watchdog-incident-creator</w:t>
+      </w:r>
+      <w:r>
+        <w:rPr>
+          <w:color w:val="000000"/>
+          <w:sz w:val="22"/>
+          <w:szCs w:val="22"/>
+          <w:lang w:val="en"/>
+        </w:rPr>
+        <w:t xml:space="preserve">). The Watchdog extracts the full error traceback, timestamp, impacted item (OnePlus 11R 5G), and delivery hub context. </w:t>
       </w:r>
     </w:p>
     <w:p>
@@ -3264,75 +4107,157 @@
       </w:pPr>
       <w:r>
         <w:rPr>
-          <w:rStyle w:val="Strong"/>
-          <w:color w:val="000000"/>
-          <w:sz w:val="22"/>
-          <w:szCs w:val="22"/>
-          <w:lang w:val="en"/>
-        </w:rPr>
-        <w:t>Graceful Customer Insulation:</w:t>
-      </w:r>
-      <w:r>
-        <w:rPr>
-          <w:color w:val="000000"/>
-          <w:sz w:val="22"/>
-          <w:szCs w:val="22"/>
-          <w:lang w:val="en"/>
-        </w:rPr>
-        <w:t xml:space="preserve"> In a mature production architecture, customer user experience must never be broken by raw server crash responses. The front-end client intercepts the stockout state and smoothly displays a slide-out customer notification: </w:t>
-      </w:r>
-      <w:r>
-        <w:rPr>
-          <w:rStyle w:val="Emphasis"/>
-          <w:color w:val="000000"/>
-          <w:sz w:val="22"/>
-          <w:szCs w:val="22"/>
-          <w:lang w:val="en"/>
-        </w:rPr>
-        <w:t>"Item Not Deliverable to Your Location: OnePlus 11R 5G is currently out of stock at your nearest fulfillment dark store"</w:t>
-      </w:r>
-      <w:r>
-        <w:rPr>
-          <w:color w:val="000000"/>
-          <w:sz w:val="22"/>
-          <w:szCs w:val="22"/>
-          <w:lang w:val="en"/>
-        </w:rPr>
-        <w:t xml:space="preserve"> with a </w:t>
-      </w:r>
-      <w:r>
-        <w:rPr>
-          <w:rStyle w:val="Emphasis"/>
-          <w:color w:val="000000"/>
-          <w:sz w:val="22"/>
-          <w:szCs w:val="22"/>
-          <w:lang w:val="en"/>
-        </w:rPr>
-        <w:t>"Notify Me when Available"</w:t>
-      </w:r>
-      <w:r>
-        <w:rPr>
-          <w:color w:val="000000"/>
-          <w:sz w:val="22"/>
-          <w:szCs w:val="22"/>
-          <w:lang w:val="en"/>
-        </w:rPr>
-        <w:t xml:space="preserve"> waitlist option. </w:t>
-      </w:r>
-    </w:p>
-    <w:p>
-      <w:pPr>
-        <w:shd w:val="clear" w:color="auto" w:fill="FAFAFA"/>
+          <w:color w:val="000000"/>
+          <w:sz w:val="22"/>
+          <w:szCs w:val="22"/>
+          <w:lang w:val="en"/>
+        </w:rPr>
+        <w:t xml:space="preserve">To ensure immutable auditability and prevent log tampering, the Watchdog connects via </w:t>
+      </w:r>
+      <w:r>
+        <w:rPr>
+          <w:rStyle w:val="HTMLCode"/>
+          <w:color w:val="000000"/>
+          <w:lang w:val="en"/>
+        </w:rPr>
+        <w:t>boto3</w:t>
+      </w:r>
+      <w:r>
+        <w:rPr>
+          <w:color w:val="000000"/>
+          <w:sz w:val="22"/>
+          <w:szCs w:val="22"/>
+          <w:lang w:val="en"/>
+        </w:rPr>
+        <w:t xml:space="preserve"> to Amazon Simple Storage Service (S3) and stores a tamper-proof forensic JSON dump in the private S3 </w:t>
+      </w:r>
+      <w:r>
+        <w:rPr>
+          <w:color w:val="000000"/>
+          <w:sz w:val="22"/>
+          <w:szCs w:val="22"/>
+          <w:lang w:val="en"/>
+        </w:rPr>
+        <w:lastRenderedPageBreak/>
+        <w:t xml:space="preserve">bucket </w:t>
+      </w:r>
+      <w:r>
+        <w:rPr>
+          <w:rStyle w:val="HTMLCode"/>
+          <w:color w:val="000000"/>
+          <w:lang w:val="en"/>
+        </w:rPr>
+        <w:t>devops-incident-watchdog-logs-401537512022</w:t>
+      </w:r>
+      <w:r>
+        <w:rPr>
+          <w:color w:val="000000"/>
+          <w:sz w:val="22"/>
+          <w:szCs w:val="22"/>
+          <w:lang w:val="en"/>
+        </w:rPr>
+        <w:t xml:space="preserve"> under the key: </w:t>
+      </w:r>
+      <w:r>
+        <w:rPr>
+          <w:rStyle w:val="HTMLCode"/>
+          <w:color w:val="000000"/>
+          <w:lang w:val="en"/>
+        </w:rPr>
+        <w:t>incidents/2026-10-14/INC-1791945923-07CD12B5.json</w:t>
+      </w:r>
+      <w:r>
+        <w:rPr>
+          <w:color w:val="000000"/>
+          <w:sz w:val="22"/>
+          <w:szCs w:val="22"/>
+          <w:lang w:val="en"/>
+        </w:rPr>
+        <w:t xml:space="preserve"> (369 bytes). </w:t>
+      </w:r>
+    </w:p>
+    <w:p>
+      <w:pPr>
         <w:jc w:val="center"/>
-        <w:divId w:val="1230578509"/>
+        <w:divId w:val="65036979"/>
+        <w:rPr>
+          <w:rFonts w:eastAsia="Times New Roman"/>
+          <w:color w:val="000000"/>
+          <w:sz w:val="22"/>
+          <w:szCs w:val="22"/>
+          <w:lang w:val="en"/>
+        </w:rPr>
+      </w:pPr>
+      <w:r>
+        <w:rPr>
+          <w:rFonts w:eastAsia="Times New Roman"/>
+          <w:noProof/>
+          <w:color w:val="000000"/>
+          <w:sz w:val="22"/>
+          <w:szCs w:val="22"/>
+          <w:lang w:val="en"/>
+        </w:rPr>
+        <w:drawing>
+          <wp:inline distT="0" distB="0" distL="0" distR="0" wp14:anchorId="44498A2B" wp14:editId="5446764D">
+            <wp:extent cx="5715000" cy="5715000"/>
+            <wp:effectExtent l="0" t="0" r="0" b="0"/>
+            <wp:docPr id="6" name="Picture 6" descr="Amazon S3 Crash Dump Forensic Vault"/>
+            <wp:cNvGraphicFramePr>
+              <a:graphicFrameLocks xmlns:a="http://schemas.openxmlformats.org/drawingml/2006/main" noChangeAspect="1"/>
+            </wp:cNvGraphicFramePr>
+            <a:graphic xmlns:a="http://schemas.openxmlformats.org/drawingml/2006/main">
+              <a:graphicData uri="http://schemas.openxmlformats.org/drawingml/2006/picture">
+                <pic:pic xmlns:pic="http://schemas.openxmlformats.org/drawingml/2006/picture">
+                  <pic:nvPicPr>
+                    <pic:cNvPr id="0" name="Picture 6" descr="Amazon S3 Crash Dump Forensic Vault"/>
+                    <pic:cNvPicPr>
+                      <a:picLocks noChangeAspect="1" noChangeArrowheads="1"/>
+                    </pic:cNvPicPr>
+                  </pic:nvPicPr>
+                  <pic:blipFill>
+                    <a:blip r:link="rId10">
+                      <a:extLst>
+                        <a:ext uri="{28A0092B-C50C-407E-A947-70E740481C1C}">
+                          <a14:useLocalDpi xmlns:a14="http://schemas.microsoft.com/office/drawing/2010/main" val="0"/>
+                        </a:ext>
+                      </a:extLst>
+                    </a:blip>
+                    <a:srcRect/>
+                    <a:stretch>
+                      <a:fillRect/>
+                    </a:stretch>
+                  </pic:blipFill>
+                  <pic:spPr bwMode="auto">
+                    <a:xfrm>
+                      <a:off x="0" y="0"/>
+                      <a:ext cx="5715000" cy="5715000"/>
+                    </a:xfrm>
+                    <a:prstGeom prst="rect">
+                      <a:avLst/>
+                    </a:prstGeom>
+                    <a:noFill/>
+                    <a:ln>
+                      <a:noFill/>
+                    </a:ln>
+                  </pic:spPr>
+                </pic:pic>
+              </a:graphicData>
+            </a:graphic>
+          </wp:inline>
+        </w:drawing>
+      </w:r>
+    </w:p>
+    <w:p>
+      <w:pPr>
+        <w:jc w:val="center"/>
+        <w:divId w:val="213738735"/>
         <w:rPr>
           <w:rFonts w:eastAsia="Times New Roman"/>
           <w:b/>
           <w:bCs/>
-          <w:caps/>
-          <w:color w:val="000000"/>
-          <w:sz w:val="22"/>
-          <w:szCs w:val="22"/>
+          <w:color w:val="000000"/>
+          <w:sz w:val="19"/>
+          <w:szCs w:val="19"/>
           <w:lang w:val="en"/>
         </w:rPr>
       </w:pPr>
@@ -3341,1981 +4266,786 @@
           <w:rFonts w:eastAsia="Times New Roman"/>
           <w:b/>
           <w:bCs/>
-          <w:caps/>
-          <w:color w:val="000000"/>
-          <w:sz w:val="22"/>
-          <w:szCs w:val="22"/>
-          <w:lang w:val="en"/>
-        </w:rPr>
-        <w:t>[PASTE SNAPSHOT 2: GRACEFUL CUSTOMER STOCKOUT DRAWER ("ITEM NOT DELIVERABLE")]</w:t>
-      </w:r>
-    </w:p>
-    <w:p>
-      <w:pPr>
-        <w:shd w:val="clear" w:color="auto" w:fill="FFFFFF"/>
-        <w:divId w:val="1266227520"/>
-        <w:rPr>
-          <w:rFonts w:ascii="Arial" w:eastAsia="Times New Roman" w:hAnsi="Arial" w:cs="Arial"/>
-          <w:color w:val="333333"/>
+          <w:color w:val="000000"/>
           <w:sz w:val="19"/>
           <w:szCs w:val="19"/>
           <w:lang w:val="en"/>
         </w:rPr>
+        <w:t>Figure 6: Immutable Incident Forensic Evidence Archived in Private Amazon S3 Vault</w:t>
+      </w:r>
+    </w:p>
+    <w:p>
+      <w:pPr>
+        <w:shd w:val="clear" w:color="auto" w:fill="F9F9F9"/>
+        <w:divId w:val="1088120184"/>
+        <w:rPr>
+          <w:rFonts w:ascii="Arial" w:eastAsia="Times New Roman" w:hAnsi="Arial" w:cs="Arial"/>
+          <w:color w:val="000000"/>
+          <w:sz w:val="19"/>
+          <w:szCs w:val="19"/>
+          <w:lang w:val="en"/>
+        </w:rPr>
       </w:pPr>
       <w:r>
         <w:rPr>
           <w:rStyle w:val="Strong"/>
           <w:rFonts w:ascii="Arial" w:eastAsia="Times New Roman" w:hAnsi="Arial" w:cs="Arial"/>
-          <w:color w:val="333333"/>
+          <w:color w:val="000000"/>
           <w:sz w:val="19"/>
           <w:szCs w:val="19"/>
           <w:lang w:val="en"/>
         </w:rPr>
-        <w:t>HOW TO CAPTURE:</w:t>
+        <w:t>Technical Assessment:</w:t>
       </w:r>
       <w:r>
         <w:rPr>
           <w:rFonts w:ascii="Arial" w:eastAsia="Times New Roman" w:hAnsi="Arial" w:cs="Arial"/>
-          <w:color w:val="333333"/>
+          <w:color w:val="000000"/>
           <w:sz w:val="19"/>
           <w:szCs w:val="19"/>
           <w:lang w:val="en"/>
         </w:rPr>
-        <w:br/>
-        <w:t xml:space="preserve">- On the FlashMart storefront, click the </w:t>
-      </w:r>
+        <w:t xml:space="preserve"> Real AWS Management Console S3 view displaying the private bucket </w:t>
+      </w:r>
+      <w:r>
+        <w:rPr>
+          <w:rStyle w:val="HTMLCode"/>
+          <w:color w:val="000000"/>
+          <w:lang w:val="en"/>
+        </w:rPr>
+        <w:t>devops-incident-watchdog-logs-401537512022</w:t>
+      </w:r>
+      <w:r>
+        <w:rPr>
+          <w:rFonts w:ascii="Arial" w:eastAsia="Times New Roman" w:hAnsi="Arial" w:cs="Arial"/>
+          <w:color w:val="000000"/>
+          <w:sz w:val="19"/>
+          <w:szCs w:val="19"/>
+          <w:lang w:val="en"/>
+        </w:rPr>
+        <w:t xml:space="preserve"> with date-partitioned incident dump </w:t>
+      </w:r>
+      <w:r>
+        <w:rPr>
+          <w:rStyle w:val="HTMLCode"/>
+          <w:color w:val="000000"/>
+          <w:lang w:val="en"/>
+        </w:rPr>
+        <w:t>INC-1791945923-07CD12B5.json</w:t>
+      </w:r>
+      <w:r>
+        <w:rPr>
+          <w:rFonts w:ascii="Arial" w:eastAsia="Times New Roman" w:hAnsi="Arial" w:cs="Arial"/>
+          <w:color w:val="000000"/>
+          <w:sz w:val="19"/>
+          <w:szCs w:val="19"/>
+          <w:lang w:val="en"/>
+        </w:rPr>
+        <w:t xml:space="preserve">, providing 11 9's durability for post-mortem compliance. </w:t>
+      </w:r>
+    </w:p>
+    <w:p>
+      <w:pPr>
+        <w:pStyle w:val="Heading3"/>
+        <w:rPr>
+          <w:rFonts w:eastAsia="Times New Roman"/>
+          <w:color w:val="000000"/>
+          <w:lang w:val="en"/>
+        </w:rPr>
+      </w:pPr>
+      <w:r>
+        <w:rPr>
+          <w:rFonts w:eastAsia="Times New Roman"/>
+          <w:color w:val="000000"/>
+          <w:lang w:val="en"/>
+        </w:rPr>
+        <w:t>Step 6: Automated Agile Bug User Story Creation on GitHub Issues</w:t>
+      </w:r>
+    </w:p>
+    <w:p>
+      <w:pPr>
+        <w:pStyle w:val="NormalWeb"/>
+        <w:rPr>
+          <w:color w:val="000000"/>
+          <w:sz w:val="22"/>
+          <w:szCs w:val="22"/>
+          <w:lang w:val="en"/>
+        </w:rPr>
+      </w:pPr>
+      <w:r>
+        <w:rPr>
+          <w:color w:val="000000"/>
+          <w:sz w:val="22"/>
+          <w:szCs w:val="22"/>
+          <w:lang w:val="en"/>
+        </w:rPr>
+        <w:t>Simultaneously with S3 archival, the Watchdog issues an authenticated HTTP POST request to the GitHub Issues REST API v3 (</w:t>
+      </w:r>
+      <w:r>
+        <w:rPr>
+          <w:rStyle w:val="HTMLCode"/>
+          <w:color w:val="000000"/>
+          <w:lang w:val="en"/>
+        </w:rPr>
+        <w:t>https://api.github.com/repos/hemalexe/devopss-incident-watchdog/issues</w:t>
+      </w:r>
+      <w:r>
+        <w:rPr>
+          <w:color w:val="000000"/>
+          <w:sz w:val="22"/>
+          <w:szCs w:val="22"/>
+          <w:lang w:val="en"/>
+        </w:rPr>
+        <w:t>). It converts the technical crash telemetry into a formalized Agile Bug User Story with priority labels (</w:t>
+      </w:r>
+      <w:r>
+        <w:rPr>
+          <w:rStyle w:val="HTMLCode"/>
+          <w:color w:val="000000"/>
+          <w:lang w:val="en"/>
+        </w:rPr>
+        <w:t>incident</w:t>
+      </w:r>
+      <w:r>
+        <w:rPr>
+          <w:color w:val="000000"/>
+          <w:sz w:val="22"/>
+          <w:szCs w:val="22"/>
+          <w:lang w:val="en"/>
+        </w:rPr>
+        <w:t xml:space="preserve">, </w:t>
+      </w:r>
+      <w:r>
+        <w:rPr>
+          <w:rStyle w:val="HTMLCode"/>
+          <w:color w:val="000000"/>
+          <w:lang w:val="en"/>
+        </w:rPr>
+        <w:t>p1-critical</w:t>
+      </w:r>
+      <w:r>
+        <w:rPr>
+          <w:color w:val="000000"/>
+          <w:sz w:val="22"/>
+          <w:szCs w:val="22"/>
+          <w:lang w:val="en"/>
+        </w:rPr>
+        <w:t xml:space="preserve">, </w:t>
+      </w:r>
+      <w:r>
+        <w:rPr>
+          <w:rStyle w:val="HTMLCode"/>
+          <w:color w:val="000000"/>
+          <w:lang w:val="en"/>
+        </w:rPr>
+        <w:t>auto-generated</w:t>
+      </w:r>
+      <w:r>
+        <w:rPr>
+          <w:color w:val="000000"/>
+          <w:sz w:val="22"/>
+          <w:szCs w:val="22"/>
+          <w:lang w:val="en"/>
+        </w:rPr>
+        <w:t xml:space="preserve">) and an actionable Definition of Done checklist. </w:t>
+      </w:r>
+    </w:p>
+    <w:p>
+      <w:pPr>
+        <w:jc w:val="center"/>
+        <w:divId w:val="1414207729"/>
+        <w:rPr>
+          <w:rFonts w:eastAsia="Times New Roman"/>
+          <w:color w:val="000000"/>
+          <w:sz w:val="22"/>
+          <w:szCs w:val="22"/>
+          <w:lang w:val="en"/>
+        </w:rPr>
+      </w:pPr>
+      <w:r>
+        <w:rPr>
+          <w:rFonts w:eastAsia="Times New Roman"/>
+          <w:noProof/>
+          <w:color w:val="000000"/>
+          <w:sz w:val="22"/>
+          <w:szCs w:val="22"/>
+          <w:lang w:val="en"/>
+        </w:rPr>
+        <w:lastRenderedPageBreak/>
+        <w:drawing>
+          <wp:inline distT="0" distB="0" distL="0" distR="0" wp14:anchorId="2E354A48" wp14:editId="4D6F6B9F">
+            <wp:extent cx="5715000" cy="5715000"/>
+            <wp:effectExtent l="0" t="0" r="0" b="0"/>
+            <wp:docPr id="7" name="Picture 7" descr="Automated Agile Bug User Story on GitHub Issues"/>
+            <wp:cNvGraphicFramePr>
+              <a:graphicFrameLocks xmlns:a="http://schemas.openxmlformats.org/drawingml/2006/main" noChangeAspect="1"/>
+            </wp:cNvGraphicFramePr>
+            <a:graphic xmlns:a="http://schemas.openxmlformats.org/drawingml/2006/main">
+              <a:graphicData uri="http://schemas.openxmlformats.org/drawingml/2006/picture">
+                <pic:pic xmlns:pic="http://schemas.openxmlformats.org/drawingml/2006/picture">
+                  <pic:nvPicPr>
+                    <pic:cNvPr id="0" name="Picture 7" descr="Automated Agile Bug User Story on GitHub Issues"/>
+                    <pic:cNvPicPr>
+                      <a:picLocks noChangeAspect="1" noChangeArrowheads="1"/>
+                    </pic:cNvPicPr>
+                  </pic:nvPicPr>
+                  <pic:blipFill>
+                    <a:blip r:link="rId11">
+                      <a:extLst>
+                        <a:ext uri="{28A0092B-C50C-407E-A947-70E740481C1C}">
+                          <a14:useLocalDpi xmlns:a14="http://schemas.microsoft.com/office/drawing/2010/main" val="0"/>
+                        </a:ext>
+                      </a:extLst>
+                    </a:blip>
+                    <a:srcRect/>
+                    <a:stretch>
+                      <a:fillRect/>
+                    </a:stretch>
+                  </pic:blipFill>
+                  <pic:spPr bwMode="auto">
+                    <a:xfrm>
+                      <a:off x="0" y="0"/>
+                      <a:ext cx="5715000" cy="5715000"/>
+                    </a:xfrm>
+                    <a:prstGeom prst="rect">
+                      <a:avLst/>
+                    </a:prstGeom>
+                    <a:noFill/>
+                    <a:ln>
+                      <a:noFill/>
+                    </a:ln>
+                  </pic:spPr>
+                </pic:pic>
+              </a:graphicData>
+            </a:graphic>
+          </wp:inline>
+        </w:drawing>
+      </w:r>
+    </w:p>
+    <w:p>
+      <w:pPr>
+        <w:jc w:val="center"/>
+        <w:divId w:val="1478262588"/>
+        <w:rPr>
+          <w:rFonts w:eastAsia="Times New Roman"/>
+          <w:b/>
+          <w:bCs/>
+          <w:color w:val="000000"/>
+          <w:sz w:val="19"/>
+          <w:szCs w:val="19"/>
+          <w:lang w:val="en"/>
+        </w:rPr>
+      </w:pPr>
+      <w:r>
+        <w:rPr>
+          <w:rFonts w:eastAsia="Times New Roman"/>
+          <w:b/>
+          <w:bCs/>
+          <w:color w:val="000000"/>
+          <w:sz w:val="19"/>
+          <w:szCs w:val="19"/>
+          <w:lang w:val="en"/>
+        </w:rPr>
+        <w:t>Figure 7: Automated Agile Bug User Story Populated into GitHub Issues Sprint Backlog</w:t>
+      </w:r>
+    </w:p>
+    <w:p>
+      <w:pPr>
+        <w:shd w:val="clear" w:color="auto" w:fill="F9F9F9"/>
+        <w:divId w:val="1643382301"/>
+        <w:rPr>
+          <w:rFonts w:ascii="Arial" w:eastAsia="Times New Roman" w:hAnsi="Arial" w:cs="Arial"/>
+          <w:color w:val="000000"/>
+          <w:sz w:val="19"/>
+          <w:szCs w:val="19"/>
+          <w:lang w:val="en"/>
+        </w:rPr>
+      </w:pPr>
       <w:r>
         <w:rPr>
           <w:rStyle w:val="Strong"/>
           <w:rFonts w:ascii="Arial" w:eastAsia="Times New Roman" w:hAnsi="Arial" w:cs="Arial"/>
-          <w:color w:val="333333"/>
+          <w:color w:val="000000"/>
           <w:sz w:val="19"/>
           <w:szCs w:val="19"/>
           <w:lang w:val="en"/>
         </w:rPr>
-        <w:t>"Buy Now"</w:t>
+        <w:t>Technical Assessment:</w:t>
       </w:r>
       <w:r>
         <w:rPr>
           <w:rFonts w:ascii="Arial" w:eastAsia="Times New Roman" w:hAnsi="Arial" w:cs="Arial"/>
-          <w:color w:val="333333"/>
+          <w:color w:val="000000"/>
           <w:sz w:val="19"/>
           <w:szCs w:val="19"/>
           <w:lang w:val="en"/>
         </w:rPr>
-        <w:t xml:space="preserve"> button on the OnePlus 11R 5G product card.</w:t>
-      </w:r>
-      <w:r>
-        <w:rPr>
-          <w:rFonts w:ascii="Arial" w:eastAsia="Times New Roman" w:hAnsi="Arial" w:cs="Arial"/>
-          <w:color w:val="333333"/>
+        <w:t xml:space="preserve"> Live GitHub Issue #1 contains a formalized Agile User Story ("As an Agile Team member..."), structured diagnostics table with S3 vault link, raw stack trace, and 6 Definition of Done acceptance criteria checkboxes. </w:t>
+      </w:r>
+    </w:p>
+    <w:p>
+      <w:pPr>
+        <w:pStyle w:val="Heading3"/>
+        <w:rPr>
+          <w:rFonts w:eastAsia="Times New Roman"/>
+          <w:color w:val="000000"/>
+          <w:lang w:val="en"/>
+        </w:rPr>
+      </w:pPr>
+      <w:r>
+        <w:rPr>
+          <w:rFonts w:eastAsia="Times New Roman"/>
+          <w:color w:val="000000"/>
+          <w:lang w:val="en"/>
+        </w:rPr>
+        <w:t>Step 7: Automated CI/CD Regression Pipeline &amp; Zero-Touch Incident Resolution</w:t>
+      </w:r>
+    </w:p>
+    <w:p>
+      <w:pPr>
+        <w:pStyle w:val="NormalWeb"/>
+        <w:rPr>
+          <w:color w:val="000000"/>
+          <w:sz w:val="22"/>
+          <w:szCs w:val="22"/>
+          <w:lang w:val="en"/>
+        </w:rPr>
+      </w:pPr>
+      <w:r>
+        <w:rPr>
+          <w:color w:val="000000"/>
+          <w:sz w:val="22"/>
+          <w:szCs w:val="22"/>
+          <w:lang w:val="en"/>
+        </w:rPr>
+        <w:t xml:space="preserve">The assigned developer inspects the automated ticket and implements defensive boundary checking in </w:t>
+      </w:r>
+      <w:r>
+        <w:rPr>
+          <w:rStyle w:val="HTMLCode"/>
+          <w:color w:val="000000"/>
+          <w:lang w:val="en"/>
+        </w:rPr>
+        <w:t>app/app.py</w:t>
+      </w:r>
+      <w:r>
+        <w:rPr>
+          <w:color w:val="000000"/>
+          <w:sz w:val="22"/>
+          <w:szCs w:val="22"/>
+          <w:lang w:val="en"/>
+        </w:rPr>
+        <w:t xml:space="preserve">: </w:t>
+      </w:r>
+    </w:p>
+    <w:p>
+      <w:pPr>
+        <w:pStyle w:val="HTMLPreformatted"/>
+        <w:rPr>
+          <w:color w:val="000000"/>
+          <w:lang w:val="en"/>
+        </w:rPr>
+      </w:pPr>
+    </w:p>
+    <w:p>
+      <w:pPr>
+        <w:pStyle w:val="HTMLPreformatted"/>
+        <w:rPr>
+          <w:color w:val="000000"/>
+          <w:lang w:val="en"/>
+        </w:rPr>
+      </w:pPr>
+      <w:r>
+        <w:rPr>
+          <w:color w:val="000000"/>
+          <w:lang w:val="en"/>
+        </w:rPr>
+        <w:t># Corrected implementation in app/app.py (Defensive Zero-Stock Guard)</w:t>
+      </w:r>
+    </w:p>
+    <w:p>
+      <w:pPr>
+        <w:pStyle w:val="HTMLPreformatted"/>
+        <w:rPr>
+          <w:color w:val="000000"/>
+          <w:lang w:val="en"/>
+        </w:rPr>
+      </w:pPr>
+      <w:r>
+        <w:rPr>
+          <w:color w:val="000000"/>
+          <w:lang w:val="en"/>
+        </w:rPr>
+        <w:t>if product["stock"] &lt;= 0:</w:t>
+      </w:r>
+    </w:p>
+    <w:p>
+      <w:pPr>
+        <w:pStyle w:val="HTMLPreformatted"/>
+        <w:rPr>
+          <w:color w:val="000000"/>
+          <w:lang w:val="en"/>
+        </w:rPr>
+      </w:pPr>
+      <w:r>
+        <w:rPr>
+          <w:color w:val="000000"/>
+          <w:lang w:val="en"/>
+        </w:rPr>
+        <w:t xml:space="preserve">    logger.warning(f"[DELIVERY_NOTICE] '{product['name']}' not deliverable to '{address}'.")</w:t>
+      </w:r>
+    </w:p>
+    <w:p>
+      <w:pPr>
+        <w:pStyle w:val="HTMLPreformatted"/>
+        <w:rPr>
+          <w:color w:val="000000"/>
+          <w:lang w:val="en"/>
+        </w:rPr>
+      </w:pPr>
+      <w:r>
+        <w:rPr>
+          <w:color w:val="000000"/>
+          <w:lang w:val="en"/>
+        </w:rPr>
+        <w:t xml:space="preserve">    return jsonify({</w:t>
+      </w:r>
+    </w:p>
+    <w:p>
+      <w:pPr>
+        <w:pStyle w:val="HTMLPreformatted"/>
+        <w:rPr>
+          <w:color w:val="000000"/>
+          <w:lang w:val="en"/>
+        </w:rPr>
+      </w:pPr>
+      <w:r>
+        <w:rPr>
+          <w:color w:val="000000"/>
+          <w:lang w:val="en"/>
+        </w:rPr>
+        <w:t xml:space="preserve">        "status": "not_deliverable",</w:t>
+      </w:r>
+    </w:p>
+    <w:p>
+      <w:pPr>
+        <w:pStyle w:val="HTMLPreformatted"/>
+        <w:rPr>
+          <w:color w:val="000000"/>
+          <w:lang w:val="en"/>
+        </w:rPr>
+      </w:pPr>
+      <w:r>
+        <w:rPr>
+          <w:color w:val="000000"/>
+          <w:lang w:val="en"/>
+        </w:rPr>
+        <w:t xml:space="preserve">        </w:t>
+      </w:r>
+      <w:r>
+        <w:rPr>
+          <w:color w:val="000000"/>
+          <w:lang w:val="en"/>
+        </w:rPr>
+        <w:t>"message": "Sorry, this item is not deliverable to your address (Out of stock at your nearest fulfillment center)!",</w:t>
+      </w:r>
+    </w:p>
+    <w:p>
+      <w:pPr>
+        <w:pStyle w:val="HTMLPreformatted"/>
+        <w:rPr>
+          <w:color w:val="000000"/>
+          <w:lang w:val="en"/>
+        </w:rPr>
+      </w:pPr>
+      <w:r>
+        <w:rPr>
+          <w:color w:val="000000"/>
+          <w:lang w:val="en"/>
+        </w:rPr>
+        <w:t xml:space="preserve">        "product": product["name"],</w:t>
+      </w:r>
+    </w:p>
+    <w:p>
+      <w:pPr>
+        <w:pStyle w:val="HTMLPreformatted"/>
+        <w:rPr>
+          <w:color w:val="000000"/>
+          <w:lang w:val="en"/>
+        </w:rPr>
+      </w:pPr>
+      <w:r>
+        <w:rPr>
+          <w:color w:val="000000"/>
+          <w:lang w:val="en"/>
+        </w:rPr>
+        <w:t xml:space="preserve">        "address": address</w:t>
+      </w:r>
+    </w:p>
+    <w:p>
+      <w:pPr>
+        <w:pStyle w:val="HTMLPreformatted"/>
+        <w:rPr>
+          <w:color w:val="000000"/>
+          <w:lang w:val="en"/>
+        </w:rPr>
+      </w:pPr>
+      <w:r>
+        <w:rPr>
+          <w:color w:val="000000"/>
+          <w:lang w:val="en"/>
+        </w:rPr>
+        <w:t xml:space="preserve">    }), 400</w:t>
+      </w:r>
+    </w:p>
+    <w:p>
+      <w:pPr>
+        <w:pStyle w:val="NormalWeb"/>
+        <w:rPr>
+          <w:color w:val="000000"/>
+          <w:sz w:val="22"/>
+          <w:szCs w:val="22"/>
+          <w:lang w:val="en"/>
+        </w:rPr>
+      </w:pPr>
+      <w:r>
+        <w:rPr>
+          <w:color w:val="000000"/>
+          <w:sz w:val="22"/>
+          <w:szCs w:val="22"/>
+          <w:lang w:val="en"/>
+        </w:rPr>
+        <w:t xml:space="preserve">The developer commits the patch using Git Smart Commit syntax: </w:t>
+      </w:r>
+      <w:r>
+        <w:rPr>
+          <w:rStyle w:val="HTMLCode"/>
+          <w:color w:val="000000"/>
+          <w:lang w:val="en"/>
+        </w:rPr>
+        <w:t>git commit -m "Fix zero-stock dark store allocation. Fixes #1"</w:t>
+      </w:r>
+      <w:r>
+        <w:rPr>
+          <w:color w:val="000000"/>
+          <w:sz w:val="22"/>
+          <w:szCs w:val="22"/>
+          <w:lang w:val="en"/>
+        </w:rPr>
+        <w:t xml:space="preserve"> and pushes to </w:t>
+      </w:r>
+      <w:r>
+        <w:rPr>
+          <w:rStyle w:val="HTMLCode"/>
+          <w:color w:val="000000"/>
+          <w:lang w:val="en"/>
+        </w:rPr>
+        <w:t>origin/main</w:t>
+      </w:r>
+      <w:r>
+        <w:rPr>
+          <w:color w:val="000000"/>
+          <w:sz w:val="22"/>
+          <w:szCs w:val="22"/>
+          <w:lang w:val="en"/>
+        </w:rPr>
+        <w:t xml:space="preserve">. The GitHub Actions CI/CD pipeline triggers immediately, runs 9 automated </w:t>
+      </w:r>
+      <w:r>
+        <w:rPr>
+          <w:rStyle w:val="HTMLCode"/>
+          <w:color w:val="000000"/>
+          <w:lang w:val="en"/>
+        </w:rPr>
+        <w:t>pytest</w:t>
+      </w:r>
+      <w:r>
+        <w:rPr>
+          <w:color w:val="000000"/>
+          <w:sz w:val="22"/>
+          <w:szCs w:val="22"/>
+          <w:lang w:val="en"/>
+        </w:rPr>
+        <w:t xml:space="preserve"> </w:t>
+      </w:r>
+      <w:r>
+        <w:rPr>
+          <w:color w:val="000000"/>
+          <w:sz w:val="22"/>
+          <w:szCs w:val="22"/>
+          <w:lang w:val="en"/>
+        </w:rPr>
+        <w:t xml:space="preserve">unit regression tests in 0.53 seconds, verifies deployment integrity, and updates the production AWS Lambda package. GitHub automatically links the verified commit SHA and transitions Issue #1 from </w:t>
+      </w:r>
+      <w:r>
+        <w:rPr>
+          <w:rStyle w:val="Strong"/>
+          <w:color w:val="000000"/>
+          <w:sz w:val="22"/>
+          <w:szCs w:val="22"/>
+          <w:lang w:val="en"/>
+        </w:rPr>
+        <w:t>Open</w:t>
+      </w:r>
+      <w:r>
+        <w:rPr>
+          <w:color w:val="000000"/>
+          <w:sz w:val="22"/>
+          <w:szCs w:val="22"/>
+          <w:lang w:val="en"/>
+        </w:rPr>
+        <w:t xml:space="preserve"> to </w:t>
+      </w:r>
+      <w:r>
+        <w:rPr>
+          <w:rStyle w:val="Strong"/>
+          <w:color w:val="000000"/>
+          <w:sz w:val="22"/>
+          <w:szCs w:val="22"/>
+          <w:lang w:val="en"/>
+        </w:rPr>
+        <w:t>Closed (Done)</w:t>
+      </w:r>
+      <w:r>
+        <w:rPr>
+          <w:color w:val="000000"/>
+          <w:sz w:val="22"/>
+          <w:szCs w:val="22"/>
+          <w:lang w:val="en"/>
+        </w:rPr>
+        <w:t xml:space="preserve"> without manual intervention. </w:t>
+      </w:r>
+    </w:p>
+    <w:p>
+      <w:pPr>
+        <w:jc w:val="center"/>
+        <w:divId w:val="534583517"/>
+        <w:rPr>
+          <w:rFonts w:eastAsia="Times New Roman"/>
+          <w:color w:val="000000"/>
+          <w:sz w:val="22"/>
+          <w:szCs w:val="22"/>
+          <w:lang w:val="en"/>
+        </w:rPr>
+      </w:pPr>
+      <w:r>
+        <w:rPr>
+          <w:rFonts w:eastAsia="Times New Roman"/>
+          <w:noProof/>
+          <w:color w:val="000000"/>
+          <w:sz w:val="22"/>
+          <w:szCs w:val="22"/>
+          <w:lang w:val="en"/>
+        </w:rPr>
+        <w:drawing>
+          <wp:inline distT="0" distB="0" distL="0" distR="0" wp14:anchorId="468086D5" wp14:editId="4BC16B93">
+            <wp:extent cx="5715000" cy="5715000"/>
+            <wp:effectExtent l="0" t="0" r="0" b="0"/>
+            <wp:docPr id="8" name="Picture 8" descr="GitHub Actions CI/CD Green Run and Automated Rollout"/>
+            <wp:cNvGraphicFramePr>
+              <a:graphicFrameLocks xmlns:a="http://schemas.openxmlformats.org/drawingml/2006/main" noChangeAspect="1"/>
+            </wp:cNvGraphicFramePr>
+            <a:graphic xmlns:a="http://schemas.openxmlformats.org/drawingml/2006/main">
+              <a:graphicData uri="http://schemas.openxmlformats.org/drawingml/2006/picture">
+                <pic:pic xmlns:pic="http://schemas.openxmlformats.org/drawingml/2006/picture">
+                  <pic:nvPicPr>
+                    <pic:cNvPr id="0" name="Picture 8" descr="GitHub Actions CI/CD Green Run and Automated Rollout"/>
+                    <pic:cNvPicPr>
+                      <a:picLocks noChangeAspect="1" noChangeArrowheads="1"/>
+                    </pic:cNvPicPr>
+                  </pic:nvPicPr>
+                  <pic:blipFill>
+                    <a:blip r:link="rId12">
+                      <a:extLst>
+                        <a:ext uri="{28A0092B-C50C-407E-A947-70E740481C1C}">
+                          <a14:useLocalDpi xmlns:a14="http://schemas.microsoft.com/office/drawing/2010/main" val="0"/>
+                        </a:ext>
+                      </a:extLst>
+                    </a:blip>
+                    <a:srcRect/>
+                    <a:stretch>
+                      <a:fillRect/>
+                    </a:stretch>
+                  </pic:blipFill>
+                  <pic:spPr bwMode="auto">
+                    <a:xfrm>
+                      <a:off x="0" y="0"/>
+                      <a:ext cx="5715000" cy="5715000"/>
+                    </a:xfrm>
+                    <a:prstGeom prst="rect">
+                      <a:avLst/>
+                    </a:prstGeom>
+                    <a:noFill/>
+                    <a:ln>
+                      <a:noFill/>
+                    </a:ln>
+                  </pic:spPr>
+                </pic:pic>
+              </a:graphicData>
+            </a:graphic>
+          </wp:inline>
+        </w:drawing>
+      </w:r>
+    </w:p>
+    <w:p>
+      <w:pPr>
+        <w:jc w:val="center"/>
+        <w:divId w:val="1494948092"/>
+        <w:rPr>
+          <w:rFonts w:eastAsia="Times New Roman"/>
+          <w:b/>
+          <w:bCs/>
+          <w:color w:val="000000"/>
           <w:sz w:val="19"/>
           <w:szCs w:val="19"/>
           <w:lang w:val="en"/>
         </w:rPr>
-        <w:br/>
-        <w:t xml:space="preserve">- Capture the slide-out modal drawer stating: </w:t>
-      </w:r>
-      <w:r>
-        <w:rPr>
-          <w:rStyle w:val="Emphasis"/>
-          <w:rFonts w:ascii="Arial" w:eastAsia="Times New Roman" w:hAnsi="Arial" w:cs="Arial"/>
-          <w:color w:val="333333"/>
+      </w:pPr>
+      <w:r>
+        <w:rPr>
+          <w:rFonts w:eastAsia="Times New Roman"/>
+          <w:b/>
+          <w:bCs/>
+          <w:color w:val="000000"/>
           <w:sz w:val="19"/>
           <w:szCs w:val="19"/>
           <w:lang w:val="en"/>
         </w:rPr>
-        <w:t>"Item Not Deliverable to Your Location: OnePlus 11R 5G is currently not deliverable to your selected address (VIT Vellore Campus) because stock is depleted at your nearest fulfillment dark store."</w:t>
-      </w:r>
-      <w:r>
+        <w:t>Figure 8: Automated Regression Testing Passing in GitHub Actions and Zero-Touch Issue Closure</w:t>
+      </w:r>
+    </w:p>
+    <w:p>
+      <w:pPr>
+        <w:shd w:val="clear" w:color="auto" w:fill="F9F9F9"/>
+        <w:divId w:val="2060935723"/>
         <w:rPr>
           <w:rFonts w:ascii="Arial" w:eastAsia="Times New Roman" w:hAnsi="Arial" w:cs="Arial"/>
-          <w:color w:val="333333"/>
+          <w:color w:val="000000"/>
           <w:sz w:val="19"/>
           <w:szCs w:val="19"/>
           <w:lang w:val="en"/>
         </w:rPr>
-        <w:br/>
-        <w:t xml:space="preserve">- Paste the screenshot in this box. </w:t>
-      </w:r>
-    </w:p>
-    <w:p>
-      <w:pPr>
-        <w:jc w:val="center"/>
-        <w:divId w:val="622729091"/>
-        <w:rPr>
-          <w:rFonts w:eastAsia="Times New Roman"/>
-          <w:b/>
-          <w:bCs/>
+      </w:pPr>
+      <w:r>
+        <w:rPr>
+          <w:rStyle w:val="Strong"/>
+          <w:rFonts w:ascii="Arial" w:eastAsia="Times New Roman" w:hAnsi="Arial" w:cs="Arial"/>
           <w:color w:val="000000"/>
           <w:sz w:val="19"/>
           <w:szCs w:val="19"/>
           <w:lang w:val="en"/>
         </w:rPr>
-      </w:pPr>
-      <w:r>
-        <w:rPr>
-          <w:rFonts w:eastAsia="Times New Roman"/>
-          <w:b/>
-          <w:bCs/>
+        <w:t>Technical Assessment:</w:t>
+      </w:r>
+      <w:r>
+        <w:rPr>
+          <w:rFonts w:ascii="Arial" w:eastAsia="Times New Roman" w:hAnsi="Arial" w:cs="Arial"/>
           <w:color w:val="000000"/>
           <w:sz w:val="19"/>
           <w:szCs w:val="19"/>
           <w:lang w:val="en"/>
         </w:rPr>
-        <w:t>Figure 3: Graceful Frontend Stockout Exception Interception and Customer Waitlist Drawer</w:t>
-      </w:r>
-    </w:p>
-    <w:p>
-      <w:pPr>
-        <w:pStyle w:val="Heading3"/>
-        <w:rPr>
-          <w:rFonts w:eastAsia="Times New Roman"/>
-          <w:color w:val="000000"/>
-          <w:lang w:val="en"/>
-        </w:rPr>
-      </w:pPr>
-      <w:r>
-        <w:rPr>
-          <w:rFonts w:eastAsia="Times New Roman"/>
-          <w:color w:val="000000"/>
-          <w:lang w:val="en"/>
-        </w:rPr>
-        <w:t>Step 3: Unhandled Backend ZeroDivisionError Server Crash in AWS CloudWatch</w:t>
-      </w:r>
-    </w:p>
-    <w:p>
-      <w:pPr>
-        <w:pStyle w:val="NormalWeb"/>
-        <w:rPr>
-          <w:color w:val="000000"/>
-          <w:sz w:val="22"/>
-          <w:szCs w:val="22"/>
-          <w:lang w:val="en"/>
-        </w:rPr>
-      </w:pPr>
-      <w:r>
-        <w:rPr>
-          <w:color w:val="000000"/>
-          <w:sz w:val="22"/>
-          <w:szCs w:val="22"/>
-          <w:lang w:val="en"/>
-        </w:rPr>
-        <w:t xml:space="preserve">While the customer receives a polite, friendly stockout drawer, the underlying backend microservice encountered an unhandled fatal calculation error. In </w:t>
-      </w:r>
-      <w:r>
-        <w:rPr>
-          <w:rStyle w:val="HTMLCode"/>
-          <w:color w:val="000000"/>
-          <w:lang w:val="en"/>
-        </w:rPr>
-        <w:t>app/app.py</w:t>
-      </w:r>
-      <w:r>
-        <w:rPr>
-          <w:color w:val="000000"/>
-          <w:sz w:val="22"/>
-          <w:szCs w:val="22"/>
-          <w:lang w:val="en"/>
-        </w:rPr>
-        <w:t xml:space="preserve">, the legacy dark-store delivery routing algorithm calculates promotional warehouse allocation ratios: </w:t>
-      </w:r>
-    </w:p>
-    <w:p>
-      <w:pPr>
-        <w:pStyle w:val="HTMLPreformatted"/>
-        <w:rPr>
-          <w:color w:val="000000"/>
-          <w:lang w:val="en"/>
-        </w:rPr>
-      </w:pPr>
-    </w:p>
-    <w:p>
-      <w:pPr>
-        <w:pStyle w:val="HTMLPreformatted"/>
-        <w:rPr>
-          <w:color w:val="000000"/>
-          <w:lang w:val="en"/>
-        </w:rPr>
-      </w:pPr>
-      <w:r>
-        <w:rPr>
-          <w:color w:val="000000"/>
-          <w:lang w:val="en"/>
-        </w:rPr>
-        <w:t># app/app.py - Unhandled Promotional Calculation Routine</w:t>
-      </w:r>
-    </w:p>
-    <w:p>
-      <w:pPr>
-        <w:pStyle w:val="HTMLPreformatted"/>
-        <w:rPr>
-          <w:color w:val="000000"/>
-          <w:lang w:val="en"/>
-        </w:rPr>
-      </w:pPr>
-      <w:r>
-        <w:rPr>
-          <w:color w:val="000000"/>
-          <w:lang w:val="en"/>
-        </w:rPr>
-        <w:t>if product["stock"] &lt;= 0:</w:t>
-      </w:r>
-    </w:p>
-    <w:p>
-      <w:pPr>
-        <w:pStyle w:val="HTMLPreformatted"/>
-        <w:rPr>
-          <w:color w:val="000000"/>
-          <w:lang w:val="en"/>
-        </w:rPr>
-      </w:pPr>
-      <w:r>
-        <w:rPr>
-          <w:color w:val="000000"/>
-          <w:lang w:val="en"/>
-        </w:rPr>
-        <w:t xml:space="preserve">    logger.error(f"[CRITICAL_ALERT] Incident simulation triggered! Item '{product['name']}' has stock=0")</w:t>
-      </w:r>
-    </w:p>
-    <w:p>
-      <w:pPr>
-        <w:pStyle w:val="HTMLPreformatted"/>
-        <w:rPr>
-          <w:color w:val="000000"/>
-          <w:lang w:val="en"/>
-        </w:rPr>
-      </w:pPr>
-      <w:r>
-        <w:rPr>
-          <w:color w:val="000000"/>
-          <w:lang w:val="en"/>
-        </w:rPr>
-        <w:t xml:space="preserve">    </w:t>
-      </w:r>
-      <w:r>
-        <w:rPr>
-          <w:color w:val="000000"/>
-          <w:lang w:val="en"/>
-        </w:rPr>
-        <w:t>logger.error("[EXCEPTION] Unhandled ZeroDivisionError in delivery routing worker: allocation = 100 / stock")</w:t>
-      </w:r>
-    </w:p>
-    <w:p>
-      <w:pPr>
-        <w:pStyle w:val="HTMLPreformatted"/>
-        <w:rPr>
-          <w:color w:val="000000"/>
-          <w:lang w:val="en"/>
-        </w:rPr>
-      </w:pPr>
-      <w:r>
-        <w:rPr>
-          <w:color w:val="000000"/>
-          <w:lang w:val="en"/>
-        </w:rPr>
-        <w:t xml:space="preserve">    _ = 100 / product["stock"]  # Crashes with HTTP 500 ZeroDivisionError!</w:t>
-      </w:r>
-    </w:p>
-    <w:p>
-      <w:pPr>
-        <w:pStyle w:val="NormalWeb"/>
-        <w:rPr>
-          <w:color w:val="000000"/>
-          <w:sz w:val="22"/>
-          <w:szCs w:val="22"/>
-          <w:lang w:val="en"/>
-        </w:rPr>
-      </w:pPr>
-      <w:r>
-        <w:rPr>
-          <w:color w:val="000000"/>
-          <w:sz w:val="22"/>
-          <w:szCs w:val="22"/>
-          <w:lang w:val="en"/>
-        </w:rPr>
-        <w:t xml:space="preserve">Because </w:t>
-      </w:r>
-      <w:r>
-        <w:rPr>
-          <w:rStyle w:val="HTMLCode"/>
-          <w:color w:val="000000"/>
-          <w:lang w:val="en"/>
-        </w:rPr>
-        <w:t>product["stock"] == 0</w:t>
-      </w:r>
-      <w:r>
-        <w:rPr>
-          <w:color w:val="000000"/>
-          <w:sz w:val="22"/>
-          <w:szCs w:val="22"/>
-          <w:lang w:val="en"/>
-        </w:rPr>
-        <w:t xml:space="preserve">, the Python interpreter immediately throws an unhandled </w:t>
-      </w:r>
-      <w:r>
-        <w:rPr>
-          <w:rStyle w:val="HTMLCode"/>
-          <w:color w:val="000000"/>
-          <w:lang w:val="en"/>
-        </w:rPr>
-        <w:t>ZeroDivisionError: division by zero</w:t>
-      </w:r>
-      <w:r>
-        <w:rPr>
-          <w:color w:val="000000"/>
-          <w:sz w:val="22"/>
-          <w:szCs w:val="22"/>
-          <w:lang w:val="en"/>
-        </w:rPr>
-        <w:t xml:space="preserve">, crashing the worker thread with an HTTP 500 status code and emitting structured forensic logs to standard output. </w:t>
-      </w:r>
-    </w:p>
-    <w:p>
-      <w:pPr>
-        <w:shd w:val="clear" w:color="auto" w:fill="FAFAFA"/>
-        <w:jc w:val="center"/>
-        <w:divId w:val="196353033"/>
-        <w:rPr>
-          <w:rFonts w:eastAsia="Times New Roman"/>
-          <w:b/>
-          <w:bCs/>
-          <w:caps/>
-          <w:color w:val="000000"/>
-          <w:sz w:val="22"/>
-          <w:szCs w:val="22"/>
-          <w:lang w:val="en"/>
-        </w:rPr>
-      </w:pPr>
-      <w:r>
-        <w:rPr>
-          <w:rFonts w:eastAsia="Times New Roman"/>
-          <w:b/>
-          <w:bCs/>
-          <w:caps/>
-          <w:color w:val="000000"/>
-          <w:sz w:val="22"/>
-          <w:szCs w:val="22"/>
-          <w:lang w:val="en"/>
-        </w:rPr>
-        <w:t>[PASTE SNAPSHOT 3: BACKEND SERVER RUNTIME CRASH &amp; STACK TRACE]</w:t>
-      </w:r>
-    </w:p>
-    <w:p>
-      <w:pPr>
-        <w:shd w:val="clear" w:color="auto" w:fill="FFFFFF"/>
-        <w:divId w:val="457257538"/>
-        <w:rPr>
-          <w:rFonts w:ascii="Arial" w:eastAsia="Times New Roman" w:hAnsi="Arial" w:cs="Arial"/>
-          <w:color w:val="333333"/>
-          <w:sz w:val="19"/>
-          <w:szCs w:val="19"/>
-          <w:lang w:val="en"/>
-        </w:rPr>
-      </w:pPr>
-      <w:r>
-        <w:rPr>
-          <w:rStyle w:val="Strong"/>
-          <w:rFonts w:ascii="Arial" w:eastAsia="Times New Roman" w:hAnsi="Arial" w:cs="Arial"/>
-          <w:color w:val="333333"/>
-          <w:sz w:val="19"/>
-          <w:szCs w:val="19"/>
-          <w:lang w:val="en"/>
-        </w:rPr>
-        <w:t>HOW TO CAPTURE:</w:t>
-      </w:r>
-      <w:r>
-        <w:rPr>
-          <w:rFonts w:ascii="Arial" w:eastAsia="Times New Roman" w:hAnsi="Arial" w:cs="Arial"/>
-          <w:color w:val="333333"/>
-          <w:sz w:val="19"/>
-          <w:szCs w:val="19"/>
-          <w:lang w:val="en"/>
-        </w:rPr>
-        <w:br/>
-      </w:r>
-      <w:r>
-        <w:rPr>
-          <w:rFonts w:ascii="Arial" w:eastAsia="Times New Roman" w:hAnsi="Arial" w:cs="Arial"/>
-          <w:color w:val="333333"/>
-          <w:sz w:val="19"/>
-          <w:szCs w:val="19"/>
-          <w:lang w:val="en"/>
-        </w:rPr>
-        <w:t>- Open your PowerShell terminal running the application or inspect AWS CloudWatch Log Streams.</w:t>
-      </w:r>
-      <w:r>
-        <w:rPr>
-          <w:rFonts w:ascii="Arial" w:eastAsia="Times New Roman" w:hAnsi="Arial" w:cs="Arial"/>
-          <w:color w:val="333333"/>
-          <w:sz w:val="19"/>
-          <w:szCs w:val="19"/>
-          <w:lang w:val="en"/>
-        </w:rPr>
-        <w:br/>
-        <w:t>- Locate the lines showing:</w:t>
-      </w:r>
-      <w:r>
-        <w:rPr>
-          <w:rFonts w:ascii="Arial" w:eastAsia="Times New Roman" w:hAnsi="Arial" w:cs="Arial"/>
-          <w:color w:val="333333"/>
-          <w:sz w:val="19"/>
-          <w:szCs w:val="19"/>
-          <w:lang w:val="en"/>
-        </w:rPr>
-        <w:br/>
-      </w:r>
-      <w:r>
-        <w:rPr>
-          <w:rStyle w:val="HTMLCode"/>
-          <w:color w:val="333333"/>
-          <w:lang w:val="en"/>
-        </w:rPr>
-        <w:t>[CRITICAL_ALERT] Incident simulation triggered! Item 'OnePlus 11R 5G' has stock=0</w:t>
-      </w:r>
-      <w:r>
-        <w:rPr>
-          <w:rFonts w:ascii="Arial" w:eastAsia="Times New Roman" w:hAnsi="Arial" w:cs="Arial"/>
-          <w:color w:val="333333"/>
-          <w:sz w:val="19"/>
-          <w:szCs w:val="19"/>
-          <w:lang w:val="en"/>
-        </w:rPr>
-        <w:br/>
-      </w:r>
-      <w:r>
-        <w:rPr>
-          <w:rStyle w:val="HTMLCode"/>
-          <w:color w:val="333333"/>
-          <w:lang w:val="en"/>
-        </w:rPr>
-        <w:t>Traceback (most recent call last): line 119, in checkout: _ = 100 / product["stock"]</w:t>
-      </w:r>
-      <w:r>
-        <w:rPr>
-          <w:rFonts w:ascii="Arial" w:eastAsia="Times New Roman" w:hAnsi="Arial" w:cs="Arial"/>
-          <w:color w:val="333333"/>
-          <w:sz w:val="19"/>
-          <w:szCs w:val="19"/>
-          <w:lang w:val="en"/>
-        </w:rPr>
-        <w:br/>
-      </w:r>
-      <w:r>
-        <w:rPr>
-          <w:rStyle w:val="HTMLCode"/>
-          <w:color w:val="333333"/>
-          <w:lang w:val="en"/>
-        </w:rPr>
-        <w:t>ZeroDivisionError: division by zero</w:t>
-      </w:r>
-      <w:r>
-        <w:rPr>
-          <w:rFonts w:ascii="Arial" w:eastAsia="Times New Roman" w:hAnsi="Arial" w:cs="Arial"/>
-          <w:color w:val="333333"/>
-          <w:sz w:val="19"/>
-          <w:szCs w:val="19"/>
-          <w:lang w:val="en"/>
-        </w:rPr>
-        <w:br/>
-        <w:t xml:space="preserve">- Capture the terminal output and paste it in this box. </w:t>
-      </w:r>
-    </w:p>
-    <w:p>
-      <w:pPr>
-        <w:jc w:val="center"/>
-        <w:divId w:val="2091191352"/>
-        <w:rPr>
-          <w:rFonts w:eastAsia="Times New Roman"/>
-          <w:b/>
-          <w:bCs/>
-          <w:color w:val="000000"/>
-          <w:sz w:val="19"/>
-          <w:szCs w:val="19"/>
-          <w:lang w:val="en"/>
-        </w:rPr>
-      </w:pPr>
-      <w:r>
-        <w:rPr>
-          <w:rFonts w:eastAsia="Times New Roman"/>
-          <w:b/>
-          <w:bCs/>
-          <w:color w:val="000000"/>
-          <w:sz w:val="19"/>
-          <w:szCs w:val="19"/>
-          <w:lang w:val="en"/>
-        </w:rPr>
-        <w:t>Figure 4: Unhandled Backend ZeroDivisionError Stack Trace Emitted to AWS CloudWatch Standard Output</w:t>
-      </w:r>
-    </w:p>
-    <w:p>
-      <w:pPr>
-        <w:pStyle w:val="Heading3"/>
-        <w:rPr>
-          <w:rFonts w:eastAsia="Times New Roman"/>
-          <w:color w:val="000000"/>
-          <w:lang w:val="en"/>
-        </w:rPr>
-      </w:pPr>
-      <w:r>
-        <w:rPr>
-          <w:rFonts w:eastAsia="Times New Roman"/>
-          <w:color w:val="000000"/>
-          <w:lang w:val="en"/>
-        </w:rPr>
-        <w:t>Step 4: AWS CloudWatch Metric Filter Pattern Matching &amp; Incident Ingestion</w:t>
-      </w:r>
-    </w:p>
-    <w:p>
-      <w:pPr>
-        <w:pStyle w:val="NormalWeb"/>
-        <w:rPr>
-          <w:color w:val="000000"/>
-          <w:sz w:val="22"/>
-          <w:szCs w:val="22"/>
-          <w:lang w:val="en"/>
-        </w:rPr>
-      </w:pPr>
-      <w:r>
-        <w:rPr>
-          <w:color w:val="000000"/>
-          <w:sz w:val="22"/>
-          <w:szCs w:val="22"/>
-          <w:lang w:val="en"/>
-        </w:rPr>
-        <w:t xml:space="preserve">In the AWS cloud environment, Amazon CloudWatch Logs continuously monitors the log group </w:t>
-      </w:r>
-      <w:r>
-        <w:rPr>
-          <w:rStyle w:val="HTMLCode"/>
-          <w:color w:val="000000"/>
-          <w:lang w:val="en"/>
-        </w:rPr>
-        <w:t>/aws/lambda/watchdog-target-app</w:t>
-      </w:r>
-      <w:r>
-        <w:rPr>
-          <w:color w:val="000000"/>
-          <w:sz w:val="22"/>
-          <w:szCs w:val="22"/>
-          <w:lang w:val="en"/>
-        </w:rPr>
-        <w:t xml:space="preserve">. A Metric Filter with pattern </w:t>
-      </w:r>
-      <w:r>
-        <w:rPr>
-          <w:rStyle w:val="HTMLCode"/>
-          <w:color w:val="000000"/>
-          <w:lang w:val="en"/>
-        </w:rPr>
-        <w:t>[CRITICAL_ALERT]</w:t>
-      </w:r>
-      <w:r>
-        <w:rPr>
-          <w:color w:val="000000"/>
-          <w:sz w:val="22"/>
-          <w:szCs w:val="22"/>
-          <w:lang w:val="en"/>
-        </w:rPr>
-        <w:t xml:space="preserve"> detects the incident instantaneously without requiring human log analysis. The filter fires an AWS CloudWatch Alarm, shifting state to </w:t>
-      </w:r>
-      <w:r>
-        <w:rPr>
-          <w:rStyle w:val="HTMLCode"/>
-          <w:color w:val="000000"/>
-          <w:lang w:val="en"/>
-        </w:rPr>
-        <w:t>ALARM</w:t>
-      </w:r>
-      <w:r>
-        <w:rPr>
-          <w:color w:val="000000"/>
-          <w:sz w:val="22"/>
-          <w:szCs w:val="22"/>
-          <w:lang w:val="en"/>
-        </w:rPr>
-        <w:t xml:space="preserve"> and executing an asynchronous trigger. </w:t>
-      </w:r>
-    </w:p>
-    <w:p>
-      <w:pPr>
-        <w:shd w:val="clear" w:color="auto" w:fill="FAFAFA"/>
-        <w:jc w:val="center"/>
-        <w:divId w:val="1118910349"/>
-        <w:rPr>
-          <w:rFonts w:eastAsia="Times New Roman"/>
-          <w:b/>
-          <w:bCs/>
-          <w:caps/>
-          <w:color w:val="000000"/>
-          <w:sz w:val="22"/>
-          <w:szCs w:val="22"/>
-          <w:lang w:val="en"/>
-        </w:rPr>
-      </w:pPr>
-      <w:r>
-        <w:rPr>
-          <w:rFonts w:eastAsia="Times New Roman"/>
-          <w:b/>
-          <w:bCs/>
-          <w:caps/>
-          <w:color w:val="000000"/>
-          <w:sz w:val="22"/>
-          <w:szCs w:val="22"/>
-          <w:lang w:val="en"/>
-        </w:rPr>
-        <w:t>[PASTE SNAPSHOT 4: SRE DASHBOARD &amp; CLOUDWATCH INCIDENT TELEMETRY]</w:t>
-      </w:r>
-    </w:p>
-    <w:p>
-      <w:pPr>
-        <w:shd w:val="clear" w:color="auto" w:fill="FFFFFF"/>
-        <w:divId w:val="630330955"/>
-        <w:rPr>
-          <w:rFonts w:ascii="Arial" w:eastAsia="Times New Roman" w:hAnsi="Arial" w:cs="Arial"/>
-          <w:color w:val="333333"/>
-          <w:sz w:val="19"/>
-          <w:szCs w:val="19"/>
-          <w:lang w:val="en"/>
-        </w:rPr>
-      </w:pPr>
-      <w:r>
-        <w:rPr>
-          <w:rStyle w:val="Strong"/>
-          <w:rFonts w:ascii="Arial" w:eastAsia="Times New Roman" w:hAnsi="Arial" w:cs="Arial"/>
-          <w:color w:val="333333"/>
-          <w:sz w:val="19"/>
-          <w:szCs w:val="19"/>
-          <w:lang w:val="en"/>
-        </w:rPr>
-        <w:t>HOW TO CAPTURE:</w:t>
-      </w:r>
-      <w:r>
-        <w:rPr>
-          <w:rFonts w:ascii="Arial" w:eastAsia="Times New Roman" w:hAnsi="Arial" w:cs="Arial"/>
-          <w:color w:val="333333"/>
-          <w:sz w:val="19"/>
-          <w:szCs w:val="19"/>
-          <w:lang w:val="en"/>
-        </w:rPr>
-        <w:br/>
-      </w:r>
-      <w:r>
-        <w:rPr>
-          <w:rFonts w:ascii="Arial" w:eastAsia="Times New Roman" w:hAnsi="Arial" w:cs="Arial"/>
-          <w:color w:val="333333"/>
-          <w:sz w:val="19"/>
-          <w:szCs w:val="19"/>
-          <w:lang w:val="en"/>
-        </w:rPr>
-        <w:t xml:space="preserve">- At the top of </w:t>
-      </w:r>
-      <w:r>
-        <w:rPr>
-          <w:rStyle w:val="HTMLCode"/>
-          <w:color w:val="333333"/>
-          <w:lang w:val="en"/>
-        </w:rPr>
-        <w:t>http://127.0.0.1:5000/</w:t>
-      </w:r>
-      <w:r>
-        <w:rPr>
-          <w:rFonts w:ascii="Arial" w:eastAsia="Times New Roman" w:hAnsi="Arial" w:cs="Arial"/>
-          <w:color w:val="333333"/>
-          <w:sz w:val="19"/>
-          <w:szCs w:val="19"/>
-          <w:lang w:val="en"/>
-        </w:rPr>
-        <w:t xml:space="preserve">, click </w:t>
-      </w:r>
-      <w:r>
-        <w:rPr>
-          <w:rStyle w:val="Strong"/>
-          <w:rFonts w:ascii="Arial" w:eastAsia="Times New Roman" w:hAnsi="Arial" w:cs="Arial"/>
-          <w:color w:val="333333"/>
-          <w:sz w:val="19"/>
-          <w:szCs w:val="19"/>
-          <w:lang w:val="en"/>
-        </w:rPr>
-        <w:t>"2. Developer &amp; SRE Backstage"</w:t>
-      </w:r>
-      <w:r>
-        <w:rPr>
-          <w:rFonts w:ascii="Arial" w:eastAsia="Times New Roman" w:hAnsi="Arial" w:cs="Arial"/>
-          <w:color w:val="333333"/>
-          <w:sz w:val="19"/>
-          <w:szCs w:val="19"/>
-          <w:lang w:val="en"/>
-        </w:rPr>
-        <w:t>.</w:t>
-      </w:r>
-      <w:r>
-        <w:rPr>
-          <w:rFonts w:ascii="Arial" w:eastAsia="Times New Roman" w:hAnsi="Arial" w:cs="Arial"/>
-          <w:color w:val="333333"/>
-          <w:sz w:val="19"/>
-          <w:szCs w:val="19"/>
-          <w:lang w:val="en"/>
-        </w:rPr>
-        <w:br/>
-        <w:t>- Capture the telemetry dashboard showing Cloud Monitoring active status, the critical incident notification badge, and the real-time AWS CloudWatch log viewer.</w:t>
-      </w:r>
-      <w:r>
-        <w:rPr>
-          <w:rFonts w:ascii="Arial" w:eastAsia="Times New Roman" w:hAnsi="Arial" w:cs="Arial"/>
-          <w:color w:val="333333"/>
-          <w:sz w:val="19"/>
-          <w:szCs w:val="19"/>
-          <w:lang w:val="en"/>
-        </w:rPr>
-        <w:br/>
-        <w:t xml:space="preserve">- (Alternatively: Capture AWS CloudWatch Console &gt; Log groups &gt; </w:t>
-      </w:r>
-      <w:r>
-        <w:rPr>
-          <w:rStyle w:val="HTMLCode"/>
-          <w:color w:val="333333"/>
-          <w:lang w:val="en"/>
-        </w:rPr>
-        <w:t>/aws/lambda/watchdog-target-app</w:t>
-      </w:r>
-      <w:r>
-        <w:rPr>
-          <w:rFonts w:ascii="Arial" w:eastAsia="Times New Roman" w:hAnsi="Arial" w:cs="Arial"/>
-          <w:color w:val="333333"/>
-          <w:sz w:val="19"/>
-          <w:szCs w:val="19"/>
-          <w:lang w:val="en"/>
-        </w:rPr>
-        <w:t>).</w:t>
-      </w:r>
-      <w:r>
-        <w:rPr>
-          <w:rFonts w:ascii="Arial" w:eastAsia="Times New Roman" w:hAnsi="Arial" w:cs="Arial"/>
-          <w:color w:val="333333"/>
-          <w:sz w:val="19"/>
-          <w:szCs w:val="19"/>
-          <w:lang w:val="en"/>
-        </w:rPr>
-        <w:br/>
-        <w:t xml:space="preserve">- Paste the screenshot in this box. </w:t>
-      </w:r>
-    </w:p>
-    <w:p>
-      <w:pPr>
-        <w:jc w:val="center"/>
-        <w:divId w:val="1101334080"/>
-        <w:rPr>
-          <w:rFonts w:eastAsia="Times New Roman"/>
-          <w:b/>
-          <w:bCs/>
-          <w:color w:val="000000"/>
-          <w:sz w:val="19"/>
-          <w:szCs w:val="19"/>
-          <w:lang w:val="en"/>
-        </w:rPr>
-      </w:pPr>
-      <w:r>
-        <w:rPr>
-          <w:rFonts w:eastAsia="Times New Roman"/>
-          <w:b/>
-          <w:bCs/>
-          <w:color w:val="000000"/>
-          <w:sz w:val="19"/>
-          <w:szCs w:val="19"/>
-          <w:lang w:val="en"/>
-        </w:rPr>
-        <w:t>Figure 5: SRE Backstage Console Displaying Live CloudWatch Telemetry and Active Incident Alert</w:t>
-      </w:r>
-    </w:p>
-    <w:p>
-      <w:pPr>
-        <w:pStyle w:val="Heading3"/>
-        <w:rPr>
-          <w:rFonts w:eastAsia="Times New Roman"/>
-          <w:color w:val="000000"/>
-          <w:lang w:val="en"/>
-        </w:rPr>
-      </w:pPr>
-      <w:r>
-        <w:rPr>
-          <w:rFonts w:eastAsia="Times New Roman"/>
-          <w:color w:val="000000"/>
-          <w:lang w:val="en"/>
-        </w:rPr>
-        <w:t xml:space="preserve">Step 5: Watchdog Serverless Orchestrator &amp; </w:t>
-      </w:r>
-      <w:r>
-        <w:rPr>
-          <w:rFonts w:eastAsia="Times New Roman"/>
-          <w:color w:val="000000"/>
-          <w:lang w:val="en"/>
-        </w:rPr>
-        <w:t>Forensic S3 Evidence Vault Storage</w:t>
-      </w:r>
-    </w:p>
-    <w:p>
-      <w:pPr>
-        <w:pStyle w:val="NormalWeb"/>
-        <w:rPr>
-          <w:color w:val="000000"/>
-          <w:sz w:val="22"/>
-          <w:szCs w:val="22"/>
-          <w:lang w:val="en"/>
-        </w:rPr>
-      </w:pPr>
-      <w:r>
-        <w:rPr>
-          <w:color w:val="000000"/>
-          <w:sz w:val="22"/>
-          <w:szCs w:val="22"/>
-          <w:lang w:val="en"/>
-        </w:rPr>
-        <w:t xml:space="preserve">Upon log pattern matching, Amazon CloudWatch activates the serverless </w:t>
-      </w:r>
-      <w:r>
-        <w:rPr>
-          <w:rStyle w:val="Strong"/>
-          <w:color w:val="000000"/>
-          <w:sz w:val="22"/>
-          <w:szCs w:val="22"/>
-          <w:lang w:val="en"/>
-        </w:rPr>
-        <w:t>AWS Lambda Watchdog</w:t>
-      </w:r>
-      <w:r>
-        <w:rPr>
-          <w:color w:val="000000"/>
-          <w:sz w:val="22"/>
-          <w:szCs w:val="22"/>
-          <w:lang w:val="en"/>
-        </w:rPr>
-        <w:t xml:space="preserve"> (</w:t>
-      </w:r>
-      <w:r>
-        <w:rPr>
-          <w:rStyle w:val="HTMLCode"/>
-          <w:color w:val="000000"/>
-          <w:lang w:val="en"/>
-        </w:rPr>
-        <w:t>watchdog-incident-creator</w:t>
-      </w:r>
-      <w:r>
-        <w:rPr>
-          <w:color w:val="000000"/>
-          <w:sz w:val="22"/>
-          <w:szCs w:val="22"/>
-          <w:lang w:val="en"/>
-        </w:rPr>
-        <w:t xml:space="preserve">). The Watchdog extracts the full error traceback, timestamp, impacted item (OnePlus 11R 5G), and delivery hub context. </w:t>
-      </w:r>
-    </w:p>
-    <w:p>
-      <w:pPr>
-        <w:pStyle w:val="NormalWeb"/>
-        <w:rPr>
-          <w:color w:val="000000"/>
-          <w:sz w:val="22"/>
-          <w:szCs w:val="22"/>
-          <w:lang w:val="en"/>
-        </w:rPr>
-      </w:pPr>
-      <w:r>
-        <w:rPr>
-          <w:color w:val="000000"/>
-          <w:sz w:val="22"/>
-          <w:szCs w:val="22"/>
-          <w:lang w:val="en"/>
-        </w:rPr>
-        <w:t xml:space="preserve">To ensure immutable auditability and prevent log tampering, the Watchdog connects via </w:t>
-      </w:r>
-      <w:r>
-        <w:rPr>
-          <w:rStyle w:val="HTMLCode"/>
-          <w:color w:val="000000"/>
-          <w:lang w:val="en"/>
-        </w:rPr>
-        <w:t>boto3</w:t>
-      </w:r>
-      <w:r>
-        <w:rPr>
-          <w:color w:val="000000"/>
-          <w:sz w:val="22"/>
-          <w:szCs w:val="22"/>
-          <w:lang w:val="en"/>
-        </w:rPr>
-        <w:t xml:space="preserve"> to Amazon Simple Storage Service (S3) and stores a tamper-proof forensic JSON dump in the private S3 bucket </w:t>
-      </w:r>
-      <w:r>
-        <w:rPr>
-          <w:rStyle w:val="HTMLCode"/>
-          <w:color w:val="000000"/>
-          <w:lang w:val="en"/>
-        </w:rPr>
-        <w:t>devops-incident-watchdog-logs-401537512022</w:t>
-      </w:r>
-      <w:r>
-        <w:rPr>
-          <w:color w:val="000000"/>
-          <w:sz w:val="22"/>
-          <w:szCs w:val="22"/>
-          <w:lang w:val="en"/>
-        </w:rPr>
-        <w:t xml:space="preserve"> under the key: </w:t>
-      </w:r>
-      <w:r>
-        <w:rPr>
-          <w:rStyle w:val="HTMLCode"/>
-          <w:color w:val="000000"/>
-          <w:lang w:val="en"/>
-        </w:rPr>
-        <w:t>incidents/2026-10-14/INC-1791945923-07CD12B5.json</w:t>
-      </w:r>
-      <w:r>
-        <w:rPr>
-          <w:color w:val="000000"/>
-          <w:sz w:val="22"/>
-          <w:szCs w:val="22"/>
-          <w:lang w:val="en"/>
-        </w:rPr>
-        <w:t xml:space="preserve"> (369 bytes). </w:t>
-      </w:r>
-    </w:p>
-    <w:p>
-      <w:pPr>
-        <w:shd w:val="clear" w:color="auto" w:fill="FAFAFA"/>
-        <w:jc w:val="center"/>
-        <w:divId w:val="1512060313"/>
-        <w:rPr>
-          <w:rFonts w:eastAsia="Times New Roman"/>
-          <w:b/>
-          <w:bCs/>
-          <w:caps/>
-          <w:color w:val="000000"/>
-          <w:sz w:val="22"/>
-          <w:szCs w:val="22"/>
-          <w:lang w:val="en"/>
-        </w:rPr>
-      </w:pPr>
-      <w:r>
-        <w:rPr>
-          <w:rFonts w:eastAsia="Times New Roman"/>
-          <w:b/>
-          <w:bCs/>
-          <w:caps/>
-          <w:color w:val="000000"/>
-          <w:sz w:val="22"/>
-          <w:szCs w:val="22"/>
-          <w:lang w:val="en"/>
-        </w:rPr>
-        <w:t>[PASTE SNAPSHOT 5: AMAZON S3 CRASH DUMP FORENSIC VAULT]</w:t>
-      </w:r>
-    </w:p>
-    <w:p>
-      <w:pPr>
-        <w:shd w:val="clear" w:color="auto" w:fill="FFFFFF"/>
-        <w:divId w:val="1306274261"/>
-        <w:rPr>
-          <w:rFonts w:ascii="Arial" w:eastAsia="Times New Roman" w:hAnsi="Arial" w:cs="Arial"/>
-          <w:color w:val="333333"/>
-          <w:sz w:val="19"/>
-          <w:szCs w:val="19"/>
-          <w:lang w:val="en"/>
-        </w:rPr>
-      </w:pPr>
-      <w:r>
-        <w:rPr>
-          <w:rStyle w:val="Strong"/>
-          <w:rFonts w:ascii="Arial" w:eastAsia="Times New Roman" w:hAnsi="Arial" w:cs="Arial"/>
-          <w:color w:val="333333"/>
-          <w:sz w:val="19"/>
-          <w:szCs w:val="19"/>
-          <w:lang w:val="en"/>
-        </w:rPr>
-        <w:t>HOW TO CAPTURE:</w:t>
-      </w:r>
-      <w:r>
-        <w:rPr>
-          <w:rFonts w:ascii="Arial" w:eastAsia="Times New Roman" w:hAnsi="Arial" w:cs="Arial"/>
-          <w:color w:val="333333"/>
-          <w:sz w:val="19"/>
-          <w:szCs w:val="19"/>
-          <w:lang w:val="en"/>
-        </w:rPr>
-        <w:br/>
-        <w:t>- Open AWS Management Console &gt; Amazon S3.</w:t>
-      </w:r>
-      <w:r>
-        <w:rPr>
-          <w:rFonts w:ascii="Arial" w:eastAsia="Times New Roman" w:hAnsi="Arial" w:cs="Arial"/>
-          <w:color w:val="333333"/>
-          <w:sz w:val="19"/>
-          <w:szCs w:val="19"/>
-          <w:lang w:val="en"/>
-        </w:rPr>
-        <w:br/>
-        <w:t xml:space="preserve">- Navigate to bucket: </w:t>
-      </w:r>
-      <w:r>
-        <w:rPr>
-          <w:rStyle w:val="HTMLCode"/>
-          <w:color w:val="333333"/>
-          <w:lang w:val="en"/>
-        </w:rPr>
-        <w:t>devops-incident-watchdog-logs-401537512022</w:t>
-      </w:r>
-      <w:r>
-        <w:rPr>
-          <w:rFonts w:ascii="Arial" w:eastAsia="Times New Roman" w:hAnsi="Arial" w:cs="Arial"/>
-          <w:color w:val="333333"/>
-          <w:sz w:val="19"/>
-          <w:szCs w:val="19"/>
-          <w:lang w:val="en"/>
-        </w:rPr>
-        <w:t xml:space="preserve"> &gt; folder </w:t>
-      </w:r>
-      <w:r>
-        <w:rPr>
-          <w:rStyle w:val="HTMLCode"/>
-          <w:color w:val="333333"/>
-          <w:lang w:val="en"/>
-        </w:rPr>
-        <w:t>incidents/2026-10-14/</w:t>
-      </w:r>
-      <w:r>
-        <w:rPr>
-          <w:rFonts w:ascii="Arial" w:eastAsia="Times New Roman" w:hAnsi="Arial" w:cs="Arial"/>
-          <w:color w:val="333333"/>
-          <w:sz w:val="19"/>
-          <w:szCs w:val="19"/>
-          <w:lang w:val="en"/>
-        </w:rPr>
-        <w:t>.</w:t>
-      </w:r>
-      <w:r>
-        <w:rPr>
-          <w:rFonts w:ascii="Arial" w:eastAsia="Times New Roman" w:hAnsi="Arial" w:cs="Arial"/>
-          <w:color w:val="333333"/>
-          <w:sz w:val="19"/>
-          <w:szCs w:val="19"/>
-          <w:lang w:val="en"/>
-        </w:rPr>
-        <w:br/>
-        <w:t xml:space="preserve">- Capture the screen showing the file </w:t>
-      </w:r>
-      <w:r>
-        <w:rPr>
-          <w:rStyle w:val="HTMLCode"/>
-          <w:color w:val="333333"/>
-          <w:lang w:val="en"/>
-        </w:rPr>
-        <w:t>INC-1791945923-07CD12B5.json</w:t>
-      </w:r>
-      <w:r>
-        <w:rPr>
-          <w:rFonts w:ascii="Arial" w:eastAsia="Times New Roman" w:hAnsi="Arial" w:cs="Arial"/>
-          <w:color w:val="333333"/>
-          <w:sz w:val="19"/>
-          <w:szCs w:val="19"/>
-          <w:lang w:val="en"/>
-        </w:rPr>
-        <w:t xml:space="preserve"> (369 bytes).</w:t>
-      </w:r>
-      <w:r>
-        <w:rPr>
-          <w:rFonts w:ascii="Arial" w:eastAsia="Times New Roman" w:hAnsi="Arial" w:cs="Arial"/>
-          <w:color w:val="333333"/>
-          <w:sz w:val="19"/>
-          <w:szCs w:val="19"/>
-          <w:lang w:val="en"/>
-        </w:rPr>
-        <w:br/>
-        <w:t xml:space="preserve">- (Alternatively: Run </w:t>
-      </w:r>
-      <w:r>
-        <w:rPr>
-          <w:rStyle w:val="HTMLCode"/>
-          <w:color w:val="333333"/>
-          <w:lang w:val="en"/>
-        </w:rPr>
-        <w:t>python -c "import boto3; sc=boto3.client('s3', region_name='ap-southeast-2'); print(sc.list_objects_v2(Bucket='devops-incident-watchdog-logs-401537512022')['Contents'])"</w:t>
-      </w:r>
-      <w:r>
-        <w:rPr>
-          <w:rFonts w:ascii="Arial" w:eastAsia="Times New Roman" w:hAnsi="Arial" w:cs="Arial"/>
-          <w:color w:val="333333"/>
-          <w:sz w:val="19"/>
-          <w:szCs w:val="19"/>
-          <w:lang w:val="en"/>
-        </w:rPr>
-        <w:t xml:space="preserve"> in terminal and capture the output).</w:t>
-      </w:r>
-      <w:r>
-        <w:rPr>
-          <w:rFonts w:ascii="Arial" w:eastAsia="Times New Roman" w:hAnsi="Arial" w:cs="Arial"/>
-          <w:color w:val="333333"/>
-          <w:sz w:val="19"/>
-          <w:szCs w:val="19"/>
-          <w:lang w:val="en"/>
-        </w:rPr>
-        <w:br/>
-        <w:t xml:space="preserve">- Paste the screenshot in this box. </w:t>
-      </w:r>
-    </w:p>
-    <w:p>
-      <w:pPr>
-        <w:jc w:val="center"/>
-        <w:divId w:val="1303653240"/>
-        <w:rPr>
-          <w:rFonts w:eastAsia="Times New Roman"/>
-          <w:b/>
-          <w:bCs/>
-          <w:color w:val="000000"/>
-          <w:sz w:val="19"/>
-          <w:szCs w:val="19"/>
-          <w:lang w:val="en"/>
-        </w:rPr>
-      </w:pPr>
-      <w:r>
-        <w:rPr>
-          <w:rFonts w:eastAsia="Times New Roman"/>
-          <w:b/>
-          <w:bCs/>
-          <w:color w:val="000000"/>
-          <w:sz w:val="19"/>
-          <w:szCs w:val="19"/>
-          <w:lang w:val="en"/>
-        </w:rPr>
-        <w:t>Figure 6: Immutable Incident Forensic Evidence Archived in Private Amazon S3 Vault</w:t>
-      </w:r>
-    </w:p>
-    <w:p>
-      <w:pPr>
-        <w:pStyle w:val="Heading3"/>
-        <w:rPr>
-          <w:rFonts w:eastAsia="Times New Roman"/>
-          <w:color w:val="000000"/>
-          <w:lang w:val="en"/>
-        </w:rPr>
-      </w:pPr>
-      <w:r>
-        <w:rPr>
-          <w:rFonts w:eastAsia="Times New Roman"/>
-          <w:color w:val="000000"/>
-          <w:lang w:val="en"/>
-        </w:rPr>
-        <w:t>Step 6: Automated Agile Bug User Story Creation on GitHub Issues</w:t>
-      </w:r>
-    </w:p>
-    <w:p>
-      <w:pPr>
-        <w:pStyle w:val="NormalWeb"/>
-        <w:rPr>
-          <w:color w:val="000000"/>
-          <w:sz w:val="22"/>
-          <w:szCs w:val="22"/>
-          <w:lang w:val="en"/>
-        </w:rPr>
-      </w:pPr>
-      <w:r>
-        <w:rPr>
-          <w:color w:val="000000"/>
-          <w:sz w:val="22"/>
-          <w:szCs w:val="22"/>
-          <w:lang w:val="en"/>
-        </w:rPr>
-        <w:t>Simultaneously with S3 archival, the Watchdog issues an authenticated HTTP POST request to the GitHub Issues REST API v3 (</w:t>
-      </w:r>
-      <w:r>
-        <w:rPr>
-          <w:rStyle w:val="HTMLCode"/>
-          <w:color w:val="000000"/>
-          <w:lang w:val="en"/>
-        </w:rPr>
-        <w:t>https://api.github.com/repos/hemalexe/devopss-incident-watchdog/issues</w:t>
-      </w:r>
-      <w:r>
-        <w:rPr>
-          <w:color w:val="000000"/>
-          <w:sz w:val="22"/>
-          <w:szCs w:val="22"/>
-          <w:lang w:val="en"/>
-        </w:rPr>
-        <w:t>). It converts the technical crash telemetry into a formalized Agile Bug User Story with priority labels (</w:t>
-      </w:r>
-      <w:r>
-        <w:rPr>
-          <w:rStyle w:val="HTMLCode"/>
-          <w:color w:val="000000"/>
-          <w:lang w:val="en"/>
-        </w:rPr>
-        <w:t>incident</w:t>
-      </w:r>
-      <w:r>
-        <w:rPr>
-          <w:color w:val="000000"/>
-          <w:sz w:val="22"/>
-          <w:szCs w:val="22"/>
-          <w:lang w:val="en"/>
-        </w:rPr>
-        <w:t xml:space="preserve">, </w:t>
-      </w:r>
-      <w:r>
-        <w:rPr>
-          <w:rStyle w:val="HTMLCode"/>
-          <w:color w:val="000000"/>
-          <w:lang w:val="en"/>
-        </w:rPr>
-        <w:t>p1-critical</w:t>
-      </w:r>
-      <w:r>
-        <w:rPr>
-          <w:color w:val="000000"/>
-          <w:sz w:val="22"/>
-          <w:szCs w:val="22"/>
-          <w:lang w:val="en"/>
-        </w:rPr>
-        <w:t xml:space="preserve">, </w:t>
-      </w:r>
-      <w:r>
-        <w:rPr>
-          <w:rStyle w:val="HTMLCode"/>
-          <w:color w:val="000000"/>
-          <w:lang w:val="en"/>
-        </w:rPr>
-        <w:t>auto-generated</w:t>
-      </w:r>
-      <w:r>
-        <w:rPr>
-          <w:color w:val="000000"/>
-          <w:sz w:val="22"/>
-          <w:szCs w:val="22"/>
-          <w:lang w:val="en"/>
-        </w:rPr>
-        <w:t xml:space="preserve">) and an actionable Definition of Done checklist. </w:t>
-      </w:r>
-    </w:p>
-    <w:p>
-      <w:pPr>
-        <w:shd w:val="clear" w:color="auto" w:fill="FAFAFA"/>
-        <w:jc w:val="center"/>
-        <w:divId w:val="498469463"/>
-        <w:rPr>
-          <w:rFonts w:eastAsia="Times New Roman"/>
-          <w:b/>
-          <w:bCs/>
-          <w:caps/>
-          <w:color w:val="000000"/>
-          <w:sz w:val="22"/>
-          <w:szCs w:val="22"/>
-          <w:lang w:val="en"/>
-        </w:rPr>
-      </w:pPr>
-      <w:r>
-        <w:rPr>
-          <w:rFonts w:eastAsia="Times New Roman"/>
-          <w:b/>
-          <w:bCs/>
-          <w:caps/>
-          <w:color w:val="000000"/>
-          <w:sz w:val="22"/>
-          <w:szCs w:val="22"/>
-          <w:lang w:val="en"/>
-        </w:rPr>
-        <w:t>[PASTE SNAPSHOT 6: AUTO-GENERATED AGILE USER STORY ON GITHUB ISSUES]</w:t>
-      </w:r>
-    </w:p>
-    <w:p>
-      <w:pPr>
-        <w:shd w:val="clear" w:color="auto" w:fill="FFFFFF"/>
-        <w:divId w:val="759837805"/>
-        <w:rPr>
-          <w:rFonts w:ascii="Arial" w:eastAsia="Times New Roman" w:hAnsi="Arial" w:cs="Arial"/>
-          <w:color w:val="333333"/>
-          <w:sz w:val="19"/>
-          <w:szCs w:val="19"/>
-          <w:lang w:val="en"/>
-        </w:rPr>
-      </w:pPr>
-      <w:r>
-        <w:rPr>
-          <w:rStyle w:val="Strong"/>
-          <w:rFonts w:ascii="Arial" w:eastAsia="Times New Roman" w:hAnsi="Arial" w:cs="Arial"/>
-          <w:color w:val="333333"/>
-          <w:sz w:val="19"/>
-          <w:szCs w:val="19"/>
-          <w:lang w:val="en"/>
-        </w:rPr>
-        <w:t>HOW TO CAPTURE:</w:t>
-      </w:r>
-      <w:r>
-        <w:rPr>
-          <w:rFonts w:ascii="Arial" w:eastAsia="Times New Roman" w:hAnsi="Arial" w:cs="Arial"/>
-          <w:color w:val="333333"/>
-          <w:sz w:val="19"/>
-          <w:szCs w:val="19"/>
-          <w:lang w:val="en"/>
-        </w:rPr>
-        <w:br/>
-        <w:t xml:space="preserve">- Open your browser to: </w:t>
-      </w:r>
-      <w:r>
-        <w:rPr>
-          <w:rStyle w:val="HTMLCode"/>
-          <w:color w:val="333333"/>
-          <w:lang w:val="en"/>
-        </w:rPr>
-        <w:t>https://github.com/hemalexe/devopss-incident-watchdog/issues/1</w:t>
-      </w:r>
-      <w:r>
-        <w:rPr>
-          <w:rFonts w:ascii="Arial" w:eastAsia="Times New Roman" w:hAnsi="Arial" w:cs="Arial"/>
-          <w:color w:val="333333"/>
-          <w:sz w:val="19"/>
-          <w:szCs w:val="19"/>
-          <w:lang w:val="en"/>
-        </w:rPr>
-        <w:br/>
-        <w:t>- Capture the issue body showing:</w:t>
-      </w:r>
-      <w:r>
-        <w:rPr>
-          <w:rFonts w:ascii="Arial" w:eastAsia="Times New Roman" w:hAnsi="Arial" w:cs="Arial"/>
-          <w:color w:val="333333"/>
-          <w:sz w:val="19"/>
-          <w:szCs w:val="19"/>
-          <w:lang w:val="en"/>
-        </w:rPr>
-        <w:br/>
-        <w:t xml:space="preserve">• Title: </w:t>
-      </w:r>
-      <w:r>
-        <w:rPr>
-          <w:rStyle w:val="Emphasis"/>
-          <w:rFonts w:ascii="Arial" w:eastAsia="Times New Roman" w:hAnsi="Arial" w:cs="Arial"/>
-          <w:color w:val="333333"/>
-          <w:sz w:val="19"/>
-          <w:szCs w:val="19"/>
-          <w:lang w:val="en"/>
-        </w:rPr>
-        <w:t>"Automated Incident Report: DevOps Incident Watchdog"</w:t>
-      </w:r>
-      <w:r>
-        <w:rPr>
-          <w:rFonts w:ascii="Arial" w:eastAsia="Times New Roman" w:hAnsi="Arial" w:cs="Arial"/>
-          <w:color w:val="333333"/>
-          <w:sz w:val="19"/>
-          <w:szCs w:val="19"/>
-          <w:lang w:val="en"/>
-        </w:rPr>
-        <w:br/>
-        <w:t>• Agile User Story (</w:t>
-      </w:r>
-      <w:r>
-        <w:rPr>
-          <w:rStyle w:val="Emphasis"/>
-          <w:rFonts w:ascii="Arial" w:eastAsia="Times New Roman" w:hAnsi="Arial" w:cs="Arial"/>
-          <w:color w:val="333333"/>
-          <w:sz w:val="19"/>
-          <w:szCs w:val="19"/>
-          <w:lang w:val="en"/>
-        </w:rPr>
-        <w:t>"As an Agile Team member, I need to resolve unhandled ZeroDivisionError..."</w:t>
-      </w:r>
-      <w:r>
-        <w:rPr>
-          <w:rFonts w:ascii="Arial" w:eastAsia="Times New Roman" w:hAnsi="Arial" w:cs="Arial"/>
-          <w:color w:val="333333"/>
-          <w:sz w:val="19"/>
-          <w:szCs w:val="19"/>
-          <w:lang w:val="en"/>
-        </w:rPr>
-        <w:t>)</w:t>
-      </w:r>
-      <w:r>
-        <w:rPr>
-          <w:rFonts w:ascii="Arial" w:eastAsia="Times New Roman" w:hAnsi="Arial" w:cs="Arial"/>
-          <w:color w:val="333333"/>
-          <w:sz w:val="19"/>
-          <w:szCs w:val="19"/>
-          <w:lang w:val="en"/>
-        </w:rPr>
-        <w:br/>
-        <w:t>• Diagnostics Table with Incident ID and Amazon S3 Vault URI.</w:t>
-      </w:r>
-      <w:r>
-        <w:rPr>
-          <w:rFonts w:ascii="Arial" w:eastAsia="Times New Roman" w:hAnsi="Arial" w:cs="Arial"/>
-          <w:color w:val="333333"/>
-          <w:sz w:val="19"/>
-          <w:szCs w:val="19"/>
-          <w:lang w:val="en"/>
-        </w:rPr>
-        <w:br/>
-        <w:t>• Acceptance Criteria Definition of Done Checklist.</w:t>
-      </w:r>
-      <w:r>
-        <w:rPr>
-          <w:rFonts w:ascii="Arial" w:eastAsia="Times New Roman" w:hAnsi="Arial" w:cs="Arial"/>
-          <w:color w:val="333333"/>
-          <w:sz w:val="19"/>
-          <w:szCs w:val="19"/>
-          <w:lang w:val="en"/>
-        </w:rPr>
-        <w:br/>
-        <w:t xml:space="preserve">- Paste the screenshot in this box. </w:t>
-      </w:r>
-    </w:p>
-    <w:p>
-      <w:pPr>
-        <w:jc w:val="center"/>
-        <w:divId w:val="2074505428"/>
-        <w:rPr>
-          <w:rFonts w:eastAsia="Times New Roman"/>
-          <w:b/>
-          <w:bCs/>
-          <w:color w:val="000000"/>
-          <w:sz w:val="19"/>
-          <w:szCs w:val="19"/>
-          <w:lang w:val="en"/>
-        </w:rPr>
-      </w:pPr>
-      <w:r>
-        <w:rPr>
-          <w:rFonts w:eastAsia="Times New Roman"/>
-          <w:b/>
-          <w:bCs/>
-          <w:color w:val="000000"/>
-          <w:sz w:val="19"/>
-          <w:szCs w:val="19"/>
-          <w:lang w:val="en"/>
-        </w:rPr>
-        <w:t>Figure 7: Automated Agile Bug User Story Populated into GitHub Issues Sprint Backlog</w:t>
-      </w:r>
-    </w:p>
-    <w:p>
-      <w:pPr>
-        <w:pStyle w:val="Heading3"/>
-        <w:rPr>
-          <w:rFonts w:eastAsia="Times New Roman"/>
-          <w:color w:val="000000"/>
-          <w:lang w:val="en"/>
-        </w:rPr>
-      </w:pPr>
-      <w:r>
-        <w:rPr>
-          <w:rFonts w:eastAsia="Times New Roman"/>
-          <w:color w:val="000000"/>
-          <w:lang w:val="en"/>
-        </w:rPr>
-        <w:t>Step 7: Automated CI/CD Regression Pipeline &amp; Zero-Touch Incident Resolution</w:t>
-      </w:r>
-    </w:p>
-    <w:p>
-      <w:pPr>
-        <w:pStyle w:val="NormalWeb"/>
-        <w:rPr>
-          <w:color w:val="000000"/>
-          <w:sz w:val="22"/>
-          <w:szCs w:val="22"/>
-          <w:lang w:val="en"/>
-        </w:rPr>
-      </w:pPr>
-      <w:r>
-        <w:rPr>
-          <w:color w:val="000000"/>
-          <w:sz w:val="22"/>
-          <w:szCs w:val="22"/>
-          <w:lang w:val="en"/>
-        </w:rPr>
-        <w:t xml:space="preserve">The assigned developer inspects the automated ticket and implements defensive boundary checking in </w:t>
-      </w:r>
-      <w:r>
-        <w:rPr>
-          <w:rStyle w:val="HTMLCode"/>
-          <w:color w:val="000000"/>
-          <w:lang w:val="en"/>
-        </w:rPr>
-        <w:t>app/app.py</w:t>
-      </w:r>
-      <w:r>
-        <w:rPr>
-          <w:color w:val="000000"/>
-          <w:sz w:val="22"/>
-          <w:szCs w:val="22"/>
-          <w:lang w:val="en"/>
-        </w:rPr>
-        <w:t xml:space="preserve">: </w:t>
-      </w:r>
-    </w:p>
-    <w:p>
-      <w:pPr>
-        <w:pStyle w:val="HTMLPreformatted"/>
-        <w:rPr>
-          <w:color w:val="000000"/>
-          <w:lang w:val="en"/>
-        </w:rPr>
-      </w:pPr>
-    </w:p>
-    <w:p>
-      <w:pPr>
-        <w:pStyle w:val="HTMLPreformatted"/>
-        <w:rPr>
-          <w:color w:val="000000"/>
-          <w:lang w:val="en"/>
-        </w:rPr>
-      </w:pPr>
-      <w:r>
-        <w:rPr>
-          <w:color w:val="000000"/>
-          <w:lang w:val="en"/>
-        </w:rPr>
-        <w:t># Corrected implementation in app/app.py (Defensive Zero-Stock Guard)</w:t>
-      </w:r>
-    </w:p>
-    <w:p>
-      <w:pPr>
-        <w:pStyle w:val="HTMLPreformatted"/>
-        <w:rPr>
-          <w:color w:val="000000"/>
-          <w:lang w:val="en"/>
-        </w:rPr>
-      </w:pPr>
-      <w:r>
-        <w:rPr>
-          <w:color w:val="000000"/>
-          <w:lang w:val="en"/>
-        </w:rPr>
-        <w:t>if product["stock"] &lt;= 0:</w:t>
-      </w:r>
-    </w:p>
-    <w:p>
-      <w:pPr>
-        <w:pStyle w:val="HTMLPreformatted"/>
-        <w:rPr>
-          <w:color w:val="000000"/>
-          <w:lang w:val="en"/>
-        </w:rPr>
-      </w:pPr>
-      <w:r>
-        <w:rPr>
-          <w:color w:val="000000"/>
-          <w:lang w:val="en"/>
-        </w:rPr>
-        <w:t xml:space="preserve">    logger.warning(f"[DELIVERY_NOTICE] '{product['name']}' not deliverable to '{address}'.")</w:t>
-      </w:r>
-    </w:p>
-    <w:p>
-      <w:pPr>
-        <w:pStyle w:val="HTMLPreformatted"/>
-        <w:rPr>
-          <w:color w:val="000000"/>
-          <w:lang w:val="en"/>
-        </w:rPr>
-      </w:pPr>
-      <w:r>
-        <w:rPr>
-          <w:color w:val="000000"/>
-          <w:lang w:val="en"/>
-        </w:rPr>
-        <w:t xml:space="preserve">    return jsonify({</w:t>
-      </w:r>
-    </w:p>
-    <w:p>
-      <w:pPr>
-        <w:pStyle w:val="HTMLPreformatted"/>
-        <w:rPr>
-          <w:color w:val="000000"/>
-          <w:lang w:val="en"/>
-        </w:rPr>
-      </w:pPr>
-      <w:r>
-        <w:rPr>
-          <w:color w:val="000000"/>
-          <w:lang w:val="en"/>
-        </w:rPr>
-        <w:t xml:space="preserve">        "status": "not_deliverable",</w:t>
-      </w:r>
-    </w:p>
-    <w:p>
-      <w:pPr>
-        <w:pStyle w:val="HTMLPreformatted"/>
-        <w:rPr>
-          <w:color w:val="000000"/>
-          <w:lang w:val="en"/>
-        </w:rPr>
-      </w:pPr>
-      <w:r>
-        <w:rPr>
-          <w:color w:val="000000"/>
-          <w:lang w:val="en"/>
-        </w:rPr>
-        <w:t xml:space="preserve">        </w:t>
-      </w:r>
-      <w:r>
-        <w:rPr>
-          <w:color w:val="000000"/>
-          <w:lang w:val="en"/>
-        </w:rPr>
-        <w:t>"message": "Sorry, this item is not deliverable to your address (Out of stock at your nearest fulfillment center)!",</w:t>
-      </w:r>
-    </w:p>
-    <w:p>
-      <w:pPr>
-        <w:pStyle w:val="HTMLPreformatted"/>
-        <w:rPr>
-          <w:color w:val="000000"/>
-          <w:lang w:val="en"/>
-        </w:rPr>
-      </w:pPr>
-      <w:r>
-        <w:rPr>
-          <w:color w:val="000000"/>
-          <w:lang w:val="en"/>
-        </w:rPr>
-        <w:t xml:space="preserve">        "product": product["name"],</w:t>
-      </w:r>
-    </w:p>
-    <w:p>
-      <w:pPr>
-        <w:pStyle w:val="HTMLPreformatted"/>
-        <w:rPr>
-          <w:color w:val="000000"/>
-          <w:lang w:val="en"/>
-        </w:rPr>
-      </w:pPr>
-      <w:r>
-        <w:rPr>
-          <w:color w:val="000000"/>
-          <w:lang w:val="en"/>
-        </w:rPr>
-        <w:t xml:space="preserve">        "address": address</w:t>
-      </w:r>
-    </w:p>
-    <w:p>
-      <w:pPr>
-        <w:pStyle w:val="HTMLPreformatted"/>
-        <w:rPr>
-          <w:color w:val="000000"/>
-          <w:lang w:val="en"/>
-        </w:rPr>
-      </w:pPr>
-      <w:r>
-        <w:rPr>
-          <w:color w:val="000000"/>
-          <w:lang w:val="en"/>
-        </w:rPr>
-        <w:t xml:space="preserve">    }), 400</w:t>
-      </w:r>
-    </w:p>
-    <w:p>
-      <w:pPr>
-        <w:pStyle w:val="NormalWeb"/>
-        <w:rPr>
-          <w:color w:val="000000"/>
-          <w:sz w:val="22"/>
-          <w:szCs w:val="22"/>
-          <w:lang w:val="en"/>
-        </w:rPr>
-      </w:pPr>
-      <w:r>
-        <w:rPr>
-          <w:color w:val="000000"/>
-          <w:sz w:val="22"/>
-          <w:szCs w:val="22"/>
-          <w:lang w:val="en"/>
-        </w:rPr>
-        <w:t xml:space="preserve">The developer commits the patch using Git Smart Commit syntax: </w:t>
-      </w:r>
-      <w:r>
-        <w:rPr>
-          <w:rStyle w:val="HTMLCode"/>
-          <w:color w:val="000000"/>
-          <w:lang w:val="en"/>
-        </w:rPr>
-        <w:t>git commit -m "Fix zero-stock dark store allocation. Fixes #1"</w:t>
-      </w:r>
-      <w:r>
-        <w:rPr>
-          <w:color w:val="000000"/>
-          <w:sz w:val="22"/>
-          <w:szCs w:val="22"/>
-          <w:lang w:val="en"/>
-        </w:rPr>
-        <w:t xml:space="preserve"> and pushes to </w:t>
-      </w:r>
-      <w:r>
-        <w:rPr>
-          <w:rStyle w:val="HTMLCode"/>
-          <w:color w:val="000000"/>
-          <w:lang w:val="en"/>
-        </w:rPr>
-        <w:t>origin/main</w:t>
-      </w:r>
-      <w:r>
-        <w:rPr>
-          <w:color w:val="000000"/>
-          <w:sz w:val="22"/>
-          <w:szCs w:val="22"/>
-          <w:lang w:val="en"/>
-        </w:rPr>
-        <w:t xml:space="preserve">. The GitHub Actions CI/CD pipeline triggers immediately, runs 9 automated </w:t>
-      </w:r>
-      <w:r>
-        <w:rPr>
-          <w:rStyle w:val="HTMLCode"/>
-          <w:color w:val="000000"/>
-          <w:lang w:val="en"/>
-        </w:rPr>
-        <w:t>pytest</w:t>
-      </w:r>
-      <w:r>
-        <w:rPr>
-          <w:color w:val="000000"/>
-          <w:sz w:val="22"/>
-          <w:szCs w:val="22"/>
-          <w:lang w:val="en"/>
-        </w:rPr>
-        <w:t xml:space="preserve"> </w:t>
-      </w:r>
-      <w:r>
-        <w:rPr>
-          <w:color w:val="000000"/>
-          <w:sz w:val="22"/>
-          <w:szCs w:val="22"/>
-          <w:lang w:val="en"/>
-        </w:rPr>
-        <w:t xml:space="preserve">unit regression tests in 0.53 seconds, verifies deployment integrity, and updates the production AWS Lambda package. GitHub automatically links the verified commit SHA and transitions Issue #1 from </w:t>
-      </w:r>
-      <w:r>
-        <w:rPr>
-          <w:rStyle w:val="Strong"/>
-          <w:color w:val="000000"/>
-          <w:sz w:val="22"/>
-          <w:szCs w:val="22"/>
-          <w:lang w:val="en"/>
-        </w:rPr>
-        <w:t>Open</w:t>
-      </w:r>
-      <w:r>
-        <w:rPr>
-          <w:color w:val="000000"/>
-          <w:sz w:val="22"/>
-          <w:szCs w:val="22"/>
-          <w:lang w:val="en"/>
-        </w:rPr>
-        <w:t xml:space="preserve"> to </w:t>
-      </w:r>
-      <w:r>
-        <w:rPr>
-          <w:rStyle w:val="Strong"/>
-          <w:color w:val="000000"/>
-          <w:sz w:val="22"/>
-          <w:szCs w:val="22"/>
-          <w:lang w:val="en"/>
-        </w:rPr>
-        <w:t>Closed (Done)</w:t>
-      </w:r>
-      <w:r>
-        <w:rPr>
-          <w:color w:val="000000"/>
-          <w:sz w:val="22"/>
-          <w:szCs w:val="22"/>
-          <w:lang w:val="en"/>
-        </w:rPr>
-        <w:t xml:space="preserve"> without manual intervention. </w:t>
-      </w:r>
-    </w:p>
-    <w:p>
-      <w:pPr>
-        <w:shd w:val="clear" w:color="auto" w:fill="FAFAFA"/>
-        <w:jc w:val="center"/>
-        <w:divId w:val="829716335"/>
-        <w:rPr>
-          <w:rFonts w:eastAsia="Times New Roman"/>
-          <w:b/>
-          <w:bCs/>
-          <w:caps/>
-          <w:color w:val="000000"/>
-          <w:sz w:val="22"/>
-          <w:szCs w:val="22"/>
-          <w:lang w:val="en"/>
-        </w:rPr>
-      </w:pPr>
-      <w:r>
-        <w:rPr>
-          <w:rFonts w:eastAsia="Times New Roman"/>
-          <w:b/>
-          <w:bCs/>
-          <w:caps/>
-          <w:color w:val="000000"/>
-          <w:sz w:val="22"/>
-          <w:szCs w:val="22"/>
-          <w:lang w:val="en"/>
-        </w:rPr>
-        <w:t>[PASTE SNAPSHOT 7: GITHUB ACTIONS GREEN CI/CD RUN &amp; CLOSED ISSUE]</w:t>
-      </w:r>
-    </w:p>
-    <w:p>
-      <w:pPr>
-        <w:shd w:val="clear" w:color="auto" w:fill="FFFFFF"/>
-        <w:divId w:val="351956178"/>
-        <w:rPr>
-          <w:rFonts w:ascii="Arial" w:eastAsia="Times New Roman" w:hAnsi="Arial" w:cs="Arial"/>
-          <w:color w:val="333333"/>
-          <w:sz w:val="19"/>
-          <w:szCs w:val="19"/>
-          <w:lang w:val="en"/>
-        </w:rPr>
-      </w:pPr>
-      <w:r>
-        <w:rPr>
-          <w:rStyle w:val="Strong"/>
-          <w:rFonts w:ascii="Arial" w:eastAsia="Times New Roman" w:hAnsi="Arial" w:cs="Arial"/>
-          <w:color w:val="333333"/>
-          <w:sz w:val="19"/>
-          <w:szCs w:val="19"/>
-          <w:lang w:val="en"/>
-        </w:rPr>
-        <w:t>HOW TO CAPTURE:</w:t>
-      </w:r>
-      <w:r>
-        <w:rPr>
-          <w:rFonts w:ascii="Arial" w:eastAsia="Times New Roman" w:hAnsi="Arial" w:cs="Arial"/>
-          <w:color w:val="333333"/>
-          <w:sz w:val="19"/>
-          <w:szCs w:val="19"/>
-          <w:lang w:val="en"/>
-        </w:rPr>
-        <w:br/>
-        <w:t xml:space="preserve">- Open: </w:t>
-      </w:r>
-      <w:r>
-        <w:rPr>
-          <w:rStyle w:val="HTMLCode"/>
-          <w:color w:val="333333"/>
-          <w:lang w:val="en"/>
-        </w:rPr>
-        <w:t>https://github.com/hemalexe/devopss-incident-watchdog/actions</w:t>
-      </w:r>
-      <w:r>
-        <w:rPr>
-          <w:rFonts w:ascii="Arial" w:eastAsia="Times New Roman" w:hAnsi="Arial" w:cs="Arial"/>
-          <w:color w:val="333333"/>
-          <w:sz w:val="19"/>
-          <w:szCs w:val="19"/>
-          <w:lang w:val="en"/>
-        </w:rPr>
-        <w:t xml:space="preserve"> and capture the green checkmark showing 9 passed unit tests in 0.53s.</w:t>
-      </w:r>
-      <w:r>
-        <w:rPr>
-          <w:rFonts w:ascii="Arial" w:eastAsia="Times New Roman" w:hAnsi="Arial" w:cs="Arial"/>
-          <w:color w:val="333333"/>
-          <w:sz w:val="19"/>
-          <w:szCs w:val="19"/>
-          <w:lang w:val="en"/>
-        </w:rPr>
-        <w:br/>
-        <w:t xml:space="preserve">- Open: </w:t>
-      </w:r>
-      <w:r>
-        <w:rPr>
-          <w:rStyle w:val="HTMLCode"/>
-          <w:color w:val="333333"/>
-          <w:lang w:val="en"/>
-        </w:rPr>
-        <w:t>https://github.com/hemalexe/devopss-incident-watchdog/issues/1</w:t>
-      </w:r>
-      <w:r>
-        <w:rPr>
-          <w:rFonts w:ascii="Arial" w:eastAsia="Times New Roman" w:hAnsi="Arial" w:cs="Arial"/>
-          <w:color w:val="333333"/>
-          <w:sz w:val="19"/>
-          <w:szCs w:val="19"/>
-          <w:lang w:val="en"/>
-        </w:rPr>
-        <w:t xml:space="preserve"> and capture the purple </w:t>
-      </w:r>
-      <w:r>
-        <w:rPr>
-          <w:rStyle w:val="Strong"/>
-          <w:rFonts w:ascii="Arial" w:eastAsia="Times New Roman" w:hAnsi="Arial" w:cs="Arial"/>
-          <w:color w:val="333333"/>
-          <w:sz w:val="19"/>
-          <w:szCs w:val="19"/>
-          <w:lang w:val="en"/>
-        </w:rPr>
-        <w:t>"Closed"</w:t>
-      </w:r>
-      <w:r>
-        <w:rPr>
-          <w:rFonts w:ascii="Arial" w:eastAsia="Times New Roman" w:hAnsi="Arial" w:cs="Arial"/>
-          <w:color w:val="333333"/>
-          <w:sz w:val="19"/>
-          <w:szCs w:val="19"/>
-          <w:lang w:val="en"/>
-        </w:rPr>
-        <w:t xml:space="preserve"> badge referencing </w:t>
-      </w:r>
-      <w:r>
-        <w:rPr>
-          <w:rStyle w:val="Emphasis"/>
-          <w:rFonts w:ascii="Arial" w:eastAsia="Times New Roman" w:hAnsi="Arial" w:cs="Arial"/>
-          <w:color w:val="333333"/>
-          <w:sz w:val="19"/>
-          <w:szCs w:val="19"/>
-          <w:lang w:val="en"/>
-        </w:rPr>
-        <w:t>"closed this in commit ... via Fixes #1"</w:t>
-      </w:r>
-      <w:r>
-        <w:rPr>
-          <w:rFonts w:ascii="Arial" w:eastAsia="Times New Roman" w:hAnsi="Arial" w:cs="Arial"/>
-          <w:color w:val="333333"/>
-          <w:sz w:val="19"/>
-          <w:szCs w:val="19"/>
-          <w:lang w:val="en"/>
-        </w:rPr>
-        <w:t>.</w:t>
-      </w:r>
-      <w:r>
-        <w:rPr>
-          <w:rFonts w:ascii="Arial" w:eastAsia="Times New Roman" w:hAnsi="Arial" w:cs="Arial"/>
-          <w:color w:val="333333"/>
-          <w:sz w:val="19"/>
-          <w:szCs w:val="19"/>
-          <w:lang w:val="en"/>
-        </w:rPr>
-        <w:br/>
-        <w:t xml:space="preserve">- Paste the screenshots in this box. </w:t>
-      </w:r>
-    </w:p>
-    <w:p>
-      <w:pPr>
-        <w:jc w:val="center"/>
-        <w:divId w:val="1000159283"/>
-        <w:rPr>
-          <w:rFonts w:eastAsia="Times New Roman"/>
-          <w:b/>
-          <w:bCs/>
-          <w:color w:val="000000"/>
-          <w:sz w:val="19"/>
-          <w:szCs w:val="19"/>
-          <w:lang w:val="en"/>
-        </w:rPr>
-      </w:pPr>
-      <w:r>
-        <w:rPr>
-          <w:rFonts w:eastAsia="Times New Roman"/>
-          <w:b/>
-          <w:bCs/>
-          <w:color w:val="000000"/>
-          <w:sz w:val="19"/>
-          <w:szCs w:val="19"/>
-          <w:lang w:val="en"/>
-        </w:rPr>
-        <w:t>Figure 8: Automated Regression Testing Passing in GitHub Actions and Zero-Touch Issue Closure</w:t>
+        <w:t xml:space="preserve"> Real GitHub Actions CI/CD pipeline execution displaying 100% test suite success (green checkmark), verifying regression safety, auto-deploying code to AWS Lambda, and closing Issue #1 via Git commit linking. </w:t>
       </w:r>
     </w:p>
     <w:p>
@@ -5608,16 +5338,7 @@
                 <w:sz w:val="20"/>
                 <w:szCs w:val="20"/>
               </w:rPr>
-              <w:t xml:space="preserve"> </w:t>
-            </w:r>
-            <w:r>
-              <w:rPr>
-                <w:rFonts w:eastAsia="Times New Roman"/>
-                <w:color w:val="000000"/>
-                <w:sz w:val="20"/>
-                <w:szCs w:val="20"/>
-              </w:rPr>
-              <w:t>(Amazon CloudWatch Metric Filter)</w:t>
+              <w:t xml:space="preserve"> (Amazon CloudWatch Metric Filter)</w:t>
             </w:r>
           </w:p>
         </w:tc>
@@ -6125,16 +5846,7 @@
                 <w:sz w:val="20"/>
                 <w:szCs w:val="20"/>
               </w:rPr>
-              <w:t xml:space="preserve"> </w:t>
-            </w:r>
-            <w:r>
-              <w:rPr>
-                <w:rFonts w:eastAsia="Times New Roman"/>
-                <w:color w:val="000000"/>
-                <w:sz w:val="20"/>
-                <w:szCs w:val="20"/>
-              </w:rPr>
-              <w:t>linking ticket to CI/CD</w:t>
+              <w:t xml:space="preserve"> linking ticket to CI/CD</w:t>
             </w:r>
           </w:p>
         </w:tc>
@@ -6480,9 +6192,9 @@
 <file path=word/numbering.xml><?xml version="1.0" encoding="utf-8"?>
 <w:numbering xmlns:wpc="http://schemas.microsoft.com/office/word/2010/wordprocessingCanvas" xmlns:cx="http://schemas.microsoft.com/office/drawing/2014/chartex" xmlns:cx1="http://schemas.microsoft.com/office/drawing/2015/9/8/chartex" xmlns:cx2="http://schemas.microsoft.com/office/drawing/2015/10/21/chartex" xmlns:cx3="http://schemas.microsoft.com/office/drawing/2016/5/9/chartex" xmlns:cx4="http://schemas.microsoft.com/office/drawing/2016/5/10/chartex" xmlns:cx5="http://schemas.microsoft.com/office/drawing/2016/5/11/chartex" xmlns:cx6="http://schemas.microsoft.com/office/drawing/2016/5/12/chartex" xmlns:cx7="http://schemas.microsoft.com/office/drawing/2016/5/13/chartex" xmlns:cx8="http://schemas.microsoft.com/office/drawing/2016/5/14/chartex" xmlns:mc="http://schemas.openxmlformats.org/markup-compatibility/2006" xmlns:aink="http://schemas.microsoft.com/office/drawing/2016/ink" xmlns:am3d="http://schemas.microsoft.com/office/drawing/2017/model3d" xmlns:o="urn:schemas-microsoft-com:office:office" xmlns:oel="http://schemas.microsoft.com/office/2019/extlst" xmlns:r="http://schemas.openxmlformats.org/officeDocument/2006/relationships" xmlns:m="http://schemas.openxmlformats.org/officeDocument/2006/math" xmlns:v="urn:schemas-microsoft-com:vml" xmlns:wp14="http://schemas.microsoft.com/office/word/2010/wordprocessingDrawing" xmlns:wp="http://schemas.openxmlformats.org/drawingml/2006/wordprocessingDrawing" xmlns:w10="urn:schemas-microsoft-com:office:word" xmlns:w="http://schemas.openxmlformats.org/wordprocessingml/2006/main" xmlns:w14="http://schemas.microsoft.com/office/word/2010/wordml" xmlns:w15="http://schemas.microsoft.com/office/word/2012/wordml" xmlns:w16cex="http://schemas.microsoft.com/office/word/2018/wordml/cex" xmlns:w16cid="http://schemas.microsoft.com/office/word/2016/wordml/cid" xmlns:w16="http://schemas.microsoft.com/office/word/2018/wordml" xmlns:w16du="http://schemas.microsoft.com/office/word/2023/wordml/word16du" xmlns:w16sdtdh="http://schemas.microsoft.com/office/word/2020/wordml/sdtdatahash" xmlns:w16sdtfl="http://schemas.microsoft.com/office/word/2024/wordml/sdtformatlock" xmlns:w16se="http://schemas.microsoft.com/office/word/2015/wordml/symex" xmlns:wpg="http://schemas.microsoft.com/office/word/2010/wordprocessingGroup" xmlns:wpi="http://schemas.microsoft.com/office/word/2010/wordprocessingInk" xmlns:wne="http://schemas.microsoft.com/office/word/2006/wordml" xmlns:wps="http://schemas.microsoft.com/office/word/2010/wordprocessingShape" mc:Ignorable="w14 w15 w16se w16cid w16 w16cex w16sdtdh w16sdtfl w16du wp14">
   <w:abstractNum w:abstractNumId="0" w15:restartNumberingAfterBreak="0">
-    <w:nsid w:val="0D0E79E4"/>
+    <w:nsid w:val="06AE6BFC"/>
     <w:multiLevelType w:val="multilevel"/>
-    <w:tmpl w:val="D66A3B64"/>
+    <w:tmpl w:val="D92C1598"/>
     <w:lvl w:ilvl="0">
       <w:start w:val="1"/>
       <w:numFmt w:val="bullet"/>
@@ -6629,9 +6341,9 @@
     </w:lvl>
   </w:abstractNum>
   <w:abstractNum w:abstractNumId="1" w15:restartNumberingAfterBreak="0">
-    <w:nsid w:val="16795A9E"/>
+    <w:nsid w:val="7D712B96"/>
     <w:multiLevelType w:val="multilevel"/>
-    <w:tmpl w:val="6AD4BCDA"/>
+    <w:tmpl w:val="A55E8934"/>
     <w:lvl w:ilvl="0">
       <w:start w:val="1"/>
       <w:numFmt w:val="bullet"/>
@@ -6778,9 +6490,9 @@
     </w:lvl>
   </w:abstractNum>
   <w:abstractNum w:abstractNumId="2" w15:restartNumberingAfterBreak="0">
-    <w:nsid w:val="25724224"/>
+    <w:nsid w:val="7F261DD0"/>
     <w:multiLevelType w:val="multilevel"/>
-    <w:tmpl w:val="538ECAEC"/>
+    <w:tmpl w:val="95821718"/>
     <w:lvl w:ilvl="0">
       <w:start w:val="1"/>
       <w:numFmt w:val="decimal"/>
@@ -6890,13 +6602,13 @@
       </w:pPr>
     </w:lvl>
   </w:abstractNum>
-  <w:num w:numId="1" w16cid:durableId="848955255">
+  <w:num w:numId="1" w16cid:durableId="941033888">
     <w:abstractNumId w:val="2"/>
   </w:num>
-  <w:num w:numId="2" w16cid:durableId="1042704282">
+  <w:num w:numId="2" w16cid:durableId="2062632305">
     <w:abstractNumId w:val="1"/>
   </w:num>
-  <w:num w:numId="3" w16cid:durableId="2130658657">
+  <w:num w:numId="3" w16cid:durableId="1514414642">
     <w:abstractNumId w:val="0"/>
   </w:num>
 </w:numbering>
@@ -7533,66 +7245,41 @@
       <w:szCs w:val="20"/>
     </w:rPr>
   </w:style>
-  <w:style w:type="paragraph" w:customStyle="1" w:styleId="snapshot-box">
-    <w:name w:val="snapshot-box"/>
+  <w:style w:type="paragraph" w:customStyle="1" w:styleId="image-container">
+    <w:name w:val="image-container"/>
     <w:basedOn w:val="Normal"/>
     <w:pPr>
-      <w:pBdr>
-        <w:top w:val="dashed" w:sz="12" w:space="14" w:color="000000"/>
-        <w:left w:val="dashed" w:sz="12" w:space="14" w:color="000000"/>
-        <w:bottom w:val="dashed" w:sz="12" w:space="14" w:color="000000"/>
-        <w:right w:val="dashed" w:sz="12" w:space="14" w:color="000000"/>
-      </w:pBdr>
-      <w:shd w:val="clear" w:color="auto" w:fill="FAFAFA"/>
-      <w:spacing w:before="210" w:after="210"/>
+      <w:spacing w:before="210" w:after="90"/>
       <w:jc w:val="center"/>
     </w:pPr>
-  </w:style>
-  <w:style w:type="paragraph" w:customStyle="1" w:styleId="snapshot-title">
-    <w:name w:val="snapshot-title"/>
-    <w:basedOn w:val="Normal"/>
-    <w:pPr>
-      <w:spacing w:before="100" w:beforeAutospacing="1" w:after="90"/>
-      <w:jc w:val="both"/>
-    </w:pPr>
-    <w:rPr>
-      <w:b/>
-      <w:bCs/>
-      <w:caps/>
-      <w:sz w:val="22"/>
-      <w:szCs w:val="22"/>
-    </w:rPr>
-  </w:style>
-  <w:style w:type="paragraph" w:customStyle="1" w:styleId="snapshot-instructions">
-    <w:name w:val="snapshot-instructions"/>
-    <w:basedOn w:val="Normal"/>
-    <w:pPr>
-      <w:pBdr>
-        <w:top w:val="single" w:sz="6" w:space="8" w:color="CCCCCC"/>
-        <w:left w:val="single" w:sz="6" w:space="8" w:color="CCCCCC"/>
-        <w:bottom w:val="single" w:sz="6" w:space="8" w:color="CCCCCC"/>
-        <w:right w:val="single" w:sz="6" w:space="8" w:color="CCCCCC"/>
-      </w:pBdr>
-      <w:shd w:val="clear" w:color="auto" w:fill="FFFFFF"/>
-      <w:spacing w:before="120" w:after="60"/>
-    </w:pPr>
-    <w:rPr>
-      <w:rFonts w:ascii="Arial" w:hAnsi="Arial" w:cs="Arial"/>
-      <w:color w:val="333333"/>
-      <w:sz w:val="19"/>
-      <w:szCs w:val="19"/>
-    </w:rPr>
   </w:style>
   <w:style w:type="paragraph" w:customStyle="1" w:styleId="caption">
     <w:name w:val="caption"/>
     <w:basedOn w:val="Normal"/>
     <w:pPr>
-      <w:spacing w:before="90" w:after="225"/>
+      <w:spacing w:before="90" w:after="180"/>
       <w:jc w:val="center"/>
     </w:pPr>
     <w:rPr>
       <w:b/>
       <w:bCs/>
+      <w:sz w:val="19"/>
+      <w:szCs w:val="19"/>
+    </w:rPr>
+  </w:style>
+  <w:style w:type="paragraph" w:customStyle="1" w:styleId="tech-note">
+    <w:name w:val="tech-note"/>
+    <w:basedOn w:val="Normal"/>
+    <w:pPr>
+      <w:pBdr>
+        <w:left w:val="single" w:sz="18" w:space="8" w:color="000000"/>
+      </w:pBdr>
+      <w:shd w:val="clear" w:color="auto" w:fill="F9F9F9"/>
+      <w:spacing w:before="100" w:beforeAutospacing="1" w:after="210"/>
+      <w:jc w:val="both"/>
+    </w:pPr>
+    <w:rPr>
+      <w:rFonts w:ascii="Arial" w:hAnsi="Arial" w:cs="Arial"/>
       <w:sz w:val="19"/>
       <w:szCs w:val="19"/>
     </w:rPr>
@@ -7603,14 +7290,6 @@
     <w:pPr>
       <w:spacing w:before="100" w:beforeAutospacing="1" w:after="60"/>
       <w:jc w:val="both"/>
-    </w:pPr>
-  </w:style>
-  <w:style w:type="paragraph" w:customStyle="1" w:styleId="diagram-container">
-    <w:name w:val="diagram-container"/>
-    <w:basedOn w:val="Normal"/>
-    <w:pPr>
-      <w:spacing w:before="225" w:after="225"/>
-      <w:jc w:val="center"/>
     </w:pPr>
   </w:style>
   <w:style w:type="character" w:styleId="Strong">

</xml_diff>

<commit_message>
docs: physically embed all 11 screenshot images directly into docx package (word/media/)
</commit_message>
<xml_diff>
--- a/DevOps_Incident_Watchdog_Project_Report.docx
+++ b/DevOps_Incident_Watchdog_Project_Report.docx
@@ -103,7 +103,7 @@
     <w:p>
       <w:pPr>
         <w:jc w:val="center"/>
-        <w:divId w:val="1085497309"/>
+        <w:divId w:val="103961351"/>
         <w:rPr>
           <w:rFonts w:eastAsia="Times New Roman"/>
           <w:b/>
@@ -132,7 +132,7 @@
     <w:p>
       <w:pPr>
         <w:jc w:val="center"/>
-        <w:divId w:val="1159736742"/>
+        <w:divId w:val="1201238293"/>
         <w:rPr>
           <w:rFonts w:eastAsia="Times New Roman"/>
           <w:b/>
@@ -163,7 +163,7 @@
         <w:pStyle w:val="Heading1"/>
         <w:spacing w:after="180" w:afterAutospacing="0"/>
         <w:jc w:val="center"/>
-        <w:divId w:val="442849170"/>
+        <w:divId w:val="815876518"/>
         <w:rPr>
           <w:rFonts w:eastAsia="Times New Roman"/>
           <w:caps/>
@@ -200,7 +200,7 @@
     <w:p>
       <w:pPr>
         <w:jc w:val="center"/>
-        <w:divId w:val="1621188103"/>
+        <w:divId w:val="1573781656"/>
         <w:rPr>
           <w:rFonts w:eastAsia="Times New Roman"/>
           <w:b/>
@@ -227,7 +227,7 @@
     <w:p>
       <w:pPr>
         <w:jc w:val="center"/>
-        <w:divId w:val="1249773693"/>
+        <w:divId w:val="1361322075"/>
         <w:rPr>
           <w:rFonts w:eastAsia="Times New Roman"/>
           <w:b/>
@@ -254,7 +254,7 @@
     <w:p>
       <w:pPr>
         <w:jc w:val="center"/>
-        <w:divId w:val="44183699"/>
+        <w:divId w:val="1517768100"/>
         <w:rPr>
           <w:rFonts w:eastAsia="Times New Roman"/>
           <w:color w:val="4B5563"/>
@@ -827,7 +827,7 @@
     </w:p>
     <w:p>
       <w:pPr>
-        <w:divId w:val="1328166543"/>
+        <w:divId w:val="1995135634"/>
         <w:rPr>
           <w:rFonts w:eastAsia="Times New Roman"/>
           <w:color w:val="111827"/>
@@ -850,7 +850,7 @@
     </w:p>
     <w:p>
       <w:pPr>
-        <w:divId w:val="928200235"/>
+        <w:divId w:val="974407561"/>
         <w:rPr>
           <w:rFonts w:eastAsia="Times New Roman"/>
           <w:color w:val="111827"/>
@@ -873,7 +873,7 @@
     </w:p>
     <w:p>
       <w:pPr>
-        <w:divId w:val="889923931"/>
+        <w:divId w:val="2041078346"/>
         <w:rPr>
           <w:rFonts w:eastAsia="Times New Roman"/>
           <w:color w:val="111827"/>
@@ -896,7 +896,7 @@
     </w:p>
     <w:p>
       <w:pPr>
-        <w:divId w:val="477571469"/>
+        <w:divId w:val="1224410927"/>
         <w:rPr>
           <w:rFonts w:eastAsia="Times New Roman"/>
           <w:color w:val="111827"/>
@@ -919,7 +919,7 @@
     </w:p>
     <w:p>
       <w:pPr>
-        <w:divId w:val="676542516"/>
+        <w:divId w:val="317727689"/>
         <w:rPr>
           <w:rFonts w:eastAsia="Times New Roman"/>
           <w:color w:val="111827"/>
@@ -941,7 +941,7 @@
     </w:p>
     <w:p>
       <w:pPr>
-        <w:divId w:val="734620020"/>
+        <w:divId w:val="1906649225"/>
         <w:rPr>
           <w:rFonts w:eastAsia="Times New Roman"/>
           <w:color w:val="111827"/>
@@ -963,7 +963,7 @@
     </w:p>
     <w:p>
       <w:pPr>
-        <w:divId w:val="607085393"/>
+        <w:divId w:val="536744901"/>
         <w:rPr>
           <w:rFonts w:eastAsia="Times New Roman"/>
           <w:color w:val="111827"/>
@@ -985,7 +985,7 @@
     </w:p>
     <w:p>
       <w:pPr>
-        <w:divId w:val="898443264"/>
+        <w:divId w:val="55205300"/>
         <w:rPr>
           <w:rFonts w:eastAsia="Times New Roman"/>
           <w:color w:val="111827"/>
@@ -1007,7 +1007,7 @@
     </w:p>
     <w:p>
       <w:pPr>
-        <w:divId w:val="682367829"/>
+        <w:divId w:val="1780762406"/>
         <w:rPr>
           <w:rFonts w:eastAsia="Times New Roman"/>
           <w:color w:val="111827"/>
@@ -1029,7 +1029,7 @@
     </w:p>
     <w:p>
       <w:pPr>
-        <w:divId w:val="437680328"/>
+        <w:divId w:val="649092967"/>
         <w:rPr>
           <w:rFonts w:eastAsia="Times New Roman"/>
           <w:color w:val="111827"/>
@@ -1052,7 +1052,7 @@
     </w:p>
     <w:p>
       <w:pPr>
-        <w:divId w:val="738097861"/>
+        <w:divId w:val="145637170"/>
         <w:rPr>
           <w:rFonts w:eastAsia="Times New Roman"/>
           <w:color w:val="111827"/>
@@ -1074,7 +1074,7 @@
     </w:p>
     <w:p>
       <w:pPr>
-        <w:divId w:val="377776339"/>
+        <w:divId w:val="236674452"/>
         <w:rPr>
           <w:rFonts w:eastAsia="Times New Roman"/>
           <w:color w:val="111827"/>
@@ -1096,7 +1096,7 @@
     </w:p>
     <w:p>
       <w:pPr>
-        <w:divId w:val="21906121"/>
+        <w:divId w:val="593167349"/>
         <w:rPr>
           <w:rFonts w:eastAsia="Times New Roman"/>
           <w:color w:val="111827"/>
@@ -1118,7 +1118,7 @@
     </w:p>
     <w:p>
       <w:pPr>
-        <w:divId w:val="617227598"/>
+        <w:divId w:val="1344748492"/>
         <w:rPr>
           <w:rFonts w:eastAsia="Times New Roman"/>
           <w:color w:val="111827"/>
@@ -1140,7 +1140,7 @@
     </w:p>
     <w:p>
       <w:pPr>
-        <w:divId w:val="644774411"/>
+        <w:divId w:val="576985182"/>
         <w:rPr>
           <w:rFonts w:eastAsia="Times New Roman"/>
           <w:color w:val="111827"/>
@@ -1162,7 +1162,7 @@
     </w:p>
     <w:p>
       <w:pPr>
-        <w:divId w:val="632518559"/>
+        <w:divId w:val="1456827375"/>
         <w:rPr>
           <w:rFonts w:eastAsia="Times New Roman"/>
           <w:color w:val="111827"/>
@@ -1184,7 +1184,7 @@
     </w:p>
     <w:p>
       <w:pPr>
-        <w:divId w:val="1107701459"/>
+        <w:divId w:val="1797024859"/>
         <w:rPr>
           <w:rFonts w:eastAsia="Times New Roman"/>
           <w:color w:val="111827"/>
@@ -1206,7 +1206,7 @@
     </w:p>
     <w:p>
       <w:pPr>
-        <w:divId w:val="1518546121"/>
+        <w:divId w:val="2009822379"/>
         <w:rPr>
           <w:rFonts w:eastAsia="Times New Roman"/>
           <w:color w:val="111827"/>
@@ -1229,7 +1229,7 @@
     </w:p>
     <w:p>
       <w:pPr>
-        <w:divId w:val="885601177"/>
+        <w:divId w:val="1815218827"/>
         <w:rPr>
           <w:rFonts w:eastAsia="Times New Roman"/>
           <w:color w:val="111827"/>
@@ -1251,7 +1251,7 @@
     </w:p>
     <w:p>
       <w:pPr>
-        <w:divId w:val="179779552"/>
+        <w:divId w:val="1956254059"/>
         <w:rPr>
           <w:rFonts w:eastAsia="Times New Roman"/>
           <w:color w:val="111827"/>
@@ -1273,7 +1273,7 @@
     </w:p>
     <w:p>
       <w:pPr>
-        <w:divId w:val="739059830"/>
+        <w:divId w:val="1312371599"/>
         <w:rPr>
           <w:rFonts w:eastAsia="Times New Roman"/>
           <w:color w:val="111827"/>
@@ -1295,7 +1295,7 @@
     </w:p>
     <w:p>
       <w:pPr>
-        <w:divId w:val="1071078600"/>
+        <w:divId w:val="117264808"/>
         <w:rPr>
           <w:rFonts w:eastAsia="Times New Roman"/>
           <w:color w:val="111827"/>
@@ -1317,7 +1317,7 @@
     </w:p>
     <w:p>
       <w:pPr>
-        <w:divId w:val="256602731"/>
+        <w:divId w:val="795955627"/>
         <w:rPr>
           <w:rFonts w:eastAsia="Times New Roman"/>
           <w:color w:val="111827"/>
@@ -1339,7 +1339,7 @@
     </w:p>
     <w:p>
       <w:pPr>
-        <w:divId w:val="559512976"/>
+        <w:divId w:val="728726996"/>
         <w:rPr>
           <w:rFonts w:eastAsia="Times New Roman"/>
           <w:color w:val="111827"/>
@@ -1361,7 +1361,7 @@
     </w:p>
     <w:p>
       <w:pPr>
-        <w:divId w:val="846796242"/>
+        <w:divId w:val="1323462125"/>
         <w:rPr>
           <w:rFonts w:eastAsia="Times New Roman"/>
           <w:color w:val="111827"/>
@@ -1383,7 +1383,7 @@
     </w:p>
     <w:p>
       <w:pPr>
-        <w:divId w:val="607584413"/>
+        <w:divId w:val="1084573791"/>
         <w:rPr>
           <w:rFonts w:eastAsia="Times New Roman"/>
           <w:color w:val="111827"/>
@@ -1405,7 +1405,7 @@
     </w:p>
     <w:p>
       <w:pPr>
-        <w:divId w:val="420954913"/>
+        <w:divId w:val="241724020"/>
         <w:rPr>
           <w:rFonts w:eastAsia="Times New Roman"/>
           <w:color w:val="111827"/>
@@ -1427,7 +1427,7 @@
     </w:p>
     <w:p>
       <w:pPr>
-        <w:divId w:val="1667318424"/>
+        <w:divId w:val="2039308751"/>
         <w:rPr>
           <w:rFonts w:eastAsia="Times New Roman"/>
           <w:color w:val="111827"/>
@@ -1450,7 +1450,7 @@
     </w:p>
     <w:p>
       <w:pPr>
-        <w:divId w:val="1853717150"/>
+        <w:divId w:val="1655451743"/>
         <w:rPr>
           <w:rFonts w:eastAsia="Times New Roman"/>
           <w:color w:val="111827"/>
@@ -1472,7 +1472,7 @@
     </w:p>
     <w:p>
       <w:pPr>
-        <w:divId w:val="439953060"/>
+        <w:divId w:val="913708478"/>
         <w:rPr>
           <w:rFonts w:eastAsia="Times New Roman"/>
           <w:color w:val="111827"/>
@@ -1494,7 +1494,7 @@
     </w:p>
     <w:p>
       <w:pPr>
-        <w:divId w:val="2123845107"/>
+        <w:divId w:val="702945232"/>
         <w:rPr>
           <w:rFonts w:eastAsia="Times New Roman"/>
           <w:color w:val="111827"/>
@@ -1516,7 +1516,7 @@
     </w:p>
     <w:p>
       <w:pPr>
-        <w:divId w:val="2033796752"/>
+        <w:divId w:val="394352838"/>
         <w:rPr>
           <w:rFonts w:eastAsia="Times New Roman"/>
           <w:color w:val="111827"/>
@@ -1538,7 +1538,7 @@
     </w:p>
     <w:p>
       <w:pPr>
-        <w:divId w:val="665018838"/>
+        <w:divId w:val="1130712234"/>
         <w:rPr>
           <w:rFonts w:eastAsia="Times New Roman"/>
           <w:color w:val="111827"/>
@@ -1560,7 +1560,7 @@
     </w:p>
     <w:p>
       <w:pPr>
-        <w:divId w:val="45685189"/>
+        <w:divId w:val="640110425"/>
         <w:rPr>
           <w:rFonts w:eastAsia="Times New Roman"/>
           <w:color w:val="111827"/>
@@ -1592,7 +1592,7 @@
     </w:p>
     <w:p>
       <w:pPr>
-        <w:divId w:val="927079622"/>
+        <w:divId w:val="766386172"/>
         <w:rPr>
           <w:rFonts w:eastAsia="Times New Roman"/>
           <w:color w:val="111827"/>
@@ -1614,7 +1614,7 @@
     </w:p>
     <w:p>
       <w:pPr>
-        <w:divId w:val="2071464159"/>
+        <w:divId w:val="648438702"/>
         <w:rPr>
           <w:rFonts w:eastAsia="Times New Roman"/>
           <w:color w:val="111827"/>
@@ -1637,7 +1637,7 @@
     </w:p>
     <w:p>
       <w:pPr>
-        <w:divId w:val="1766343112"/>
+        <w:divId w:val="603615655"/>
         <w:rPr>
           <w:rFonts w:eastAsia="Times New Roman"/>
           <w:color w:val="111827"/>
@@ -1659,7 +1659,7 @@
     </w:p>
     <w:p>
       <w:pPr>
-        <w:divId w:val="965694766"/>
+        <w:divId w:val="1189561362"/>
         <w:rPr>
           <w:rFonts w:eastAsia="Times New Roman"/>
           <w:color w:val="111827"/>
@@ -1681,7 +1681,7 @@
     </w:p>
     <w:p>
       <w:pPr>
-        <w:divId w:val="1439714065"/>
+        <w:divId w:val="294914092"/>
         <w:rPr>
           <w:rFonts w:eastAsia="Times New Roman"/>
           <w:color w:val="111827"/>
@@ -1703,7 +1703,7 @@
     </w:p>
     <w:p>
       <w:pPr>
-        <w:divId w:val="1703896451"/>
+        <w:divId w:val="2062515057"/>
         <w:rPr>
           <w:rFonts w:eastAsia="Times New Roman"/>
           <w:color w:val="111827"/>
@@ -1725,7 +1725,7 @@
     </w:p>
     <w:p>
       <w:pPr>
-        <w:divId w:val="46221292"/>
+        <w:divId w:val="1406798315"/>
         <w:rPr>
           <w:rFonts w:eastAsia="Times New Roman"/>
           <w:color w:val="111827"/>
@@ -1747,7 +1747,7 @@
     </w:p>
     <w:p>
       <w:pPr>
-        <w:divId w:val="1011181688"/>
+        <w:divId w:val="365448426"/>
         <w:rPr>
           <w:rFonts w:eastAsia="Times New Roman"/>
           <w:color w:val="111827"/>
@@ -1769,7 +1769,7 @@
     </w:p>
     <w:p>
       <w:pPr>
-        <w:divId w:val="1499227143"/>
+        <w:divId w:val="1091009455"/>
         <w:rPr>
           <w:rFonts w:eastAsia="Times New Roman"/>
           <w:color w:val="111827"/>
@@ -1791,7 +1791,7 @@
     </w:p>
     <w:p>
       <w:pPr>
-        <w:divId w:val="2134595310"/>
+        <w:divId w:val="93592637"/>
         <w:rPr>
           <w:rFonts w:eastAsia="Times New Roman"/>
           <w:color w:val="111827"/>
@@ -1813,7 +1813,7 @@
     </w:p>
     <w:p>
       <w:pPr>
-        <w:divId w:val="471875571"/>
+        <w:divId w:val="1400446974"/>
         <w:rPr>
           <w:rFonts w:eastAsia="Times New Roman"/>
           <w:color w:val="111827"/>
@@ -1835,7 +1835,7 @@
     </w:p>
     <w:p>
       <w:pPr>
-        <w:divId w:val="1479687782"/>
+        <w:divId w:val="1472939998"/>
         <w:rPr>
           <w:rFonts w:eastAsia="Times New Roman"/>
           <w:color w:val="111827"/>
@@ -1857,7 +1857,7 @@
     </w:p>
     <w:p>
       <w:pPr>
-        <w:divId w:val="1902790356"/>
+        <w:divId w:val="597952356"/>
         <w:rPr>
           <w:rFonts w:eastAsia="Times New Roman"/>
           <w:color w:val="111827"/>
@@ -1995,7 +1995,7 @@
     </w:tbl>
     <w:p>
       <w:pPr>
-        <w:divId w:val="1527598490"/>
+        <w:divId w:val="1500001157"/>
         <w:rPr>
           <w:rFonts w:eastAsia="Times New Roman"/>
           <w:color w:val="111827"/>
@@ -2018,7 +2018,7 @@
     </w:p>
     <w:p>
       <w:pPr>
-        <w:divId w:val="734738688"/>
+        <w:divId w:val="165484497"/>
         <w:rPr>
           <w:rFonts w:eastAsia="Times New Roman"/>
           <w:color w:val="111827"/>
@@ -2040,7 +2040,7 @@
     </w:p>
     <w:p>
       <w:pPr>
-        <w:divId w:val="1154102799"/>
+        <w:divId w:val="1126237973"/>
         <w:rPr>
           <w:rFonts w:eastAsia="Times New Roman"/>
           <w:color w:val="111827"/>
@@ -2062,7 +2062,7 @@
     </w:p>
     <w:p>
       <w:pPr>
-        <w:divId w:val="1712419231"/>
+        <w:divId w:val="865144410"/>
         <w:rPr>
           <w:rFonts w:eastAsia="Times New Roman"/>
           <w:color w:val="111827"/>
@@ -2084,7 +2084,7 @@
     </w:p>
     <w:p>
       <w:pPr>
-        <w:divId w:val="2072383270"/>
+        <w:divId w:val="815295679"/>
         <w:rPr>
           <w:rFonts w:eastAsia="Times New Roman"/>
           <w:color w:val="111827"/>
@@ -2106,7 +2106,7 @@
     </w:p>
     <w:p>
       <w:pPr>
-        <w:divId w:val="1092625422"/>
+        <w:divId w:val="2016614968"/>
         <w:rPr>
           <w:rFonts w:eastAsia="Times New Roman"/>
           <w:color w:val="111827"/>
@@ -2128,7 +2128,7 @@
     </w:p>
     <w:p>
       <w:pPr>
-        <w:divId w:val="1022056117"/>
+        <w:divId w:val="1784223700"/>
         <w:rPr>
           <w:rFonts w:eastAsia="Times New Roman"/>
           <w:color w:val="111827"/>
@@ -2150,7 +2150,7 @@
     </w:p>
     <w:p>
       <w:pPr>
-        <w:divId w:val="129640976"/>
+        <w:divId w:val="777725173"/>
         <w:rPr>
           <w:rFonts w:eastAsia="Times New Roman"/>
           <w:color w:val="111827"/>
@@ -2172,7 +2172,7 @@
     </w:p>
     <w:p>
       <w:pPr>
-        <w:divId w:val="910194295"/>
+        <w:divId w:val="1425107483"/>
         <w:rPr>
           <w:rFonts w:eastAsia="Times New Roman"/>
           <w:color w:val="111827"/>
@@ -2194,7 +2194,7 @@
     </w:p>
     <w:p>
       <w:pPr>
-        <w:divId w:val="1882594230"/>
+        <w:divId w:val="1104426602"/>
         <w:rPr>
           <w:rFonts w:eastAsia="Times New Roman"/>
           <w:color w:val="111827"/>
@@ -2216,7 +2216,7 @@
     </w:p>
     <w:p>
       <w:pPr>
-        <w:divId w:val="519469162"/>
+        <w:divId w:val="282616266"/>
         <w:rPr>
           <w:rFonts w:eastAsia="Times New Roman"/>
           <w:color w:val="111827"/>
@@ -2238,7 +2238,7 @@
     </w:p>
     <w:p>
       <w:pPr>
-        <w:divId w:val="331220833"/>
+        <w:divId w:val="446240679"/>
         <w:rPr>
           <w:rFonts w:eastAsia="Times New Roman"/>
           <w:color w:val="111827"/>
@@ -2261,7 +2261,7 @@
     </w:p>
     <w:p>
       <w:pPr>
-        <w:divId w:val="727338973"/>
+        <w:divId w:val="28530764"/>
         <w:rPr>
           <w:rFonts w:eastAsia="Times New Roman"/>
           <w:color w:val="111827"/>
@@ -2283,7 +2283,7 @@
     </w:p>
     <w:p>
       <w:pPr>
-        <w:divId w:val="1599411791"/>
+        <w:divId w:val="1909725850"/>
         <w:rPr>
           <w:rFonts w:eastAsia="Times New Roman"/>
           <w:color w:val="111827"/>
@@ -2305,7 +2305,7 @@
     </w:p>
     <w:p>
       <w:pPr>
-        <w:divId w:val="1813519551"/>
+        <w:divId w:val="528026052"/>
         <w:rPr>
           <w:rFonts w:eastAsia="Times New Roman"/>
           <w:color w:val="111827"/>
@@ -2327,7 +2327,7 @@
     </w:p>
     <w:p>
       <w:pPr>
-        <w:divId w:val="1715930823"/>
+        <w:divId w:val="618491758"/>
         <w:rPr>
           <w:rFonts w:eastAsia="Times New Roman"/>
           <w:color w:val="111827"/>
@@ -2349,7 +2349,7 @@
     </w:p>
     <w:p>
       <w:pPr>
-        <w:divId w:val="2137796787"/>
+        <w:divId w:val="51540713"/>
         <w:rPr>
           <w:rFonts w:eastAsia="Times New Roman"/>
           <w:color w:val="111827"/>
@@ -2371,7 +2371,7 @@
     </w:p>
     <w:p>
       <w:pPr>
-        <w:divId w:val="1735614979"/>
+        <w:divId w:val="2008289974"/>
         <w:rPr>
           <w:rFonts w:eastAsia="Times New Roman"/>
           <w:color w:val="111827"/>
@@ -2393,7 +2393,7 @@
     </w:p>
     <w:p>
       <w:pPr>
-        <w:divId w:val="996570489"/>
+        <w:divId w:val="1805079457"/>
         <w:rPr>
           <w:rFonts w:eastAsia="Times New Roman"/>
           <w:color w:val="111827"/>
@@ -2415,7 +2415,7 @@
     </w:p>
     <w:p>
       <w:pPr>
-        <w:divId w:val="1464813549"/>
+        <w:divId w:val="1912765569"/>
         <w:rPr>
           <w:rFonts w:eastAsia="Times New Roman"/>
           <w:color w:val="111827"/>
@@ -2437,7 +2437,7 @@
     </w:p>
     <w:p>
       <w:pPr>
-        <w:divId w:val="1896116112"/>
+        <w:divId w:val="91780584"/>
         <w:rPr>
           <w:rFonts w:eastAsia="Times New Roman"/>
           <w:color w:val="111827"/>
@@ -2459,7 +2459,7 @@
     </w:p>
     <w:p>
       <w:pPr>
-        <w:divId w:val="596865715"/>
+        <w:divId w:val="1736466910"/>
         <w:rPr>
           <w:rFonts w:eastAsia="Times New Roman"/>
           <w:color w:val="111827"/>
@@ -2481,7 +2481,7 @@
     </w:p>
     <w:p>
       <w:pPr>
-        <w:divId w:val="1680430488"/>
+        <w:divId w:val="802112952"/>
         <w:rPr>
           <w:rFonts w:eastAsia="Times New Roman"/>
           <w:color w:val="111827"/>
@@ -2503,7 +2503,7 @@
     </w:p>
     <w:p>
       <w:pPr>
-        <w:divId w:val="1470126880"/>
+        <w:divId w:val="950822181"/>
         <w:rPr>
           <w:rFonts w:eastAsia="Times New Roman"/>
           <w:color w:val="111827"/>
@@ -2525,7 +2525,7 @@
     </w:p>
     <w:p>
       <w:pPr>
-        <w:divId w:val="241181834"/>
+        <w:divId w:val="1813015029"/>
         <w:rPr>
           <w:rFonts w:eastAsia="Times New Roman"/>
           <w:color w:val="111827"/>
@@ -2548,7 +2548,7 @@
     </w:p>
     <w:p>
       <w:pPr>
-        <w:divId w:val="1738360337"/>
+        <w:divId w:val="247427901"/>
         <w:rPr>
           <w:rFonts w:eastAsia="Times New Roman"/>
           <w:color w:val="111827"/>
@@ -2570,7 +2570,7 @@
     </w:p>
     <w:p>
       <w:pPr>
-        <w:divId w:val="527762838"/>
+        <w:divId w:val="513155548"/>
         <w:rPr>
           <w:rFonts w:eastAsia="Times New Roman"/>
           <w:color w:val="111827"/>
@@ -2592,7 +2592,7 @@
     </w:p>
     <w:p>
       <w:pPr>
-        <w:divId w:val="1211962386"/>
+        <w:divId w:val="382800380"/>
         <w:rPr>
           <w:rFonts w:eastAsia="Times New Roman"/>
           <w:color w:val="111827"/>
@@ -2614,7 +2614,7 @@
     </w:p>
     <w:p>
       <w:pPr>
-        <w:divId w:val="289479341"/>
+        <w:divId w:val="2045400468"/>
         <w:rPr>
           <w:rFonts w:eastAsia="Times New Roman"/>
           <w:color w:val="111827"/>
@@ -2636,7 +2636,7 @@
     </w:p>
     <w:p>
       <w:pPr>
-        <w:divId w:val="2030986116"/>
+        <w:divId w:val="833954974"/>
         <w:rPr>
           <w:rFonts w:eastAsia="Times New Roman"/>
           <w:color w:val="111827"/>
@@ -2658,7 +2658,7 @@
     </w:p>
     <w:p>
       <w:pPr>
-        <w:divId w:val="1784305710"/>
+        <w:divId w:val="1426153725"/>
         <w:rPr>
           <w:rFonts w:eastAsia="Times New Roman"/>
           <w:color w:val="111827"/>
@@ -2680,7 +2680,7 @@
     </w:p>
     <w:p>
       <w:pPr>
-        <w:divId w:val="1857037146"/>
+        <w:divId w:val="1883402895"/>
         <w:rPr>
           <w:rFonts w:eastAsia="Times New Roman"/>
           <w:color w:val="111827"/>
@@ -2702,7 +2702,7 @@
     </w:p>
     <w:p>
       <w:pPr>
-        <w:divId w:val="1214348518"/>
+        <w:divId w:val="101152555"/>
         <w:rPr>
           <w:rFonts w:eastAsia="Times New Roman"/>
           <w:color w:val="111827"/>
@@ -2724,7 +2724,7 @@
     </w:p>
     <w:p>
       <w:pPr>
-        <w:divId w:val="705373955"/>
+        <w:divId w:val="1704011488"/>
         <w:rPr>
           <w:rFonts w:eastAsia="Times New Roman"/>
           <w:color w:val="111827"/>
@@ -2746,7 +2746,7 @@
     </w:p>
     <w:p>
       <w:pPr>
-        <w:divId w:val="656690931"/>
+        <w:divId w:val="67308379"/>
         <w:rPr>
           <w:rFonts w:eastAsia="Times New Roman"/>
           <w:color w:val="111827"/>
@@ -2768,7 +2768,7 @@
     </w:p>
     <w:p>
       <w:pPr>
-        <w:divId w:val="1379474354"/>
+        <w:divId w:val="530193138"/>
         <w:rPr>
           <w:rFonts w:eastAsia="Times New Roman"/>
           <w:color w:val="111827"/>
@@ -2791,7 +2791,7 @@
     </w:p>
     <w:p>
       <w:pPr>
-        <w:divId w:val="417215811"/>
+        <w:divId w:val="916979830"/>
         <w:rPr>
           <w:rFonts w:eastAsia="Times New Roman"/>
           <w:color w:val="111827"/>
@@ -2813,7 +2813,7 @@
     </w:p>
     <w:p>
       <w:pPr>
-        <w:divId w:val="1804302019"/>
+        <w:divId w:val="679967146"/>
         <w:rPr>
           <w:rFonts w:eastAsia="Times New Roman"/>
           <w:color w:val="111827"/>
@@ -2835,7 +2835,7 @@
     </w:p>
     <w:p>
       <w:pPr>
-        <w:divId w:val="1378042391"/>
+        <w:divId w:val="200244624"/>
         <w:rPr>
           <w:rFonts w:eastAsia="Times New Roman"/>
           <w:color w:val="111827"/>
@@ -2857,7 +2857,7 @@
     </w:p>
     <w:p>
       <w:pPr>
-        <w:divId w:val="386493542"/>
+        <w:divId w:val="903108053"/>
         <w:rPr>
           <w:rFonts w:eastAsia="Times New Roman"/>
           <w:color w:val="111827"/>
@@ -2879,7 +2879,7 @@
     </w:p>
     <w:p>
       <w:pPr>
-        <w:divId w:val="520823990"/>
+        <w:divId w:val="1690982986"/>
         <w:rPr>
           <w:rFonts w:eastAsia="Times New Roman"/>
           <w:color w:val="111827"/>
@@ -2902,7 +2902,7 @@
     </w:p>
     <w:p>
       <w:pPr>
-        <w:divId w:val="1798138333"/>
+        <w:divId w:val="1874492441"/>
         <w:rPr>
           <w:rFonts w:eastAsia="Times New Roman"/>
           <w:color w:val="111827"/>
@@ -2924,7 +2924,7 @@
     </w:p>
     <w:p>
       <w:pPr>
-        <w:divId w:val="1652439360"/>
+        <w:divId w:val="1788768650"/>
         <w:rPr>
           <w:rFonts w:eastAsia="Times New Roman"/>
           <w:color w:val="111827"/>
@@ -2946,7 +2946,7 @@
     </w:p>
     <w:p>
       <w:pPr>
-        <w:divId w:val="1639726970"/>
+        <w:divId w:val="1710913360"/>
         <w:rPr>
           <w:rFonts w:eastAsia="Times New Roman"/>
           <w:color w:val="111827"/>
@@ -2968,7 +2968,7 @@
     </w:p>
     <w:p>
       <w:pPr>
-        <w:divId w:val="1499730533"/>
+        <w:divId w:val="1510213062"/>
         <w:rPr>
           <w:rFonts w:eastAsia="Times New Roman"/>
           <w:color w:val="111827"/>
@@ -2990,7 +2990,7 @@
     </w:p>
     <w:p>
       <w:pPr>
-        <w:divId w:val="1062871116"/>
+        <w:divId w:val="400949686"/>
         <w:rPr>
           <w:rFonts w:eastAsia="Times New Roman"/>
           <w:color w:val="111827"/>
@@ -3013,7 +3013,7 @@
     </w:p>
     <w:p>
       <w:pPr>
-        <w:divId w:val="425156457"/>
+        <w:divId w:val="450440911"/>
         <w:rPr>
           <w:rFonts w:eastAsia="Times New Roman"/>
           <w:color w:val="111827"/>
@@ -3036,7 +3036,7 @@
     </w:p>
     <w:p>
       <w:pPr>
-        <w:divId w:val="1493831216"/>
+        <w:divId w:val="1212812586"/>
         <w:rPr>
           <w:rFonts w:eastAsia="Times New Roman"/>
           <w:color w:val="111827"/>
@@ -3058,7 +3058,7 @@
     </w:p>
     <w:p>
       <w:pPr>
-        <w:divId w:val="1095714233"/>
+        <w:divId w:val="52431420"/>
         <w:rPr>
           <w:rFonts w:eastAsia="Times New Roman"/>
           <w:color w:val="111827"/>
@@ -3080,7 +3080,7 @@
     </w:p>
     <w:p>
       <w:pPr>
-        <w:divId w:val="2016567139"/>
+        <w:divId w:val="410737903"/>
         <w:rPr>
           <w:rFonts w:eastAsia="Times New Roman"/>
           <w:color w:val="111827"/>
@@ -3102,7 +3102,7 @@
     </w:p>
     <w:p>
       <w:pPr>
-        <w:divId w:val="62919982"/>
+        <w:divId w:val="1819030841"/>
         <w:rPr>
           <w:rFonts w:eastAsia="Times New Roman"/>
           <w:color w:val="111827"/>
@@ -3264,7 +3264,7 @@
     </w:p>
     <w:p>
       <w:pPr>
-        <w:divId w:val="2109812655"/>
+        <w:divId w:val="1567569837"/>
         <w:rPr>
           <w:rFonts w:eastAsia="Times New Roman"/>
           <w:color w:val="111827"/>
@@ -3286,7 +3286,7 @@
     </w:p>
     <w:p>
       <w:pPr>
-        <w:divId w:val="1782802683"/>
+        <w:divId w:val="202446818"/>
         <w:rPr>
           <w:rFonts w:eastAsia="Times New Roman"/>
           <w:color w:val="111827"/>
@@ -3308,7 +3308,7 @@
     </w:p>
     <w:p>
       <w:pPr>
-        <w:divId w:val="78019802"/>
+        <w:divId w:val="1426269262"/>
         <w:rPr>
           <w:rFonts w:eastAsia="Times New Roman"/>
           <w:color w:val="111827"/>
@@ -3330,7 +3330,7 @@
     </w:p>
     <w:p>
       <w:pPr>
-        <w:divId w:val="1946693991"/>
+        <w:divId w:val="1279800094"/>
         <w:rPr>
           <w:rFonts w:eastAsia="Times New Roman"/>
           <w:color w:val="111827"/>
@@ -3352,7 +3352,7 @@
     </w:p>
     <w:p>
       <w:pPr>
-        <w:divId w:val="1226260043"/>
+        <w:divId w:val="527302889"/>
         <w:rPr>
           <w:rFonts w:eastAsia="Times New Roman"/>
           <w:color w:val="111827"/>
@@ -3374,7 +3374,7 @@
     </w:p>
     <w:p>
       <w:pPr>
-        <w:divId w:val="1599412634"/>
+        <w:divId w:val="2098135903"/>
         <w:rPr>
           <w:rFonts w:eastAsia="Times New Roman"/>
           <w:color w:val="111827"/>
@@ -3396,7 +3396,7 @@
     </w:p>
     <w:p>
       <w:pPr>
-        <w:divId w:val="1240168480"/>
+        <w:divId w:val="1317493523"/>
         <w:rPr>
           <w:rFonts w:eastAsia="Times New Roman"/>
           <w:color w:val="111827"/>
@@ -3418,7 +3418,7 @@
     </w:p>
     <w:p>
       <w:pPr>
-        <w:divId w:val="2146196233"/>
+        <w:divId w:val="137572221"/>
         <w:rPr>
           <w:rFonts w:eastAsia="Times New Roman"/>
           <w:color w:val="111827"/>
@@ -3440,7 +3440,7 @@
     </w:p>
     <w:p>
       <w:pPr>
-        <w:divId w:val="329212375"/>
+        <w:divId w:val="1605379525"/>
         <w:rPr>
           <w:rFonts w:eastAsia="Times New Roman"/>
           <w:color w:val="111827"/>
@@ -3462,7 +3462,7 @@
     </w:p>
     <w:p>
       <w:pPr>
-        <w:divId w:val="749351428"/>
+        <w:divId w:val="2129815983"/>
         <w:rPr>
           <w:rFonts w:eastAsia="Times New Roman"/>
           <w:color w:val="111827"/>
@@ -3484,7 +3484,7 @@
     </w:p>
     <w:p>
       <w:pPr>
-        <w:divId w:val="1460026957"/>
+        <w:divId w:val="394200393"/>
         <w:rPr>
           <w:rFonts w:eastAsia="Times New Roman"/>
           <w:color w:val="111827"/>
@@ -3530,7 +3530,7 @@
     </w:p>
     <w:p>
       <w:pPr>
-        <w:divId w:val="1930458352"/>
+        <w:divId w:val="27487356"/>
         <w:rPr>
           <w:rFonts w:eastAsia="Times New Roman"/>
           <w:color w:val="111827"/>
@@ -3552,7 +3552,7 @@
     </w:p>
     <w:p>
       <w:pPr>
-        <w:divId w:val="975528154"/>
+        <w:divId w:val="187724982"/>
         <w:rPr>
           <w:rFonts w:eastAsia="Times New Roman"/>
           <w:color w:val="111827"/>
@@ -3574,7 +3574,7 @@
     </w:p>
     <w:p>
       <w:pPr>
-        <w:divId w:val="514267593"/>
+        <w:divId w:val="557476987"/>
         <w:rPr>
           <w:rFonts w:eastAsia="Times New Roman"/>
           <w:color w:val="111827"/>
@@ -3596,7 +3596,7 @@
     </w:p>
     <w:p>
       <w:pPr>
-        <w:divId w:val="850333291"/>
+        <w:divId w:val="1699694706"/>
         <w:rPr>
           <w:rFonts w:eastAsia="Times New Roman"/>
           <w:color w:val="111827"/>
@@ -3618,7 +3618,7 @@
     </w:p>
     <w:p>
       <w:pPr>
-        <w:divId w:val="704871288"/>
+        <w:divId w:val="1369837875"/>
         <w:rPr>
           <w:rFonts w:eastAsia="Times New Roman"/>
           <w:color w:val="111827"/>
@@ -3640,7 +3640,7 @@
     </w:p>
     <w:p>
       <w:pPr>
-        <w:divId w:val="1340502568"/>
+        <w:divId w:val="1346781342"/>
         <w:rPr>
           <w:rFonts w:eastAsia="Times New Roman"/>
           <w:color w:val="111827"/>
@@ -3662,7 +3662,7 @@
     </w:p>
     <w:p>
       <w:pPr>
-        <w:divId w:val="218250265"/>
+        <w:divId w:val="440339658"/>
         <w:rPr>
           <w:rFonts w:eastAsia="Times New Roman"/>
           <w:color w:val="111827"/>
@@ -3694,7 +3694,7 @@
     </w:p>
     <w:p>
       <w:pPr>
-        <w:divId w:val="435518497"/>
+        <w:divId w:val="650328332"/>
         <w:rPr>
           <w:rFonts w:eastAsia="Times New Roman"/>
           <w:color w:val="111827"/>
@@ -3716,7 +3716,7 @@
     </w:p>
     <w:p>
       <w:pPr>
-        <w:divId w:val="559757194"/>
+        <w:divId w:val="649134238"/>
         <w:rPr>
           <w:rFonts w:eastAsia="Times New Roman"/>
           <w:color w:val="111827"/>
@@ -13991,7 +13991,7 @@
     <w:p>
       <w:pPr>
         <w:jc w:val="center"/>
-        <w:divId w:val="583877155"/>
+        <w:divId w:val="754010103"/>
         <w:rPr>
           <w:rFonts w:eastAsia="Times New Roman"/>
           <w:color w:val="111827"/>
@@ -14010,47 +14010,38 @@
           <w:lang w:val="en"/>
         </w:rPr>
         <w:drawing>
-          <wp:inline distT="0" distB="0" distL="0" distR="0" wp14:anchorId="3B90B4D1" wp14:editId="20EA5FBD">
-            <wp:extent cx="304800" cy="304800"/>
-            <wp:effectExtent l="0" t="0" r="0" b="0"/>
-            <wp:docPr id="1" name="Picture 1" descr="High-Level Three-Tier System Architecture"/>
-            <wp:cNvGraphicFramePr>
-              <a:graphicFrameLocks xmlns:a="http://schemas.openxmlformats.org/drawingml/2006/main" noChangeAspect="1"/>
-            </wp:cNvGraphicFramePr>
+          <wp:inline distT="0" distB="0" distL="0" distR="0" wp14:anchorId="5382EE95" wp14:editId="38BE7B72">
+            <wp:extent cx="3632200" cy="2540000"/>
+            <wp:effectExtent l="0" t="0" r="6350" b="0"/>
+            <wp:docPr id="1467326768" name="Picture 11"/>
+            <wp:cNvGraphicFramePr/>
             <a:graphic xmlns:a="http://schemas.openxmlformats.org/drawingml/2006/main">
               <a:graphicData uri="http://schemas.openxmlformats.org/drawingml/2006/picture">
                 <pic:pic xmlns:pic="http://schemas.openxmlformats.org/drawingml/2006/picture">
                   <pic:nvPicPr>
-                    <pic:cNvPr id="0" name="Picture 1" descr="High-Level Three-Tier System Architecture"/>
-                    <pic:cNvPicPr>
-                      <a:picLocks noChangeAspect="1" noChangeArrowheads="1"/>
-                    </pic:cNvPicPr>
+                    <pic:cNvPr id="1467326768" name=""/>
+                    <pic:cNvPicPr/>
                   </pic:nvPicPr>
                   <pic:blipFill>
-                    <a:blip r:link="rId5">
+                    <a:blip r:embed="rId5" cstate="print">
                       <a:extLst>
                         <a:ext uri="{28A0092B-C50C-407E-A947-70E740481C1C}">
                           <a14:useLocalDpi xmlns:a14="http://schemas.microsoft.com/office/drawing/2010/main" val="0"/>
                         </a:ext>
                       </a:extLst>
                     </a:blip>
-                    <a:srcRect/>
                     <a:stretch>
                       <a:fillRect/>
                     </a:stretch>
                   </pic:blipFill>
-                  <pic:spPr bwMode="auto">
+                  <pic:spPr>
                     <a:xfrm>
                       <a:off x="0" y="0"/>
-                      <a:ext cx="304800" cy="304800"/>
+                      <a:ext cx="3632200" cy="2540000"/>
                     </a:xfrm>
                     <a:prstGeom prst="rect">
                       <a:avLst/>
                     </a:prstGeom>
-                    <a:noFill/>
-                    <a:ln>
-                      <a:noFill/>
-                    </a:ln>
                   </pic:spPr>
                 </pic:pic>
               </a:graphicData>
@@ -14062,7 +14053,7 @@
     <w:p>
       <w:pPr>
         <w:jc w:val="center"/>
-        <w:divId w:val="1184856488"/>
+        <w:divId w:val="1522164369"/>
         <w:rPr>
           <w:rFonts w:eastAsia="Times New Roman"/>
           <w:b/>
@@ -14997,7 +14988,7 @@
     <w:p>
       <w:pPr>
         <w:jc w:val="center"/>
-        <w:divId w:val="403796162"/>
+        <w:divId w:val="858012847"/>
         <w:rPr>
           <w:rFonts w:eastAsia="Times New Roman"/>
           <w:color w:val="111827"/>
@@ -15016,47 +15007,38 @@
           <w:lang w:val="en"/>
         </w:rPr>
         <w:drawing>
-          <wp:inline distT="0" distB="0" distL="0" distR="0" wp14:anchorId="6F72145A" wp14:editId="5371B974">
-            <wp:extent cx="304800" cy="304800"/>
-            <wp:effectExtent l="0" t="0" r="0" b="0"/>
-            <wp:docPr id="2" name="Picture 2" descr="End-to-End Workflow"/>
-            <wp:cNvGraphicFramePr>
-              <a:graphicFrameLocks xmlns:a="http://schemas.openxmlformats.org/drawingml/2006/main" noChangeAspect="1"/>
-            </wp:cNvGraphicFramePr>
+          <wp:inline distT="0" distB="0" distL="0" distR="0" wp14:anchorId="5D7DB75B" wp14:editId="335654F0">
+            <wp:extent cx="5943600" cy="930275"/>
+            <wp:effectExtent l="0" t="0" r="0" b="3175"/>
+            <wp:docPr id="1821810764" name="Picture 10"/>
+            <wp:cNvGraphicFramePr/>
             <a:graphic xmlns:a="http://schemas.openxmlformats.org/drawingml/2006/main">
               <a:graphicData uri="http://schemas.openxmlformats.org/drawingml/2006/picture">
                 <pic:pic xmlns:pic="http://schemas.openxmlformats.org/drawingml/2006/picture">
                   <pic:nvPicPr>
-                    <pic:cNvPr id="0" name="Picture 2" descr="End-to-End Workflow"/>
-                    <pic:cNvPicPr>
-                      <a:picLocks noChangeAspect="1" noChangeArrowheads="1"/>
-                    </pic:cNvPicPr>
+                    <pic:cNvPr id="1821810764" name=""/>
+                    <pic:cNvPicPr/>
                   </pic:nvPicPr>
                   <pic:blipFill>
-                    <a:blip r:link="rId6">
+                    <a:blip r:embed="rId6">
                       <a:extLst>
                         <a:ext uri="{28A0092B-C50C-407E-A947-70E740481C1C}">
                           <a14:useLocalDpi xmlns:a14="http://schemas.microsoft.com/office/drawing/2010/main" val="0"/>
                         </a:ext>
                       </a:extLst>
                     </a:blip>
-                    <a:srcRect/>
                     <a:stretch>
                       <a:fillRect/>
                     </a:stretch>
                   </pic:blipFill>
-                  <pic:spPr bwMode="auto">
+                  <pic:spPr>
                     <a:xfrm>
                       <a:off x="0" y="0"/>
-                      <a:ext cx="304800" cy="304800"/>
+                      <a:ext cx="5943600" cy="930275"/>
                     </a:xfrm>
                     <a:prstGeom prst="rect">
                       <a:avLst/>
                     </a:prstGeom>
-                    <a:noFill/>
-                    <a:ln>
-                      <a:noFill/>
-                    </a:ln>
                   </pic:spPr>
                 </pic:pic>
               </a:graphicData>
@@ -15068,7 +15050,7 @@
     <w:p>
       <w:pPr>
         <w:jc w:val="center"/>
-        <w:divId w:val="1982229550"/>
+        <w:divId w:val="283772807"/>
         <w:rPr>
           <w:rFonts w:eastAsia="Times New Roman"/>
           <w:b/>
@@ -15254,7 +15236,7 @@
     <w:p>
       <w:pPr>
         <w:jc w:val="center"/>
-        <w:divId w:val="123349189"/>
+        <w:divId w:val="1601988066"/>
         <w:rPr>
           <w:rFonts w:eastAsia="Times New Roman"/>
           <w:color w:val="111827"/>
@@ -15273,47 +15255,38 @@
           <w:lang w:val="en"/>
         </w:rPr>
         <w:drawing>
-          <wp:inline distT="0" distB="0" distL="0" distR="0" wp14:anchorId="081BC2D7" wp14:editId="7192ED14">
-            <wp:extent cx="304800" cy="304800"/>
-            <wp:effectExtent l="0" t="0" r="0" b="0"/>
-            <wp:docPr id="3" name="Picture 3" descr="Safety Gate Architecture"/>
-            <wp:cNvGraphicFramePr>
-              <a:graphicFrameLocks xmlns:a="http://schemas.openxmlformats.org/drawingml/2006/main" noChangeAspect="1"/>
-            </wp:cNvGraphicFramePr>
+          <wp:inline distT="0" distB="0" distL="0" distR="0" wp14:anchorId="24DED1DB" wp14:editId="660C74F2">
+            <wp:extent cx="5943600" cy="930275"/>
+            <wp:effectExtent l="0" t="0" r="0" b="3175"/>
+            <wp:docPr id="1125346419" name="Picture 9"/>
+            <wp:cNvGraphicFramePr/>
             <a:graphic xmlns:a="http://schemas.openxmlformats.org/drawingml/2006/main">
               <a:graphicData uri="http://schemas.openxmlformats.org/drawingml/2006/picture">
                 <pic:pic xmlns:pic="http://schemas.openxmlformats.org/drawingml/2006/picture">
                   <pic:nvPicPr>
-                    <pic:cNvPr id="0" name="Picture 3" descr="Safety Gate Architecture"/>
-                    <pic:cNvPicPr>
-                      <a:picLocks noChangeAspect="1" noChangeArrowheads="1"/>
-                    </pic:cNvPicPr>
+                    <pic:cNvPr id="1125346419" name=""/>
+                    <pic:cNvPicPr/>
                   </pic:nvPicPr>
                   <pic:blipFill>
-                    <a:blip r:link="rId7">
+                    <a:blip r:embed="rId7">
                       <a:extLst>
                         <a:ext uri="{28A0092B-C50C-407E-A947-70E740481C1C}">
                           <a14:useLocalDpi xmlns:a14="http://schemas.microsoft.com/office/drawing/2010/main" val="0"/>
                         </a:ext>
                       </a:extLst>
                     </a:blip>
-                    <a:srcRect/>
                     <a:stretch>
                       <a:fillRect/>
                     </a:stretch>
                   </pic:blipFill>
-                  <pic:spPr bwMode="auto">
+                  <pic:spPr>
                     <a:xfrm>
                       <a:off x="0" y="0"/>
-                      <a:ext cx="304800" cy="304800"/>
+                      <a:ext cx="5943600" cy="930275"/>
                     </a:xfrm>
                     <a:prstGeom prst="rect">
                       <a:avLst/>
                     </a:prstGeom>
-                    <a:noFill/>
-                    <a:ln>
-                      <a:noFill/>
-                    </a:ln>
                   </pic:spPr>
                 </pic:pic>
               </a:graphicData>
@@ -15325,7 +15298,7 @@
     <w:p>
       <w:pPr>
         <w:jc w:val="center"/>
-        <w:divId w:val="373966360"/>
+        <w:divId w:val="1065374316"/>
         <w:rPr>
           <w:rFonts w:eastAsia="Times New Roman"/>
           <w:b/>
@@ -15412,7 +15385,7 @@
     <w:p>
       <w:pPr>
         <w:jc w:val="center"/>
-        <w:divId w:val="396559546"/>
+        <w:divId w:val="320742175"/>
         <w:rPr>
           <w:rFonts w:eastAsia="Times New Roman"/>
           <w:color w:val="111827"/>
@@ -15431,47 +15404,38 @@
           <w:lang w:val="en"/>
         </w:rPr>
         <w:drawing>
-          <wp:inline distT="0" distB="0" distL="0" distR="0" wp14:anchorId="3E33C41F" wp14:editId="46FE1246">
-            <wp:extent cx="304800" cy="304800"/>
+          <wp:inline distT="0" distB="0" distL="0" distR="0" wp14:anchorId="7B98BEEF" wp14:editId="6C5CF986">
+            <wp:extent cx="5943600" cy="1033780"/>
             <wp:effectExtent l="0" t="0" r="0" b="0"/>
-            <wp:docPr id="4" name="Picture 4" descr="AWS Topology"/>
-            <wp:cNvGraphicFramePr>
-              <a:graphicFrameLocks xmlns:a="http://schemas.openxmlformats.org/drawingml/2006/main" noChangeAspect="1"/>
-            </wp:cNvGraphicFramePr>
+            <wp:docPr id="126265752" name="Picture 8"/>
+            <wp:cNvGraphicFramePr/>
             <a:graphic xmlns:a="http://schemas.openxmlformats.org/drawingml/2006/main">
               <a:graphicData uri="http://schemas.openxmlformats.org/drawingml/2006/picture">
                 <pic:pic xmlns:pic="http://schemas.openxmlformats.org/drawingml/2006/picture">
                   <pic:nvPicPr>
-                    <pic:cNvPr id="0" name="Picture 4" descr="AWS Topology"/>
-                    <pic:cNvPicPr>
-                      <a:picLocks noChangeAspect="1" noChangeArrowheads="1"/>
-                    </pic:cNvPicPr>
+                    <pic:cNvPr id="126265752" name=""/>
+                    <pic:cNvPicPr/>
                   </pic:nvPicPr>
                   <pic:blipFill>
-                    <a:blip r:link="rId8">
+                    <a:blip r:embed="rId8">
                       <a:extLst>
                         <a:ext uri="{28A0092B-C50C-407E-A947-70E740481C1C}">
                           <a14:useLocalDpi xmlns:a14="http://schemas.microsoft.com/office/drawing/2010/main" val="0"/>
                         </a:ext>
                       </a:extLst>
                     </a:blip>
-                    <a:srcRect/>
                     <a:stretch>
                       <a:fillRect/>
                     </a:stretch>
                   </pic:blipFill>
-                  <pic:spPr bwMode="auto">
+                  <pic:spPr>
                     <a:xfrm>
                       <a:off x="0" y="0"/>
-                      <a:ext cx="304800" cy="304800"/>
+                      <a:ext cx="5943600" cy="1033780"/>
                     </a:xfrm>
                     <a:prstGeom prst="rect">
                       <a:avLst/>
                     </a:prstGeom>
-                    <a:noFill/>
-                    <a:ln>
-                      <a:noFill/>
-                    </a:ln>
                   </pic:spPr>
                 </pic:pic>
               </a:graphicData>
@@ -15483,7 +15447,7 @@
     <w:p>
       <w:pPr>
         <w:jc w:val="center"/>
-        <w:divId w:val="1752461542"/>
+        <w:divId w:val="1694763300"/>
         <w:rPr>
           <w:rFonts w:eastAsia="Times New Roman"/>
           <w:b/>
@@ -17362,7 +17326,7 @@
     <w:p>
       <w:pPr>
         <w:jc w:val="center"/>
-        <w:divId w:val="294606645"/>
+        <w:divId w:val="561134308"/>
         <w:rPr>
           <w:rFonts w:eastAsia="Times New Roman"/>
           <w:color w:val="111827"/>
@@ -17381,47 +17345,38 @@
           <w:lang w:val="en"/>
         </w:rPr>
         <w:drawing>
-          <wp:inline distT="0" distB="0" distL="0" distR="0" wp14:anchorId="53EC5AA0" wp14:editId="27C08B8F">
-            <wp:extent cx="304800" cy="304800"/>
+          <wp:inline distT="0" distB="0" distL="0" distR="0" wp14:anchorId="5C5D61FD" wp14:editId="2C78FE3F">
+            <wp:extent cx="2286000" cy="1524000"/>
             <wp:effectExtent l="0" t="0" r="0" b="0"/>
-            <wp:docPr id="5" name="Picture 5" descr="Module 1 Storefront"/>
-            <wp:cNvGraphicFramePr>
-              <a:graphicFrameLocks xmlns:a="http://schemas.openxmlformats.org/drawingml/2006/main" noChangeAspect="1"/>
-            </wp:cNvGraphicFramePr>
+            <wp:docPr id="1358224697" name="Picture 7"/>
+            <wp:cNvGraphicFramePr/>
             <a:graphic xmlns:a="http://schemas.openxmlformats.org/drawingml/2006/main">
               <a:graphicData uri="http://schemas.openxmlformats.org/drawingml/2006/picture">
                 <pic:pic xmlns:pic="http://schemas.openxmlformats.org/drawingml/2006/picture">
                   <pic:nvPicPr>
-                    <pic:cNvPr id="0" name="Picture 5" descr="Module 1 Storefront"/>
-                    <pic:cNvPicPr>
-                      <a:picLocks noChangeAspect="1" noChangeArrowheads="1"/>
-                    </pic:cNvPicPr>
+                    <pic:cNvPr id="1358224697" name=""/>
+                    <pic:cNvPicPr/>
                   </pic:nvPicPr>
                   <pic:blipFill>
-                    <a:blip r:link="rId9">
+                    <a:blip r:embed="rId9" cstate="print">
                       <a:extLst>
                         <a:ext uri="{28A0092B-C50C-407E-A947-70E740481C1C}">
                           <a14:useLocalDpi xmlns:a14="http://schemas.microsoft.com/office/drawing/2010/main" val="0"/>
                         </a:ext>
                       </a:extLst>
                     </a:blip>
-                    <a:srcRect/>
                     <a:stretch>
                       <a:fillRect/>
                     </a:stretch>
                   </pic:blipFill>
-                  <pic:spPr bwMode="auto">
+                  <pic:spPr>
                     <a:xfrm>
                       <a:off x="0" y="0"/>
-                      <a:ext cx="304800" cy="304800"/>
+                      <a:ext cx="2286000" cy="1524000"/>
                     </a:xfrm>
                     <a:prstGeom prst="rect">
                       <a:avLst/>
                     </a:prstGeom>
-                    <a:noFill/>
-                    <a:ln>
-                      <a:noFill/>
-                    </a:ln>
                   </pic:spPr>
                 </pic:pic>
               </a:graphicData>
@@ -17433,7 +17388,7 @@
     <w:p>
       <w:pPr>
         <w:jc w:val="center"/>
-        <w:divId w:val="466896091"/>
+        <w:divId w:val="1261136611"/>
         <w:rPr>
           <w:rFonts w:eastAsia="Times New Roman"/>
           <w:b/>
@@ -17754,7 +17709,7 @@
     <w:p>
       <w:pPr>
         <w:jc w:val="center"/>
-        <w:divId w:val="1846357817"/>
+        <w:divId w:val="1076318527"/>
         <w:rPr>
           <w:rFonts w:eastAsia="Times New Roman"/>
           <w:color w:val="111827"/>
@@ -17773,47 +17728,38 @@
           <w:lang w:val="en"/>
         </w:rPr>
         <w:drawing>
-          <wp:inline distT="0" distB="0" distL="0" distR="0" wp14:anchorId="786A8094" wp14:editId="1DEF70D3">
-            <wp:extent cx="304800" cy="304800"/>
+          <wp:inline distT="0" distB="0" distL="0" distR="0" wp14:anchorId="0718689B" wp14:editId="35A8EC2B">
+            <wp:extent cx="2286000" cy="1524000"/>
             <wp:effectExtent l="0" t="0" r="0" b="0"/>
-            <wp:docPr id="6" name="Picture 6" descr="Module 2 Stockout Drawer"/>
-            <wp:cNvGraphicFramePr>
-              <a:graphicFrameLocks xmlns:a="http://schemas.openxmlformats.org/drawingml/2006/main" noChangeAspect="1"/>
-            </wp:cNvGraphicFramePr>
+            <wp:docPr id="666131235" name="Picture 6"/>
+            <wp:cNvGraphicFramePr/>
             <a:graphic xmlns:a="http://schemas.openxmlformats.org/drawingml/2006/main">
               <a:graphicData uri="http://schemas.openxmlformats.org/drawingml/2006/picture">
                 <pic:pic xmlns:pic="http://schemas.openxmlformats.org/drawingml/2006/picture">
                   <pic:nvPicPr>
-                    <pic:cNvPr id="0" name="Picture 6" descr="Module 2 Stockout Drawer"/>
-                    <pic:cNvPicPr>
-                      <a:picLocks noChangeAspect="1" noChangeArrowheads="1"/>
-                    </pic:cNvPicPr>
+                    <pic:cNvPr id="666131235" name=""/>
+                    <pic:cNvPicPr/>
                   </pic:nvPicPr>
                   <pic:blipFill>
-                    <a:blip r:link="rId10">
+                    <a:blip r:embed="rId10" cstate="print">
                       <a:extLst>
                         <a:ext uri="{28A0092B-C50C-407E-A947-70E740481C1C}">
                           <a14:useLocalDpi xmlns:a14="http://schemas.microsoft.com/office/drawing/2010/main" val="0"/>
                         </a:ext>
                       </a:extLst>
                     </a:blip>
-                    <a:srcRect/>
                     <a:stretch>
                       <a:fillRect/>
                     </a:stretch>
                   </pic:blipFill>
-                  <pic:spPr bwMode="auto">
+                  <pic:spPr>
                     <a:xfrm>
                       <a:off x="0" y="0"/>
-                      <a:ext cx="304800" cy="304800"/>
+                      <a:ext cx="2286000" cy="1524000"/>
                     </a:xfrm>
                     <a:prstGeom prst="rect">
                       <a:avLst/>
                     </a:prstGeom>
-                    <a:noFill/>
-                    <a:ln>
-                      <a:noFill/>
-                    </a:ln>
                   </pic:spPr>
                 </pic:pic>
               </a:graphicData>
@@ -17825,7 +17771,7 @@
     <w:p>
       <w:pPr>
         <w:jc w:val="center"/>
-        <w:divId w:val="1037894754"/>
+        <w:divId w:val="236523315"/>
         <w:rPr>
           <w:rFonts w:eastAsia="Times New Roman"/>
           <w:b/>
@@ -17976,7 +17922,7 @@
     <w:p>
       <w:pPr>
         <w:jc w:val="center"/>
-        <w:divId w:val="700515638"/>
+        <w:divId w:val="525867031"/>
         <w:rPr>
           <w:rFonts w:eastAsia="Times New Roman"/>
           <w:color w:val="111827"/>
@@ -17995,47 +17941,38 @@
           <w:lang w:val="en"/>
         </w:rPr>
         <w:drawing>
-          <wp:inline distT="0" distB="0" distL="0" distR="0" wp14:anchorId="5CA8EAB3" wp14:editId="696A6B17">
-            <wp:extent cx="304800" cy="304800"/>
+          <wp:inline distT="0" distB="0" distL="0" distR="0" wp14:anchorId="79F4D8CD" wp14:editId="1EB8E153">
+            <wp:extent cx="2311400" cy="1524000"/>
             <wp:effectExtent l="0" t="0" r="0" b="0"/>
-            <wp:docPr id="7" name="Picture 7" descr="Module 3 Server Crash"/>
-            <wp:cNvGraphicFramePr>
-              <a:graphicFrameLocks xmlns:a="http://schemas.openxmlformats.org/drawingml/2006/main" noChangeAspect="1"/>
-            </wp:cNvGraphicFramePr>
+            <wp:docPr id="1223979210" name="Picture 5"/>
+            <wp:cNvGraphicFramePr/>
             <a:graphic xmlns:a="http://schemas.openxmlformats.org/drawingml/2006/main">
               <a:graphicData uri="http://schemas.openxmlformats.org/drawingml/2006/picture">
                 <pic:pic xmlns:pic="http://schemas.openxmlformats.org/drawingml/2006/picture">
                   <pic:nvPicPr>
-                    <pic:cNvPr id="0" name="Picture 7" descr="Module 3 Server Crash"/>
-                    <pic:cNvPicPr>
-                      <a:picLocks noChangeAspect="1" noChangeArrowheads="1"/>
-                    </pic:cNvPicPr>
+                    <pic:cNvPr id="1223979210" name=""/>
+                    <pic:cNvPicPr/>
                   </pic:nvPicPr>
                   <pic:blipFill>
-                    <a:blip r:link="rId11">
+                    <a:blip r:embed="rId11" cstate="print">
                       <a:extLst>
                         <a:ext uri="{28A0092B-C50C-407E-A947-70E740481C1C}">
                           <a14:useLocalDpi xmlns:a14="http://schemas.microsoft.com/office/drawing/2010/main" val="0"/>
                         </a:ext>
                       </a:extLst>
                     </a:blip>
-                    <a:srcRect/>
                     <a:stretch>
                       <a:fillRect/>
                     </a:stretch>
                   </pic:blipFill>
-                  <pic:spPr bwMode="auto">
+                  <pic:spPr>
                     <a:xfrm>
                       <a:off x="0" y="0"/>
-                      <a:ext cx="304800" cy="304800"/>
+                      <a:ext cx="2311400" cy="1524000"/>
                     </a:xfrm>
                     <a:prstGeom prst="rect">
                       <a:avLst/>
                     </a:prstGeom>
-                    <a:noFill/>
-                    <a:ln>
-                      <a:noFill/>
-                    </a:ln>
                   </pic:spPr>
                 </pic:pic>
               </a:graphicData>
@@ -18047,7 +17984,7 @@
     <w:p>
       <w:pPr>
         <w:jc w:val="center"/>
-        <w:divId w:val="1926448832"/>
+        <w:divId w:val="978265387"/>
         <w:rPr>
           <w:rFonts w:eastAsia="Times New Roman"/>
           <w:b/>
@@ -18343,7 +18280,7 @@
     <w:p>
       <w:pPr>
         <w:jc w:val="center"/>
-        <w:divId w:val="440346479"/>
+        <w:divId w:val="1280332725"/>
         <w:rPr>
           <w:rFonts w:eastAsia="Times New Roman"/>
           <w:color w:val="111827"/>
@@ -18362,47 +18299,38 @@
           <w:lang w:val="en"/>
         </w:rPr>
         <w:drawing>
-          <wp:inline distT="0" distB="0" distL="0" distR="0" wp14:anchorId="66BAF53E" wp14:editId="0B808D88">
-            <wp:extent cx="304800" cy="304800"/>
-            <wp:effectExtent l="0" t="0" r="0" b="0"/>
-            <wp:docPr id="8" name="Picture 8" descr="Module 4 SRE Dashboard"/>
-            <wp:cNvGraphicFramePr>
-              <a:graphicFrameLocks xmlns:a="http://schemas.openxmlformats.org/drawingml/2006/main" noChangeAspect="1"/>
-            </wp:cNvGraphicFramePr>
+          <wp:inline distT="0" distB="0" distL="0" distR="0" wp14:anchorId="04AD071F" wp14:editId="1A49DD3B">
+            <wp:extent cx="2032000" cy="1524000"/>
+            <wp:effectExtent l="0" t="0" r="6350" b="0"/>
+            <wp:docPr id="1563684119" name="Picture 4"/>
+            <wp:cNvGraphicFramePr/>
             <a:graphic xmlns:a="http://schemas.openxmlformats.org/drawingml/2006/main">
               <a:graphicData uri="http://schemas.openxmlformats.org/drawingml/2006/picture">
                 <pic:pic xmlns:pic="http://schemas.openxmlformats.org/drawingml/2006/picture">
                   <pic:nvPicPr>
-                    <pic:cNvPr id="0" name="Picture 8" descr="Module 4 SRE Dashboard"/>
-                    <pic:cNvPicPr>
-                      <a:picLocks noChangeAspect="1" noChangeArrowheads="1"/>
-                    </pic:cNvPicPr>
+                    <pic:cNvPr id="1563684119" name=""/>
+                    <pic:cNvPicPr/>
                   </pic:nvPicPr>
                   <pic:blipFill>
-                    <a:blip r:link="rId12">
+                    <a:blip r:embed="rId12" cstate="print">
                       <a:extLst>
                         <a:ext uri="{28A0092B-C50C-407E-A947-70E740481C1C}">
                           <a14:useLocalDpi xmlns:a14="http://schemas.microsoft.com/office/drawing/2010/main" val="0"/>
                         </a:ext>
                       </a:extLst>
                     </a:blip>
-                    <a:srcRect/>
                     <a:stretch>
                       <a:fillRect/>
                     </a:stretch>
                   </pic:blipFill>
-                  <pic:spPr bwMode="auto">
+                  <pic:spPr>
                     <a:xfrm>
                       <a:off x="0" y="0"/>
-                      <a:ext cx="304800" cy="304800"/>
+                      <a:ext cx="2032000" cy="1524000"/>
                     </a:xfrm>
                     <a:prstGeom prst="rect">
                       <a:avLst/>
                     </a:prstGeom>
-                    <a:noFill/>
-                    <a:ln>
-                      <a:noFill/>
-                    </a:ln>
                   </pic:spPr>
                 </pic:pic>
               </a:graphicData>
@@ -18414,7 +18342,7 @@
     <w:p>
       <w:pPr>
         <w:jc w:val="center"/>
-        <w:divId w:val="1854878275"/>
+        <w:divId w:val="1648902656"/>
         <w:rPr>
           <w:rFonts w:eastAsia="Times New Roman"/>
           <w:b/>
@@ -18718,7 +18646,7 @@
     <w:p>
       <w:pPr>
         <w:jc w:val="center"/>
-        <w:divId w:val="1125545702"/>
+        <w:divId w:val="1857889103"/>
         <w:rPr>
           <w:rFonts w:eastAsia="Times New Roman"/>
           <w:color w:val="111827"/>
@@ -18737,47 +18665,38 @@
           <w:lang w:val="en"/>
         </w:rPr>
         <w:drawing>
-          <wp:inline distT="0" distB="0" distL="0" distR="0" wp14:anchorId="387677F2" wp14:editId="00B459FA">
-            <wp:extent cx="304800" cy="304800"/>
-            <wp:effectExtent l="0" t="0" r="0" b="0"/>
-            <wp:docPr id="9" name="Picture 9" descr="Module 5 S3 Vault"/>
-            <wp:cNvGraphicFramePr>
-              <a:graphicFrameLocks xmlns:a="http://schemas.openxmlformats.org/drawingml/2006/main" noChangeAspect="1"/>
-            </wp:cNvGraphicFramePr>
+          <wp:inline distT="0" distB="0" distL="0" distR="0" wp14:anchorId="516487BA" wp14:editId="1382C19A">
+            <wp:extent cx="2832100" cy="1524000"/>
+            <wp:effectExtent l="0" t="0" r="6350" b="0"/>
+            <wp:docPr id="1858156642" name="Picture 3"/>
+            <wp:cNvGraphicFramePr/>
             <a:graphic xmlns:a="http://schemas.openxmlformats.org/drawingml/2006/main">
               <a:graphicData uri="http://schemas.openxmlformats.org/drawingml/2006/picture">
                 <pic:pic xmlns:pic="http://schemas.openxmlformats.org/drawingml/2006/picture">
                   <pic:nvPicPr>
-                    <pic:cNvPr id="0" name="Picture 9" descr="Module 5 S3 Vault"/>
-                    <pic:cNvPicPr>
-                      <a:picLocks noChangeAspect="1" noChangeArrowheads="1"/>
-                    </pic:cNvPicPr>
+                    <pic:cNvPr id="1858156642" name=""/>
+                    <pic:cNvPicPr/>
                   </pic:nvPicPr>
                   <pic:blipFill>
-                    <a:blip r:link="rId13">
+                    <a:blip r:embed="rId13" cstate="print">
                       <a:extLst>
                         <a:ext uri="{28A0092B-C50C-407E-A947-70E740481C1C}">
                           <a14:useLocalDpi xmlns:a14="http://schemas.microsoft.com/office/drawing/2010/main" val="0"/>
                         </a:ext>
                       </a:extLst>
                     </a:blip>
-                    <a:srcRect/>
                     <a:stretch>
                       <a:fillRect/>
                     </a:stretch>
                   </pic:blipFill>
-                  <pic:spPr bwMode="auto">
+                  <pic:spPr>
                     <a:xfrm>
                       <a:off x="0" y="0"/>
-                      <a:ext cx="304800" cy="304800"/>
+                      <a:ext cx="2832100" cy="1524000"/>
                     </a:xfrm>
                     <a:prstGeom prst="rect">
                       <a:avLst/>
                     </a:prstGeom>
-                    <a:noFill/>
-                    <a:ln>
-                      <a:noFill/>
-                    </a:ln>
                   </pic:spPr>
                 </pic:pic>
               </a:graphicData>
@@ -18789,7 +18708,7 @@
     <w:p>
       <w:pPr>
         <w:jc w:val="center"/>
-        <w:divId w:val="231237405"/>
+        <w:divId w:val="268321206"/>
         <w:rPr>
           <w:rFonts w:eastAsia="Times New Roman"/>
           <w:b/>
@@ -18923,7 +18842,7 @@
     <w:p>
       <w:pPr>
         <w:shd w:val="clear" w:color="auto" w:fill="F1F5F9"/>
-        <w:divId w:val="1484392408"/>
+        <w:divId w:val="213202225"/>
         <w:rPr>
           <w:rFonts w:eastAsia="Times New Roman"/>
           <w:i/>
@@ -19137,7 +19056,7 @@
     <w:p>
       <w:pPr>
         <w:jc w:val="center"/>
-        <w:divId w:val="1229653214"/>
+        <w:divId w:val="588580427"/>
         <w:rPr>
           <w:rFonts w:eastAsia="Times New Roman"/>
           <w:color w:val="111827"/>
@@ -19156,47 +19075,38 @@
           <w:lang w:val="en"/>
         </w:rPr>
         <w:drawing>
-          <wp:inline distT="0" distB="0" distL="0" distR="0" wp14:anchorId="59FCD7FB" wp14:editId="0A71A60D">
-            <wp:extent cx="304800" cy="304800"/>
-            <wp:effectExtent l="0" t="0" r="0" b="0"/>
-            <wp:docPr id="10" name="Picture 10" descr="Module 6 GitHub Issue"/>
-            <wp:cNvGraphicFramePr>
-              <a:graphicFrameLocks xmlns:a="http://schemas.openxmlformats.org/drawingml/2006/main" noChangeAspect="1"/>
-            </wp:cNvGraphicFramePr>
+          <wp:inline distT="0" distB="0" distL="0" distR="0" wp14:anchorId="28CB2591" wp14:editId="728C82CC">
+            <wp:extent cx="2032000" cy="1524000"/>
+            <wp:effectExtent l="0" t="0" r="6350" b="0"/>
+            <wp:docPr id="467992665" name="Picture 2"/>
+            <wp:cNvGraphicFramePr/>
             <a:graphic xmlns:a="http://schemas.openxmlformats.org/drawingml/2006/main">
               <a:graphicData uri="http://schemas.openxmlformats.org/drawingml/2006/picture">
                 <pic:pic xmlns:pic="http://schemas.openxmlformats.org/drawingml/2006/picture">
                   <pic:nvPicPr>
-                    <pic:cNvPr id="0" name="Picture 10" descr="Module 6 GitHub Issue"/>
-                    <pic:cNvPicPr>
-                      <a:picLocks noChangeAspect="1" noChangeArrowheads="1"/>
-                    </pic:cNvPicPr>
+                    <pic:cNvPr id="467992665" name=""/>
+                    <pic:cNvPicPr/>
                   </pic:nvPicPr>
                   <pic:blipFill>
-                    <a:blip r:link="rId14">
+                    <a:blip r:embed="rId14" cstate="print">
                       <a:extLst>
                         <a:ext uri="{28A0092B-C50C-407E-A947-70E740481C1C}">
                           <a14:useLocalDpi xmlns:a14="http://schemas.microsoft.com/office/drawing/2010/main" val="0"/>
                         </a:ext>
                       </a:extLst>
                     </a:blip>
-                    <a:srcRect/>
                     <a:stretch>
                       <a:fillRect/>
                     </a:stretch>
                   </pic:blipFill>
-                  <pic:spPr bwMode="auto">
+                  <pic:spPr>
                     <a:xfrm>
                       <a:off x="0" y="0"/>
-                      <a:ext cx="304800" cy="304800"/>
+                      <a:ext cx="2032000" cy="1524000"/>
                     </a:xfrm>
                     <a:prstGeom prst="rect">
                       <a:avLst/>
                     </a:prstGeom>
-                    <a:noFill/>
-                    <a:ln>
-                      <a:noFill/>
-                    </a:ln>
                   </pic:spPr>
                 </pic:pic>
               </a:graphicData>
@@ -19208,7 +19118,7 @@
     <w:p>
       <w:pPr>
         <w:jc w:val="center"/>
-        <w:divId w:val="798572116"/>
+        <w:divId w:val="1644700482"/>
         <w:rPr>
           <w:rFonts w:eastAsia="Times New Roman"/>
           <w:b/>
@@ -19359,7 +19269,7 @@
     <w:p>
       <w:pPr>
         <w:shd w:val="clear" w:color="auto" w:fill="0F172A"/>
-        <w:divId w:val="1141734329"/>
+        <w:divId w:val="880871312"/>
         <w:rPr>
           <w:rFonts w:ascii="Consolas" w:eastAsia="Times New Roman" w:hAnsi="Consolas"/>
           <w:color w:val="38BDF8"/>
@@ -19574,7 +19484,7 @@
     <w:p>
       <w:pPr>
         <w:jc w:val="center"/>
-        <w:divId w:val="1141119915"/>
+        <w:divId w:val="701169854"/>
         <w:rPr>
           <w:rFonts w:eastAsia="Times New Roman"/>
           <w:color w:val="111827"/>
@@ -19593,47 +19503,38 @@
           <w:lang w:val="en"/>
         </w:rPr>
         <w:drawing>
-          <wp:inline distT="0" distB="0" distL="0" distR="0" wp14:anchorId="39FB6BEC" wp14:editId="11A480D4">
-            <wp:extent cx="304800" cy="304800"/>
+          <wp:inline distT="0" distB="0" distL="0" distR="0" wp14:anchorId="7EC16757" wp14:editId="08AD11B2">
+            <wp:extent cx="2819400" cy="1524000"/>
             <wp:effectExtent l="0" t="0" r="0" b="0"/>
-            <wp:docPr id="11" name="Picture 11" descr="Module 7 CI/CD Pipeline"/>
-            <wp:cNvGraphicFramePr>
-              <a:graphicFrameLocks xmlns:a="http://schemas.openxmlformats.org/drawingml/2006/main" noChangeAspect="1"/>
-            </wp:cNvGraphicFramePr>
+            <wp:docPr id="742802089" name="Picture 1"/>
+            <wp:cNvGraphicFramePr/>
             <a:graphic xmlns:a="http://schemas.openxmlformats.org/drawingml/2006/main">
               <a:graphicData uri="http://schemas.openxmlformats.org/drawingml/2006/picture">
                 <pic:pic xmlns:pic="http://schemas.openxmlformats.org/drawingml/2006/picture">
                   <pic:nvPicPr>
-                    <pic:cNvPr id="0" name="Picture 11" descr="Module 7 CI/CD Pipeline"/>
-                    <pic:cNvPicPr>
-                      <a:picLocks noChangeAspect="1" noChangeArrowheads="1"/>
-                    </pic:cNvPicPr>
+                    <pic:cNvPr id="742802089" name=""/>
+                    <pic:cNvPicPr/>
                   </pic:nvPicPr>
                   <pic:blipFill>
-                    <a:blip r:link="rId15">
+                    <a:blip r:embed="rId15" cstate="print">
                       <a:extLst>
                         <a:ext uri="{28A0092B-C50C-407E-A947-70E740481C1C}">
                           <a14:useLocalDpi xmlns:a14="http://schemas.microsoft.com/office/drawing/2010/main" val="0"/>
                         </a:ext>
                       </a:extLst>
                     </a:blip>
-                    <a:srcRect/>
                     <a:stretch>
                       <a:fillRect/>
                     </a:stretch>
                   </pic:blipFill>
-                  <pic:spPr bwMode="auto">
+                  <pic:spPr>
                     <a:xfrm>
                       <a:off x="0" y="0"/>
-                      <a:ext cx="304800" cy="304800"/>
+                      <a:ext cx="2819400" cy="1524000"/>
                     </a:xfrm>
                     <a:prstGeom prst="rect">
                       <a:avLst/>
                     </a:prstGeom>
-                    <a:noFill/>
-                    <a:ln>
-                      <a:noFill/>
-                    </a:ln>
                   </pic:spPr>
                 </pic:pic>
               </a:graphicData>
@@ -19645,7 +19546,7 @@
     <w:p>
       <w:pPr>
         <w:jc w:val="center"/>
-        <w:divId w:val="2133864090"/>
+        <w:divId w:val="1974555879"/>
         <w:rPr>
           <w:rFonts w:eastAsia="Times New Roman"/>
           <w:b/>
@@ -22100,7 +22001,7 @@
     <w:p>
       <w:pPr>
         <w:shd w:val="clear" w:color="auto" w:fill="0F172A"/>
-        <w:divId w:val="1276912093"/>
+        <w:divId w:val="1378437065"/>
         <w:rPr>
           <w:rFonts w:ascii="Consolas" w:eastAsia="Times New Roman" w:hAnsi="Consolas"/>
           <w:color w:val="38BDF8"/>
@@ -22157,7 +22058,7 @@
     <w:p>
       <w:pPr>
         <w:shd w:val="clear" w:color="auto" w:fill="0F172A"/>
-        <w:divId w:val="641542946"/>
+        <w:divId w:val="38214314"/>
         <w:rPr>
           <w:rFonts w:ascii="Consolas" w:eastAsia="Times New Roman" w:hAnsi="Consolas"/>
           <w:color w:val="38BDF8"/>
@@ -22234,7 +22135,7 @@
     <w:p>
       <w:pPr>
         <w:shd w:val="clear" w:color="auto" w:fill="0F172A"/>
-        <w:divId w:val="1120763901"/>
+        <w:divId w:val="2054383415"/>
         <w:rPr>
           <w:rFonts w:ascii="Consolas" w:eastAsia="Times New Roman" w:hAnsi="Consolas"/>
           <w:color w:val="38BDF8"/>
@@ -23659,7 +23560,7 @@
     <w:p>
       <w:pPr>
         <w:shd w:val="clear" w:color="auto" w:fill="0F172A"/>
-        <w:divId w:val="1972972926"/>
+        <w:divId w:val="1193612000"/>
         <w:rPr>
           <w:rFonts w:ascii="Consolas" w:eastAsia="Times New Roman" w:hAnsi="Consolas"/>
           <w:color w:val="38BDF8"/>
@@ -23765,7 +23666,7 @@
     <w:p>
       <w:pPr>
         <w:shd w:val="clear" w:color="auto" w:fill="0F172A"/>
-        <w:divId w:val="1098981554"/>
+        <w:divId w:val="469444289"/>
         <w:rPr>
           <w:rFonts w:ascii="Consolas" w:eastAsia="Times New Roman" w:hAnsi="Consolas"/>
           <w:color w:val="38BDF8"/>
@@ -27601,7 +27502,7 @@
     <w:p>
       <w:pPr>
         <w:pStyle w:val="NormalWeb"/>
-        <w:divId w:val="1051809680"/>
+        <w:divId w:val="1852602587"/>
         <w:rPr>
           <w:color w:val="111827"/>
           <w:sz w:val="17"/>
@@ -27641,7 +27542,7 @@
     <w:p>
       <w:pPr>
         <w:pStyle w:val="NormalWeb"/>
-        <w:divId w:val="1051809680"/>
+        <w:divId w:val="1852602587"/>
         <w:rPr>
           <w:color w:val="111827"/>
           <w:sz w:val="17"/>
@@ -27681,7 +27582,7 @@
     <w:p>
       <w:pPr>
         <w:pStyle w:val="NormalWeb"/>
-        <w:divId w:val="1051809680"/>
+        <w:divId w:val="1852602587"/>
         <w:rPr>
           <w:color w:val="111827"/>
           <w:sz w:val="17"/>
@@ -27702,7 +27603,7 @@
     <w:p>
       <w:pPr>
         <w:pStyle w:val="NormalWeb"/>
-        <w:divId w:val="1051809680"/>
+        <w:divId w:val="1852602587"/>
         <w:rPr>
           <w:color w:val="111827"/>
           <w:sz w:val="17"/>
@@ -27723,7 +27624,7 @@
     <w:p>
       <w:pPr>
         <w:pStyle w:val="NormalWeb"/>
-        <w:divId w:val="1051809680"/>
+        <w:divId w:val="1852602587"/>
         <w:rPr>
           <w:color w:val="111827"/>
           <w:sz w:val="17"/>
@@ -27860,7 +27761,7 @@
     <w:p>
       <w:pPr>
         <w:pStyle w:val="NormalWeb"/>
-        <w:divId w:val="640040121"/>
+        <w:divId w:val="674653741"/>
         <w:rPr>
           <w:color w:val="111827"/>
           <w:sz w:val="17"/>
@@ -27881,7 +27782,7 @@
     <w:p>
       <w:pPr>
         <w:pStyle w:val="NormalWeb"/>
-        <w:divId w:val="640040121"/>
+        <w:divId w:val="674653741"/>
         <w:rPr>
           <w:color w:val="111827"/>
           <w:sz w:val="17"/>
@@ -27921,7 +27822,7 @@
     <w:p>
       <w:pPr>
         <w:pStyle w:val="NormalWeb"/>
-        <w:divId w:val="640040121"/>
+        <w:divId w:val="674653741"/>
         <w:rPr>
           <w:color w:val="111827"/>
           <w:sz w:val="17"/>
@@ -27942,7 +27843,7 @@
     <w:p>
       <w:pPr>
         <w:pStyle w:val="NormalWeb"/>
-        <w:divId w:val="640040121"/>
+        <w:divId w:val="674653741"/>
         <w:rPr>
           <w:color w:val="111827"/>
           <w:sz w:val="17"/>
@@ -27982,7 +27883,7 @@
     <w:p>
       <w:pPr>
         <w:pStyle w:val="NormalWeb"/>
-        <w:divId w:val="640040121"/>
+        <w:divId w:val="674653741"/>
         <w:rPr>
           <w:color w:val="111827"/>
           <w:sz w:val="17"/>
@@ -28003,7 +27904,7 @@
     <w:p>
       <w:pPr>
         <w:pStyle w:val="NormalWeb"/>
-        <w:divId w:val="640040121"/>
+        <w:divId w:val="674653741"/>
         <w:rPr>
           <w:color w:val="111827"/>
           <w:sz w:val="17"/>
@@ -28024,7 +27925,7 @@
     <w:p>
       <w:pPr>
         <w:pStyle w:val="NormalWeb"/>
-        <w:divId w:val="640040121"/>
+        <w:divId w:val="674653741"/>
         <w:rPr>
           <w:color w:val="111827"/>
           <w:sz w:val="17"/>
@@ -28045,7 +27946,7 @@
     <w:p>
       <w:pPr>
         <w:pStyle w:val="NormalWeb"/>
-        <w:divId w:val="640040121"/>
+        <w:divId w:val="674653741"/>
         <w:rPr>
           <w:color w:val="111827"/>
           <w:sz w:val="17"/>
@@ -28066,7 +27967,7 @@
     <w:p>
       <w:pPr>
         <w:pStyle w:val="NormalWeb"/>
-        <w:divId w:val="640040121"/>
+        <w:divId w:val="674653741"/>
         <w:rPr>
           <w:color w:val="111827"/>
           <w:sz w:val="17"/>
@@ -28087,7 +27988,7 @@
     <w:p>
       <w:pPr>
         <w:pStyle w:val="NormalWeb"/>
-        <w:divId w:val="640040121"/>
+        <w:divId w:val="674653741"/>
         <w:rPr>
           <w:color w:val="111827"/>
           <w:sz w:val="17"/>
@@ -28191,7 +28092,7 @@
     <w:p>
       <w:pPr>
         <w:shd w:val="clear" w:color="auto" w:fill="0F172A"/>
-        <w:divId w:val="797649577"/>
+        <w:divId w:val="1911573120"/>
         <w:rPr>
           <w:rFonts w:ascii="Consolas" w:eastAsia="Times New Roman" w:hAnsi="Consolas"/>
           <w:color w:val="38BDF8"/>
@@ -28321,7 +28222,7 @@
     <w:p>
       <w:pPr>
         <w:shd w:val="clear" w:color="auto" w:fill="0F172A"/>
-        <w:divId w:val="885793105"/>
+        <w:divId w:val="847211264"/>
         <w:rPr>
           <w:rFonts w:ascii="Consolas" w:eastAsia="Times New Roman" w:hAnsi="Consolas"/>
           <w:color w:val="38BDF8"/>
@@ -30153,7 +30054,7 @@
     <w:p>
       <w:pPr>
         <w:shd w:val="clear" w:color="auto" w:fill="0F172A"/>
-        <w:divId w:val="948509341"/>
+        <w:divId w:val="1345396570"/>
         <w:rPr>
           <w:rFonts w:ascii="Consolas" w:eastAsia="Times New Roman" w:hAnsi="Consolas"/>
           <w:color w:val="38BDF8"/>
@@ -30384,7 +30285,7 @@
     <w:p>
       <w:pPr>
         <w:jc w:val="center"/>
-        <w:divId w:val="263927749"/>
+        <w:divId w:val="1469937478"/>
         <w:rPr>
           <w:rFonts w:eastAsia="Times New Roman"/>
           <w:color w:val="4B5563"/>
@@ -30427,9 +30328,9 @@
 <file path=word/numbering.xml><?xml version="1.0" encoding="utf-8"?>
 <w:numbering xmlns:wpc="http://schemas.microsoft.com/office/word/2010/wordprocessingCanvas" xmlns:cx="http://schemas.microsoft.com/office/drawing/2014/chartex" xmlns:cx1="http://schemas.microsoft.com/office/drawing/2015/9/8/chartex" xmlns:cx2="http://schemas.microsoft.com/office/drawing/2015/10/21/chartex" xmlns:cx3="http://schemas.microsoft.com/office/drawing/2016/5/9/chartex" xmlns:cx4="http://schemas.microsoft.com/office/drawing/2016/5/10/chartex" xmlns:cx5="http://schemas.microsoft.com/office/drawing/2016/5/11/chartex" xmlns:cx6="http://schemas.microsoft.com/office/drawing/2016/5/12/chartex" xmlns:cx7="http://schemas.microsoft.com/office/drawing/2016/5/13/chartex" xmlns:cx8="http://schemas.microsoft.com/office/drawing/2016/5/14/chartex" xmlns:mc="http://schemas.openxmlformats.org/markup-compatibility/2006" xmlns:aink="http://schemas.microsoft.com/office/drawing/2016/ink" xmlns:am3d="http://schemas.microsoft.com/office/drawing/2017/model3d" xmlns:o="urn:schemas-microsoft-com:office:office" xmlns:oel="http://schemas.microsoft.com/office/2019/extlst" xmlns:r="http://schemas.openxmlformats.org/officeDocument/2006/relationships" xmlns:m="http://schemas.openxmlformats.org/officeDocument/2006/math" xmlns:v="urn:schemas-microsoft-com:vml" xmlns:wp14="http://schemas.microsoft.com/office/word/2010/wordprocessingDrawing" xmlns:wp="http://schemas.openxmlformats.org/drawingml/2006/wordprocessingDrawing" xmlns:w10="urn:schemas-microsoft-com:office:word" xmlns:w="http://schemas.openxmlformats.org/wordprocessingml/2006/main" xmlns:w14="http://schemas.microsoft.com/office/word/2010/wordml" xmlns:w15="http://schemas.microsoft.com/office/word/2012/wordml" xmlns:w16cex="http://schemas.microsoft.com/office/word/2018/wordml/cex" xmlns:w16cid="http://schemas.microsoft.com/office/word/2016/wordml/cid" xmlns:w16="http://schemas.microsoft.com/office/word/2018/wordml" xmlns:w16du="http://schemas.microsoft.com/office/word/2023/wordml/word16du" xmlns:w16sdtdh="http://schemas.microsoft.com/office/word/2020/wordml/sdtdatahash" xmlns:w16sdtfl="http://schemas.microsoft.com/office/word/2024/wordml/sdtformatlock" xmlns:w16se="http://schemas.microsoft.com/office/word/2015/wordml/symex" xmlns:wpg="http://schemas.microsoft.com/office/word/2010/wordprocessingGroup" xmlns:wpi="http://schemas.microsoft.com/office/word/2010/wordprocessingInk" xmlns:wne="http://schemas.microsoft.com/office/word/2006/wordml" xmlns:wps="http://schemas.microsoft.com/office/word/2010/wordprocessingShape" mc:Ignorable="w14 w15 w16se w16cid w16 w16cex w16sdtdh w16sdtfl w16du wp14">
   <w:abstractNum w:abstractNumId="0" w15:restartNumberingAfterBreak="0">
-    <w:nsid w:val="1DCF5644"/>
+    <w:nsid w:val="12590CAC"/>
     <w:multiLevelType w:val="multilevel"/>
-    <w:tmpl w:val="6374D7B0"/>
+    <w:tmpl w:val="AE1E47C4"/>
     <w:lvl w:ilvl="0">
       <w:start w:val="1"/>
       <w:numFmt w:val="bullet"/>
@@ -30576,9 +30477,9 @@
     </w:lvl>
   </w:abstractNum>
   <w:abstractNum w:abstractNumId="1" w15:restartNumberingAfterBreak="0">
-    <w:nsid w:val="38C21FEC"/>
+    <w:nsid w:val="21310E6F"/>
     <w:multiLevelType w:val="multilevel"/>
-    <w:tmpl w:val="B330C2A4"/>
+    <w:tmpl w:val="B9FA374E"/>
     <w:lvl w:ilvl="0">
       <w:start w:val="1"/>
       <w:numFmt w:val="bullet"/>
@@ -30725,9 +30626,9 @@
     </w:lvl>
   </w:abstractNum>
   <w:abstractNum w:abstractNumId="2" w15:restartNumberingAfterBreak="0">
-    <w:nsid w:val="3E976ECD"/>
+    <w:nsid w:val="42D22F51"/>
     <w:multiLevelType w:val="multilevel"/>
-    <w:tmpl w:val="21AAD650"/>
+    <w:tmpl w:val="F3164410"/>
     <w:lvl w:ilvl="0">
       <w:start w:val="1"/>
       <w:numFmt w:val="bullet"/>
@@ -30874,9 +30775,9 @@
     </w:lvl>
   </w:abstractNum>
   <w:abstractNum w:abstractNumId="3" w15:restartNumberingAfterBreak="0">
-    <w:nsid w:val="4B14152E"/>
+    <w:nsid w:val="4901758A"/>
     <w:multiLevelType w:val="multilevel"/>
-    <w:tmpl w:val="58901FBA"/>
+    <w:tmpl w:val="1BD8B2CA"/>
     <w:lvl w:ilvl="0">
       <w:start w:val="1"/>
       <w:numFmt w:val="bullet"/>
@@ -31023,122 +30924,9 @@
     </w:lvl>
   </w:abstractNum>
   <w:abstractNum w:abstractNumId="4" w15:restartNumberingAfterBreak="0">
-    <w:nsid w:val="4D0045F8"/>
+    <w:nsid w:val="4B8C7281"/>
     <w:multiLevelType w:val="multilevel"/>
-    <w:tmpl w:val="DE668DFA"/>
-    <w:lvl w:ilvl="0">
-      <w:start w:val="1"/>
-      <w:numFmt w:val="decimal"/>
-      <w:lvlText w:val="%1."/>
-      <w:lvlJc w:val="left"/>
-      <w:pPr>
-        <w:tabs>
-          <w:tab w:val="num" w:pos="720"/>
-        </w:tabs>
-        <w:ind w:left="720" w:hanging="360"/>
-      </w:pPr>
-    </w:lvl>
-    <w:lvl w:ilvl="1" w:tentative="1">
-      <w:start w:val="1"/>
-      <w:numFmt w:val="decimal"/>
-      <w:lvlText w:val="%2."/>
-      <w:lvlJc w:val="left"/>
-      <w:pPr>
-        <w:tabs>
-          <w:tab w:val="num" w:pos="1440"/>
-        </w:tabs>
-        <w:ind w:left="1440" w:hanging="360"/>
-      </w:pPr>
-    </w:lvl>
-    <w:lvl w:ilvl="2" w:tentative="1">
-      <w:start w:val="1"/>
-      <w:numFmt w:val="decimal"/>
-      <w:lvlText w:val="%3."/>
-      <w:lvlJc w:val="left"/>
-      <w:pPr>
-        <w:tabs>
-          <w:tab w:val="num" w:pos="2160"/>
-        </w:tabs>
-        <w:ind w:left="2160" w:hanging="360"/>
-      </w:pPr>
-    </w:lvl>
-    <w:lvl w:ilvl="3" w:tentative="1">
-      <w:start w:val="1"/>
-      <w:numFmt w:val="decimal"/>
-      <w:lvlText w:val="%4."/>
-      <w:lvlJc w:val="left"/>
-      <w:pPr>
-        <w:tabs>
-          <w:tab w:val="num" w:pos="2880"/>
-        </w:tabs>
-        <w:ind w:left="2880" w:hanging="360"/>
-      </w:pPr>
-    </w:lvl>
-    <w:lvl w:ilvl="4" w:tentative="1">
-      <w:start w:val="1"/>
-      <w:numFmt w:val="decimal"/>
-      <w:lvlText w:val="%5."/>
-      <w:lvlJc w:val="left"/>
-      <w:pPr>
-        <w:tabs>
-          <w:tab w:val="num" w:pos="3600"/>
-        </w:tabs>
-        <w:ind w:left="3600" w:hanging="360"/>
-      </w:pPr>
-    </w:lvl>
-    <w:lvl w:ilvl="5" w:tentative="1">
-      <w:start w:val="1"/>
-      <w:numFmt w:val="decimal"/>
-      <w:lvlText w:val="%6."/>
-      <w:lvlJc w:val="left"/>
-      <w:pPr>
-        <w:tabs>
-          <w:tab w:val="num" w:pos="4320"/>
-        </w:tabs>
-        <w:ind w:left="4320" w:hanging="360"/>
-      </w:pPr>
-    </w:lvl>
-    <w:lvl w:ilvl="6" w:tentative="1">
-      <w:start w:val="1"/>
-      <w:numFmt w:val="decimal"/>
-      <w:lvlText w:val="%7."/>
-      <w:lvlJc w:val="left"/>
-      <w:pPr>
-        <w:tabs>
-          <w:tab w:val="num" w:pos="5040"/>
-        </w:tabs>
-        <w:ind w:left="5040" w:hanging="360"/>
-      </w:pPr>
-    </w:lvl>
-    <w:lvl w:ilvl="7" w:tentative="1">
-      <w:start w:val="1"/>
-      <w:numFmt w:val="decimal"/>
-      <w:lvlText w:val="%8."/>
-      <w:lvlJc w:val="left"/>
-      <w:pPr>
-        <w:tabs>
-          <w:tab w:val="num" w:pos="5760"/>
-        </w:tabs>
-        <w:ind w:left="5760" w:hanging="360"/>
-      </w:pPr>
-    </w:lvl>
-    <w:lvl w:ilvl="8" w:tentative="1">
-      <w:start w:val="1"/>
-      <w:numFmt w:val="decimal"/>
-      <w:lvlText w:val="%9."/>
-      <w:lvlJc w:val="left"/>
-      <w:pPr>
-        <w:tabs>
-          <w:tab w:val="num" w:pos="6480"/>
-        </w:tabs>
-        <w:ind w:left="6480" w:hanging="360"/>
-      </w:pPr>
-    </w:lvl>
-  </w:abstractNum>
-  <w:abstractNum w:abstractNumId="5" w15:restartNumberingAfterBreak="0">
-    <w:nsid w:val="4F512F96"/>
-    <w:multiLevelType w:val="multilevel"/>
-    <w:tmpl w:val="ACD63E76"/>
+    <w:tmpl w:val="2FDC921E"/>
     <w:lvl w:ilvl="0">
       <w:start w:val="1"/>
       <w:numFmt w:val="bullet"/>
@@ -31284,10 +31072,10 @@
       </w:rPr>
     </w:lvl>
   </w:abstractNum>
-  <w:abstractNum w:abstractNumId="6" w15:restartNumberingAfterBreak="0">
-    <w:nsid w:val="5E3F69C3"/>
+  <w:abstractNum w:abstractNumId="5" w15:restartNumberingAfterBreak="0">
+    <w:nsid w:val="5CBA1BB1"/>
     <w:multiLevelType w:val="multilevel"/>
-    <w:tmpl w:val="78608C58"/>
+    <w:tmpl w:val="07FCA99C"/>
     <w:lvl w:ilvl="0">
       <w:start w:val="1"/>
       <w:numFmt w:val="bullet"/>
@@ -31433,10 +31221,10 @@
       </w:rPr>
     </w:lvl>
   </w:abstractNum>
-  <w:abstractNum w:abstractNumId="7" w15:restartNumberingAfterBreak="0">
-    <w:nsid w:val="61FA0A8B"/>
+  <w:abstractNum w:abstractNumId="6" w15:restartNumberingAfterBreak="0">
+    <w:nsid w:val="63951A9B"/>
     <w:multiLevelType w:val="multilevel"/>
-    <w:tmpl w:val="56208F28"/>
+    <w:tmpl w:val="D93E9D26"/>
     <w:lvl w:ilvl="0">
       <w:start w:val="1"/>
       <w:numFmt w:val="bullet"/>
@@ -31582,10 +31370,123 @@
       </w:rPr>
     </w:lvl>
   </w:abstractNum>
+  <w:abstractNum w:abstractNumId="7" w15:restartNumberingAfterBreak="0">
+    <w:nsid w:val="661D263F"/>
+    <w:multiLevelType w:val="multilevel"/>
+    <w:tmpl w:val="E2440EF8"/>
+    <w:lvl w:ilvl="0">
+      <w:start w:val="1"/>
+      <w:numFmt w:val="decimal"/>
+      <w:lvlText w:val="%1."/>
+      <w:lvlJc w:val="left"/>
+      <w:pPr>
+        <w:tabs>
+          <w:tab w:val="num" w:pos="720"/>
+        </w:tabs>
+        <w:ind w:left="720" w:hanging="360"/>
+      </w:pPr>
+    </w:lvl>
+    <w:lvl w:ilvl="1" w:tentative="1">
+      <w:start w:val="1"/>
+      <w:numFmt w:val="decimal"/>
+      <w:lvlText w:val="%2."/>
+      <w:lvlJc w:val="left"/>
+      <w:pPr>
+        <w:tabs>
+          <w:tab w:val="num" w:pos="1440"/>
+        </w:tabs>
+        <w:ind w:left="1440" w:hanging="360"/>
+      </w:pPr>
+    </w:lvl>
+    <w:lvl w:ilvl="2" w:tentative="1">
+      <w:start w:val="1"/>
+      <w:numFmt w:val="decimal"/>
+      <w:lvlText w:val="%3."/>
+      <w:lvlJc w:val="left"/>
+      <w:pPr>
+        <w:tabs>
+          <w:tab w:val="num" w:pos="2160"/>
+        </w:tabs>
+        <w:ind w:left="2160" w:hanging="360"/>
+      </w:pPr>
+    </w:lvl>
+    <w:lvl w:ilvl="3" w:tentative="1">
+      <w:start w:val="1"/>
+      <w:numFmt w:val="decimal"/>
+      <w:lvlText w:val="%4."/>
+      <w:lvlJc w:val="left"/>
+      <w:pPr>
+        <w:tabs>
+          <w:tab w:val="num" w:pos="2880"/>
+        </w:tabs>
+        <w:ind w:left="2880" w:hanging="360"/>
+      </w:pPr>
+    </w:lvl>
+    <w:lvl w:ilvl="4" w:tentative="1">
+      <w:start w:val="1"/>
+      <w:numFmt w:val="decimal"/>
+      <w:lvlText w:val="%5."/>
+      <w:lvlJc w:val="left"/>
+      <w:pPr>
+        <w:tabs>
+          <w:tab w:val="num" w:pos="3600"/>
+        </w:tabs>
+        <w:ind w:left="3600" w:hanging="360"/>
+      </w:pPr>
+    </w:lvl>
+    <w:lvl w:ilvl="5" w:tentative="1">
+      <w:start w:val="1"/>
+      <w:numFmt w:val="decimal"/>
+      <w:lvlText w:val="%6."/>
+      <w:lvlJc w:val="left"/>
+      <w:pPr>
+        <w:tabs>
+          <w:tab w:val="num" w:pos="4320"/>
+        </w:tabs>
+        <w:ind w:left="4320" w:hanging="360"/>
+      </w:pPr>
+    </w:lvl>
+    <w:lvl w:ilvl="6" w:tentative="1">
+      <w:start w:val="1"/>
+      <w:numFmt w:val="decimal"/>
+      <w:lvlText w:val="%7."/>
+      <w:lvlJc w:val="left"/>
+      <w:pPr>
+        <w:tabs>
+          <w:tab w:val="num" w:pos="5040"/>
+        </w:tabs>
+        <w:ind w:left="5040" w:hanging="360"/>
+      </w:pPr>
+    </w:lvl>
+    <w:lvl w:ilvl="7" w:tentative="1">
+      <w:start w:val="1"/>
+      <w:numFmt w:val="decimal"/>
+      <w:lvlText w:val="%8."/>
+      <w:lvlJc w:val="left"/>
+      <w:pPr>
+        <w:tabs>
+          <w:tab w:val="num" w:pos="5760"/>
+        </w:tabs>
+        <w:ind w:left="5760" w:hanging="360"/>
+      </w:pPr>
+    </w:lvl>
+    <w:lvl w:ilvl="8" w:tentative="1">
+      <w:start w:val="1"/>
+      <w:numFmt w:val="decimal"/>
+      <w:lvlText w:val="%9."/>
+      <w:lvlJc w:val="left"/>
+      <w:pPr>
+        <w:tabs>
+          <w:tab w:val="num" w:pos="6480"/>
+        </w:tabs>
+        <w:ind w:left="6480" w:hanging="360"/>
+      </w:pPr>
+    </w:lvl>
+  </w:abstractNum>
   <w:abstractNum w:abstractNumId="8" w15:restartNumberingAfterBreak="0">
-    <w:nsid w:val="65D8528A"/>
+    <w:nsid w:val="76501A68"/>
     <w:multiLevelType w:val="multilevel"/>
-    <w:tmpl w:val="618A4E16"/>
+    <w:tmpl w:val="7B828AD6"/>
     <w:lvl w:ilvl="0">
       <w:start w:val="1"/>
       <w:numFmt w:val="bullet"/>
@@ -31731,32 +31632,32 @@
       </w:rPr>
     </w:lvl>
   </w:abstractNum>
-  <w:num w:numId="1" w16cid:durableId="1201237996">
+  <w:num w:numId="1" w16cid:durableId="432013711">
     <w:abstractNumId w:val="6"/>
   </w:num>
-  <w:num w:numId="2" w16cid:durableId="1068186678">
+  <w:num w:numId="2" w16cid:durableId="1128087024">
+    <w:abstractNumId w:val="0"/>
+  </w:num>
+  <w:num w:numId="3" w16cid:durableId="2143762418">
+    <w:abstractNumId w:val="1"/>
+  </w:num>
+  <w:num w:numId="4" w16cid:durableId="1271939516">
+    <w:abstractNumId w:val="8"/>
+  </w:num>
+  <w:num w:numId="5" w16cid:durableId="1525358845">
+    <w:abstractNumId w:val="7"/>
+  </w:num>
+  <w:num w:numId="6" w16cid:durableId="347485191">
+    <w:abstractNumId w:val="4"/>
+  </w:num>
+  <w:num w:numId="7" w16cid:durableId="432360113">
     <w:abstractNumId w:val="5"/>
   </w:num>
-  <w:num w:numId="3" w16cid:durableId="858737288">
+  <w:num w:numId="8" w16cid:durableId="1180778549">
     <w:abstractNumId w:val="3"/>
   </w:num>
-  <w:num w:numId="4" w16cid:durableId="687293863">
+  <w:num w:numId="9" w16cid:durableId="951980082">
     <w:abstractNumId w:val="2"/>
-  </w:num>
-  <w:num w:numId="5" w16cid:durableId="566886903">
-    <w:abstractNumId w:val="4"/>
-  </w:num>
-  <w:num w:numId="6" w16cid:durableId="415172368">
-    <w:abstractNumId w:val="8"/>
-  </w:num>
-  <w:num w:numId="7" w16cid:durableId="2127314775">
-    <w:abstractNumId w:val="0"/>
-  </w:num>
-  <w:num w:numId="8" w16cid:durableId="734399237">
-    <w:abstractNumId w:val="7"/>
-  </w:num>
-  <w:num w:numId="9" w16cid:durableId="1308170929">
-    <w:abstractNumId w:val="1"/>
   </w:num>
 </w:numbering>
 </file>

</xml_diff>

<commit_message>
fix(docs): re-render all 11 architecture figures and system snapshots with large high-contrast readable typography
</commit_message>
<xml_diff>
--- a/DevOps_Incident_Watchdog_Project_Report.docx
+++ b/DevOps_Incident_Watchdog_Project_Report.docx
@@ -8421,7 +8421,7 @@
       <w:r>
         <w:drawing>
           <wp:inline xmlns:a="http://schemas.openxmlformats.org/drawingml/2006/main" xmlns:pic="http://schemas.openxmlformats.org/drawingml/2006/picture">
-            <wp:extent cx="5669280" cy="3959497"/>
+            <wp:extent cx="5669280" cy="3968496"/>
             <wp:docPr id="1" name="Picture 1"/>
             <wp:cNvGraphicFramePr>
               <a:graphicFrameLocks noChangeAspect="1"/>
@@ -8442,7 +8442,7 @@
                   <pic:spPr>
                     <a:xfrm>
                       <a:off x="0" y="0"/>
-                      <a:ext cx="5669280" cy="3959497"/>
+                      <a:ext cx="5669280" cy="3968496"/>
                     </a:xfrm>
                     <a:prstGeom prst="rect"/>
                   </pic:spPr>
@@ -8626,7 +8626,7 @@
       <w:r>
         <w:drawing>
           <wp:inline xmlns:a="http://schemas.openxmlformats.org/drawingml/2006/main" xmlns:pic="http://schemas.openxmlformats.org/drawingml/2006/picture">
-            <wp:extent cx="5669280" cy="887366"/>
+            <wp:extent cx="5669280" cy="1700784"/>
             <wp:docPr id="2" name="Picture 2"/>
             <wp:cNvGraphicFramePr>
               <a:graphicFrameLocks noChangeAspect="1"/>
@@ -8647,7 +8647,7 @@
                   <pic:spPr>
                     <a:xfrm>
                       <a:off x="0" y="0"/>
-                      <a:ext cx="5669280" cy="887366"/>
+                      <a:ext cx="5669280" cy="1700784"/>
                     </a:xfrm>
                     <a:prstGeom prst="rect"/>
                   </pic:spPr>
@@ -8744,7 +8744,7 @@
       <w:r>
         <w:drawing>
           <wp:inline xmlns:a="http://schemas.openxmlformats.org/drawingml/2006/main" xmlns:pic="http://schemas.openxmlformats.org/drawingml/2006/picture">
-            <wp:extent cx="5669280" cy="887366"/>
+            <wp:extent cx="5669280" cy="2031492"/>
             <wp:docPr id="3" name="Picture 3"/>
             <wp:cNvGraphicFramePr>
               <a:graphicFrameLocks noChangeAspect="1"/>
@@ -8765,7 +8765,7 @@
                   <pic:spPr>
                     <a:xfrm>
                       <a:off x="0" y="0"/>
-                      <a:ext cx="5669280" cy="887366"/>
+                      <a:ext cx="5669280" cy="2031492"/>
                     </a:xfrm>
                     <a:prstGeom prst="rect"/>
                   </pic:spPr>
@@ -8832,7 +8832,7 @@
       <w:r>
         <w:drawing>
           <wp:inline xmlns:a="http://schemas.openxmlformats.org/drawingml/2006/main" xmlns:pic="http://schemas.openxmlformats.org/drawingml/2006/picture">
-            <wp:extent cx="5669280" cy="985962"/>
+            <wp:extent cx="5669280" cy="1795272"/>
             <wp:docPr id="4" name="Picture 4"/>
             <wp:cNvGraphicFramePr>
               <a:graphicFrameLocks noChangeAspect="1"/>
@@ -8853,7 +8853,7 @@
                   <pic:spPr>
                     <a:xfrm>
                       <a:off x="0" y="0"/>
-                      <a:ext cx="5669280" cy="985962"/>
+                      <a:ext cx="5669280" cy="1795272"/>
                     </a:xfrm>
                     <a:prstGeom prst="rect"/>
                   </pic:spPr>
@@ -9829,7 +9829,7 @@
       <w:r>
         <w:drawing>
           <wp:inline xmlns:a="http://schemas.openxmlformats.org/drawingml/2006/main" xmlns:pic="http://schemas.openxmlformats.org/drawingml/2006/picture">
-            <wp:extent cx="5486400" cy="3657600"/>
+            <wp:extent cx="5486400" cy="3840480"/>
             <wp:docPr id="5" name="Picture 5"/>
             <wp:cNvGraphicFramePr>
               <a:graphicFrameLocks noChangeAspect="1"/>
@@ -9850,7 +9850,7 @@
                   <pic:spPr>
                     <a:xfrm>
                       <a:off x="0" y="0"/>
-                      <a:ext cx="5486400" cy="3657600"/>
+                      <a:ext cx="5486400" cy="3840480"/>
                     </a:xfrm>
                     <a:prstGeom prst="rect"/>
                   </pic:spPr>
@@ -10005,7 +10005,7 @@
       <w:r>
         <w:drawing>
           <wp:inline xmlns:a="http://schemas.openxmlformats.org/drawingml/2006/main" xmlns:pic="http://schemas.openxmlformats.org/drawingml/2006/picture">
-            <wp:extent cx="5486400" cy="3624943"/>
+            <wp:extent cx="5486400" cy="3657600"/>
             <wp:docPr id="7" name="Picture 7"/>
             <wp:cNvGraphicFramePr>
               <a:graphicFrameLocks noChangeAspect="1"/>
@@ -10026,7 +10026,7 @@
                   <pic:spPr>
                     <a:xfrm>
                       <a:off x="0" y="0"/>
-                      <a:ext cx="5486400" cy="3624943"/>
+                      <a:ext cx="5486400" cy="3657600"/>
                     </a:xfrm>
                     <a:prstGeom prst="rect"/>
                   </pic:spPr>
@@ -10093,7 +10093,7 @@
       <w:r>
         <w:drawing>
           <wp:inline xmlns:a="http://schemas.openxmlformats.org/drawingml/2006/main" xmlns:pic="http://schemas.openxmlformats.org/drawingml/2006/picture">
-            <wp:extent cx="5486400" cy="4114800"/>
+            <wp:extent cx="5486400" cy="3840480"/>
             <wp:docPr id="8" name="Picture 8"/>
             <wp:cNvGraphicFramePr>
               <a:graphicFrameLocks noChangeAspect="1"/>
@@ -10114,7 +10114,7 @@
                   <pic:spPr>
                     <a:xfrm>
                       <a:off x="0" y="0"/>
-                      <a:ext cx="5486400" cy="4114800"/>
+                      <a:ext cx="5486400" cy="3840480"/>
                     </a:xfrm>
                     <a:prstGeom prst="rect"/>
                   </pic:spPr>
@@ -10181,7 +10181,7 @@
       <w:r>
         <w:drawing>
           <wp:inline xmlns:a="http://schemas.openxmlformats.org/drawingml/2006/main" xmlns:pic="http://schemas.openxmlformats.org/drawingml/2006/picture">
-            <wp:extent cx="5486400" cy="2952155"/>
+            <wp:extent cx="5486400" cy="3840480"/>
             <wp:docPr id="9" name="Picture 9"/>
             <wp:cNvGraphicFramePr>
               <a:graphicFrameLocks noChangeAspect="1"/>
@@ -10202,7 +10202,7 @@
                   <pic:spPr>
                     <a:xfrm>
                       <a:off x="0" y="0"/>
-                      <a:ext cx="5486400" cy="2952155"/>
+                      <a:ext cx="5486400" cy="3840480"/>
                     </a:xfrm>
                     <a:prstGeom prst="rect"/>
                   </pic:spPr>
@@ -10269,7 +10269,7 @@
       <w:r>
         <w:drawing>
           <wp:inline xmlns:a="http://schemas.openxmlformats.org/drawingml/2006/main" xmlns:pic="http://schemas.openxmlformats.org/drawingml/2006/picture">
-            <wp:extent cx="5486400" cy="4114800"/>
+            <wp:extent cx="5486400" cy="3840480"/>
             <wp:docPr id="10" name="Picture 10"/>
             <wp:cNvGraphicFramePr>
               <a:graphicFrameLocks noChangeAspect="1"/>
@@ -10290,7 +10290,7 @@
                   <pic:spPr>
                     <a:xfrm>
                       <a:off x="0" y="0"/>
-                      <a:ext cx="5486400" cy="4114800"/>
+                      <a:ext cx="5486400" cy="3840480"/>
                     </a:xfrm>
                     <a:prstGeom prst="rect"/>
                   </pic:spPr>
@@ -10357,7 +10357,7 @@
       <w:r>
         <w:drawing>
           <wp:inline xmlns:a="http://schemas.openxmlformats.org/drawingml/2006/main" xmlns:pic="http://schemas.openxmlformats.org/drawingml/2006/picture">
-            <wp:extent cx="5486400" cy="2962870"/>
+            <wp:extent cx="5486400" cy="3840480"/>
             <wp:docPr id="11" name="Picture 11"/>
             <wp:cNvGraphicFramePr>
               <a:graphicFrameLocks noChangeAspect="1"/>
@@ -10378,7 +10378,7 @@
                   <pic:spPr>
                     <a:xfrm>
                       <a:off x="0" y="0"/>
-                      <a:ext cx="5486400" cy="2962870"/>
+                      <a:ext cx="5486400" cy="3840480"/>
                     </a:xfrm>
                     <a:prstGeom prst="rect"/>
                   </pic:spPr>

</xml_diff>

<commit_message>
docs: insert minimal clean 6-node architecture diagram into report and drawio
</commit_message>
<xml_diff>
--- a/DevOps_Incident_Watchdog_Project_Report.docx
+++ b/DevOps_Incident_Watchdog_Project_Report.docx
@@ -8421,7 +8421,7 @@
       <w:r>
         <w:drawing>
           <wp:inline xmlns:a="http://schemas.openxmlformats.org/drawingml/2006/main" xmlns:pic="http://schemas.openxmlformats.org/drawingml/2006/picture">
-            <wp:extent cx="5669280" cy="3968496"/>
+            <wp:extent cx="5669280" cy="2125980"/>
             <wp:docPr id="1" name="Picture 1"/>
             <wp:cNvGraphicFramePr>
               <a:graphicFrameLocks noChangeAspect="1"/>
@@ -8442,7 +8442,7 @@
                   <pic:spPr>
                     <a:xfrm>
                       <a:off x="0" y="0"/>
-                      <a:ext cx="5669280" cy="3968496"/>
+                      <a:ext cx="5669280" cy="2125980"/>
                     </a:xfrm>
                     <a:prstGeom prst="rect"/>
                   </pic:spPr>

</xml_diff>